<commit_message>
docs(no-show): document the now-live no-show loop + heuristic→model path
- New: Casai-No-Show-Heuristic-to-Model.docx — the hypothesis, the live
  loop (flow diagrams), the training-label feedback, the 4-stage
  replacement path, the one-function contract, and the model-era tech
  stack + switch-on-evidence thresholds.
- Current-State.docx: no-show moved to Live (heuristic); counts refreshed
  to 12 migrations / 68 tests; a "no-show loop, now live" spotlight folded
  in; deferred map updated to "AI models — partly live".
- PRD: build-status set to Live for FR-07-03 (no-show cards) and FR-07-07
  (auto-escalation) in a separate copy (casai_prd_v2_1_no-show-live.docx)
  since the original is open in Word; original Status column untouched.
- gitignore: ignore Word autorecovery/lock artifacts.
</commit_message>
<xml_diff>
--- a/docs/Casai-Current-State.docx
+++ b/docs/Casai-Current-State.docx
@@ -20,7 +20,7 @@
     </w:p>
     <w:p>
       <w:pPr>
-        <w:spacing w:after="120"/>
+        <w:spacing w:after="110"/>
       </w:pPr>
       <w:r>
         <w:rPr>
@@ -28,8 +28,8 @@
           <w:b/>
           <w:bCs/>
           <w:color w:val="12201C"/>
-          <w:sz w:val="40"/>
-          <w:szCs w:val="40"/>
+          <w:sz w:val="34"/>
+          <w:szCs w:val="34"/>
         </w:rPr>
         <w:t xml:space="preserve">From a prototype that faked it, to a system that's real</w:t>
       </w:r>
@@ -63,25 +63,14 @@
         </w:rPr>
         <w:t xml:space="preserve">Repo: </w:t>
       </w:r>
-      <w:hyperlink w:history="1" r:id="rIdc66e-642djflnmp2jozfp">
-        <w:r>
-          <w:rPr>
-            <w:rStyle w:val="Hyperlink"/>
-            <w:rFonts w:ascii="Calibri" w:cs="Calibri" w:eastAsia="Calibri" w:hAnsi="Calibri"/>
-            <w:sz w:val="21"/>
-            <w:szCs w:val="21"/>
-          </w:rPr>
-          <w:t xml:space="preserve">github.com/11820965/AIPM-BYOP</w:t>
-        </w:r>
-      </w:hyperlink>
-      <w:r>
-        <w:rPr>
-          <w:rFonts w:ascii="Calibri" w:cs="Calibri" w:eastAsia="Calibri" w:hAnsi="Calibri"/>
-          <w:color w:val="2B3A34"/>
-          <w:sz w:val="21"/>
-          <w:szCs w:val="21"/>
-        </w:rPr>
-        <w:t xml:space="preserve">    </w:t>
+      <w:r>
+        <w:rPr>
+          <w:rFonts w:ascii="Calibri" w:cs="Calibri" w:eastAsia="Calibri" w:hAnsi="Calibri"/>
+          <w:color w:val="2B3A34"/>
+          <w:sz w:val="21"/>
+          <w:szCs w:val="21"/>
+        </w:rPr>
+        <w:t xml:space="preserve">github.com/11820965/AIPM-BYOP    </w:t>
       </w:r>
       <w:r>
         <w:rPr>
@@ -101,16 +90,7 @@
           <w:sz w:val="21"/>
           <w:szCs w:val="21"/>
         </w:rPr>
-        <w:t xml:space="preserve">Supabase (Mumbai)</w:t>
-      </w:r>
-      <w:r>
-        <w:rPr>
-          <w:rFonts w:ascii="Calibri" w:cs="Calibri" w:eastAsia="Calibri" w:hAnsi="Calibri"/>
-          <w:color w:val="2B3A34"/>
-          <w:sz w:val="21"/>
-          <w:szCs w:val="21"/>
-        </w:rPr>
-        <w:t xml:space="preserve">    </w:t>
+        <w:t xml:space="preserve">Supabase (Mumbai)    </w:t>
       </w:r>
       <w:r>
         <w:rPr>
@@ -130,16 +110,7 @@
           <w:sz w:val="21"/>
           <w:szCs w:val="21"/>
         </w:rPr>
-        <w:t xml:space="preserve">green</w:t>
-      </w:r>
-      <w:r>
-        <w:rPr>
-          <w:rFonts w:ascii="Calibri" w:cs="Calibri" w:eastAsia="Calibri" w:hAnsi="Calibri"/>
-          <w:color w:val="2B3A34"/>
-          <w:sz w:val="21"/>
-          <w:szCs w:val="21"/>
-        </w:rPr>
-        <w:t xml:space="preserve">    </w:t>
+        <w:t xml:space="preserve">green    </w:t>
       </w:r>
       <w:r>
         <w:rPr>
@@ -159,13 +130,13 @@
           <w:sz w:val="21"/>
           <w:szCs w:val="21"/>
         </w:rPr>
-        <w:t xml:space="preserve">55</w:t>
+        <w:t xml:space="preserve">68</w:t>
       </w:r>
     </w:p>
     <w:p>
       <w:pPr>
         <w:pStyle w:val="Heading2"/>
-        <w:spacing w:after="100" w:before="320"/>
+        <w:spacing w:after="100" w:before="340"/>
       </w:pPr>
       <w:r>
         <w:rPr>
@@ -201,65 +172,7 @@
           <w:sz w:val="21"/>
           <w:szCs w:val="21"/>
         </w:rPr>
-        <w:t xml:space="preserve">The brief began with a live Lovable prototype at </w:t>
-      </w:r>
-      <w:r>
-        <w:rPr>
-          <w:rFonts w:ascii="Consolas" w:cs="Consolas" w:eastAsia="Consolas" w:hAnsi="Consolas"/>
-          <w:color w:val="0E3D33"/>
-          <w:sz w:val="19"/>
-          <w:szCs w:val="19"/>
-          <w:shd w:fill="EEF3F1" w:val="clear"/>
-        </w:rPr>
-        <w:t xml:space="preserve">casai-intelligent.lovable.app</w:t>
-      </w:r>
-      <w:r>
-        <w:rPr>
-          <w:rFonts w:ascii="Calibri" w:cs="Calibri" w:eastAsia="Calibri" w:hAnsi="Calibri"/>
-          <w:color w:val="2B3A34"/>
-          <w:sz w:val="21"/>
-          <w:szCs w:val="21"/>
-        </w:rPr>
-        <w:t xml:space="preserve">. Inspecting it revealed the truth: a </w:t>
-      </w:r>
-      <w:r>
-        <w:rPr>
-          <w:rFonts w:ascii="Calibri" w:cs="Calibri" w:eastAsia="Calibri" w:hAnsi="Calibri"/>
-          <w:b/>
-          <w:bCs/>
-          <w:color w:val="12201C"/>
-          <w:sz w:val="21"/>
-          <w:szCs w:val="21"/>
-        </w:rPr>
-        <w:t xml:space="preserve">front-end-only prototype</w:t>
-      </w:r>
-      <w:r>
-        <w:rPr>
-          <w:rFonts w:ascii="Calibri" w:cs="Calibri" w:eastAsia="Calibri" w:hAnsi="Calibri"/>
-          <w:color w:val="2B3A34"/>
-          <w:sz w:val="21"/>
-          <w:szCs w:val="21"/>
-        </w:rPr>
-        <w:t xml:space="preserve"> — React on the surface, but no database, no API, no auth. Every worker, booking and score was hard-coded, the “session” was a </w:t>
-      </w:r>
-      <w:r>
-        <w:rPr>
-          <w:rFonts w:ascii="Consolas" w:cs="Consolas" w:eastAsia="Consolas" w:hAnsi="Consolas"/>
-          <w:color w:val="0E3D33"/>
-          <w:sz w:val="19"/>
-          <w:szCs w:val="19"/>
-          <w:shd w:fill="EEF3F1" w:val="clear"/>
-        </w:rPr>
-        <w:t xml:space="preserve">localStorage</w:t>
-      </w:r>
-      <w:r>
-        <w:rPr>
-          <w:rFonts w:ascii="Calibri" w:cs="Calibri" w:eastAsia="Calibri" w:hAnsi="Calibri"/>
-          <w:color w:val="2B3A34"/>
-          <w:sz w:val="21"/>
-          <w:szCs w:val="21"/>
-        </w:rPr>
-        <w:t xml:space="preserve"> string, and all five “AI engines,” eKYC and payments were faked in the browser.</w:t>
+        <w:t xml:space="preserve">The brief began with a live Lovable prototype at casai-intelligent.lovable.app. Inspecting it revealed the truth: a front-end-only prototype — React on the surface, but no database, no API, no auth. Every worker, booking and score was hard-coded, the “session” was a localStorage string, and all five “AI engines,” eKYC and payments were faked in the browser.</w:t>
       </w:r>
     </w:p>
     <w:p>
@@ -273,33 +186,13 @@
           <w:sz w:val="21"/>
           <w:szCs w:val="21"/>
         </w:rPr>
-        <w:t xml:space="preserve">It </w:t>
-      </w:r>
-      <w:r>
-        <w:rPr>
-          <w:rFonts w:ascii="Calibri" w:cs="Calibri" w:eastAsia="Calibri" w:hAnsi="Calibri"/>
-          <w:i/>
-          <w:iCs/>
-          <w:color w:val="2B3A34"/>
-          <w:sz w:val="21"/>
-          <w:szCs w:val="21"/>
-        </w:rPr>
-        <w:t xml:space="preserve">looked</w:t>
-      </w:r>
-      <w:r>
-        <w:rPr>
-          <w:rFonts w:ascii="Calibri" w:cs="Calibri" w:eastAsia="Calibri" w:hAnsi="Calibri"/>
-          <w:color w:val="2B3A34"/>
-          <w:sz w:val="21"/>
-          <w:szCs w:val="21"/>
-        </w:rPr>
-        <w:t xml:space="preserve"> finished precisely because it was fabricating everything. The work here was to make it real — keep the validated experience, and build the platform underneath it.</w:t>
+        <w:t xml:space="preserve">It looked finished precisely because it was fabricating everything. The work here was to make it real — keep the validated experience, and build the platform underneath it.</w:t>
       </w:r>
     </w:p>
     <w:p>
       <w:pPr>
         <w:pStyle w:val="Heading2"/>
-        <w:spacing w:after="100" w:before="320"/>
+        <w:spacing w:after="100" w:before="340"/>
       </w:pPr>
       <w:r>
         <w:rPr>
@@ -337,56 +230,7 @@
           <w:sz w:val="21"/>
           <w:szCs w:val="21"/>
         </w:rPr>
-        <w:t xml:space="preserve">4</w:t>
-      </w:r>
-      <w:r>
-        <w:rPr>
-          <w:rFonts w:ascii="Calibri" w:cs="Calibri" w:eastAsia="Calibri" w:hAnsi="Calibri"/>
-          <w:color w:val="2B3A34"/>
-          <w:sz w:val="21"/>
-          <w:szCs w:val="21"/>
-        </w:rPr>
-        <w:t xml:space="preserve"> live contexts   ·   </w:t>
-      </w:r>
-      <w:r>
-        <w:rPr>
-          <w:rFonts w:ascii="Calibri" w:cs="Calibri" w:eastAsia="Calibri" w:hAnsi="Calibri"/>
-          <w:b/>
-          <w:bCs/>
-          <w:color w:val="12201C"/>
-          <w:sz w:val="21"/>
-          <w:szCs w:val="21"/>
-        </w:rPr>
-        <w:t xml:space="preserve">10</w:t>
-      </w:r>
-      <w:r>
-        <w:rPr>
-          <w:rFonts w:ascii="Calibri" w:cs="Calibri" w:eastAsia="Calibri" w:hAnsi="Calibri"/>
-          <w:color w:val="2B3A34"/>
-          <w:sz w:val="21"/>
-          <w:szCs w:val="21"/>
-        </w:rPr>
-        <w:t xml:space="preserve"> DB migrations   ·   </w:t>
-      </w:r>
-      <w:r>
-        <w:rPr>
-          <w:rFonts w:ascii="Calibri" w:cs="Calibri" w:eastAsia="Calibri" w:hAnsi="Calibri"/>
-          <w:b/>
-          <w:bCs/>
-          <w:color w:val="12201C"/>
-          <w:sz w:val="21"/>
-          <w:szCs w:val="21"/>
-        </w:rPr>
-        <w:t xml:space="preserve">55</w:t>
-      </w:r>
-      <w:r>
-        <w:rPr>
-          <w:rFonts w:ascii="Calibri" w:cs="Calibri" w:eastAsia="Calibri" w:hAnsi="Calibri"/>
-          <w:color w:val="2B3A34"/>
-          <w:sz w:val="21"/>
-          <w:szCs w:val="21"/>
-        </w:rPr>
-        <w:t xml:space="preserve"> passing tests   ·   CI green</w:t>
+        <w:t xml:space="preserve">4 live contexts   ·   12 DB migrations   ·   68 passing tests   ·   CI green</w:t>
       </w:r>
     </w:p>
     <w:p>
@@ -400,27 +244,7 @@
           <w:sz w:val="21"/>
           <w:szCs w:val="21"/>
         </w:rPr>
-        <w:t xml:space="preserve">Four user contexts run on a real Supabase (Postgres) backend, each </w:t>
-      </w:r>
-      <w:r>
-        <w:rPr>
-          <w:rFonts w:ascii="Calibri" w:cs="Calibri" w:eastAsia="Calibri" w:hAnsi="Calibri"/>
-          <w:b/>
-          <w:bCs/>
-          <w:color w:val="12201C"/>
-          <w:sz w:val="21"/>
-          <w:szCs w:val="21"/>
-        </w:rPr>
-        <w:t xml:space="preserve">verified by driving it live against the database</w:t>
-      </w:r>
-      <w:r>
-        <w:rPr>
-          <w:rFonts w:ascii="Calibri" w:cs="Calibri" w:eastAsia="Calibri" w:hAnsi="Calibri"/>
-          <w:color w:val="2B3A34"/>
-          <w:sz w:val="21"/>
-          <w:szCs w:val="21"/>
-        </w:rPr>
-        <w:t xml:space="preserve"> — not asserted, watched. The feature-by-feature breakdown is in section 03.</w:t>
+        <w:t xml:space="preserve">Four user contexts run on a real Supabase (Postgres) backend, each verified by driving it live against the database — not asserted, watched. The feature-by-feature breakdown is in section 03.</w:t>
       </w:r>
     </w:p>
     <w:p>
@@ -441,16 +265,16 @@
           <w:sz w:val="21"/>
           <w:szCs w:val="21"/>
         </w:rPr>
-        <w:t xml:space="preserve">Household — </w:t>
-      </w:r>
-      <w:r>
-        <w:rPr>
-          <w:rFonts w:ascii="Calibri" w:cs="Calibri" w:eastAsia="Calibri" w:hAnsi="Calibri"/>
-          <w:color w:val="2B3A34"/>
-          <w:sz w:val="21"/>
-          <w:szCs w:val="21"/>
-        </w:rPr>
-        <w:t xml:space="preserve">guest login → browse verified workers from Postgres → book → confirmation reads back from the database.</w:t>
+        <w:t xml:space="preserve">Household</w:t>
+      </w:r>
+      <w:r>
+        <w:rPr>
+          <w:rFonts w:ascii="Calibri" w:cs="Calibri" w:eastAsia="Calibri" w:hAnsi="Calibri"/>
+          <w:color w:val="2B3A34"/>
+          <w:sz w:val="21"/>
+          <w:szCs w:val="21"/>
+        </w:rPr>
+        <w:t xml:space="preserve"> — guest login → browse verified workers from Postgres → book → confirmation reads back from the database.</w:t>
       </w:r>
     </w:p>
     <w:p>
@@ -471,16 +295,16 @@
           <w:sz w:val="21"/>
           <w:szCs w:val="21"/>
         </w:rPr>
-        <w:t xml:space="preserve">NRI care — </w:t>
-      </w:r>
-      <w:r>
-        <w:rPr>
-          <w:rFonts w:ascii="Calibri" w:cs="Calibri" w:eastAsia="Calibri" w:hAnsi="Calibri"/>
-          <w:color w:val="2B3A34"/>
-          <w:sz w:val="21"/>
-          <w:szCs w:val="21"/>
-        </w:rPr>
-        <w:t xml:space="preserve">consent-code linking → dashboard shows the parents' home's real bookings in dual timezone → book a caregiver on behalf.</w:t>
+        <w:t xml:space="preserve">NRI care</w:t>
+      </w:r>
+      <w:r>
+        <w:rPr>
+          <w:rFonts w:ascii="Calibri" w:cs="Calibri" w:eastAsia="Calibri" w:hAnsi="Calibri"/>
+          <w:color w:val="2B3A34"/>
+          <w:sz w:val="21"/>
+          <w:szCs w:val="21"/>
+        </w:rPr>
+        <w:t xml:space="preserve"> — consent-code linking → dashboard shows the parents' home's real bookings in dual timezone → book a caregiver on behalf.</w:t>
       </w:r>
     </w:p>
     <w:p>
@@ -501,16 +325,16 @@
           <w:sz w:val="21"/>
           <w:szCs w:val="21"/>
         </w:rPr>
-        <w:t xml:space="preserve">Worker — </w:t>
-      </w:r>
-      <w:r>
-        <w:rPr>
-          <w:rFonts w:ascii="Calibri" w:cs="Calibri" w:eastAsia="Calibri" w:hAnsi="Calibri"/>
-          <w:color w:val="2B3A34"/>
-          <w:sz w:val="21"/>
-          <w:szCs w:val="21"/>
-        </w:rPr>
-        <w:t xml:space="preserve">onboard → real worker ID + passport minted → dashboard, bookings, earnings and profile read the worker's own record.</w:t>
+        <w:t xml:space="preserve">Worker</w:t>
+      </w:r>
+      <w:r>
+        <w:rPr>
+          <w:rFonts w:ascii="Calibri" w:cs="Calibri" w:eastAsia="Calibri" w:hAnsi="Calibri"/>
+          <w:color w:val="2B3A34"/>
+          <w:sz w:val="21"/>
+          <w:szCs w:val="21"/>
+        </w:rPr>
+        <w:t xml:space="preserve"> — onboard → real worker ID + passport minted → dashboard, bookings, earnings and profile read the worker's own record.</w:t>
       </w:r>
     </w:p>
     <w:p>
@@ -531,22 +355,22 @@
           <w:sz w:val="21"/>
           <w:szCs w:val="21"/>
         </w:rPr>
-        <w:t xml:space="preserve">Ops — </w:t>
-      </w:r>
-      <w:r>
-        <w:rPr>
-          <w:rFonts w:ascii="Calibri" w:cs="Calibri" w:eastAsia="Calibri" w:hAnsi="Calibri"/>
-          <w:color w:val="2B3A34"/>
-          <w:sz w:val="21"/>
-          <w:szCs w:val="21"/>
-        </w:rPr>
-        <w:t xml:space="preserve">admin signs in → reviews the pending-worker queue → approves eKYC + police → the worker flips to verified and becomes bookable.</w:t>
+        <w:t xml:space="preserve">Ops</w:t>
+      </w:r>
+      <w:r>
+        <w:rPr>
+          <w:rFonts w:ascii="Calibri" w:cs="Calibri" w:eastAsia="Calibri" w:hAnsi="Calibri"/>
+          <w:color w:val="2B3A34"/>
+          <w:sz w:val="21"/>
+          <w:szCs w:val="21"/>
+        </w:rPr>
+        <w:t xml:space="preserve"> — admin signs in → reviews the pending-worker queue → approves eKYC + police → the worker flips to verified and becomes bookable.</w:t>
       </w:r>
     </w:p>
     <w:p>
       <w:pPr>
         <w:pStyle w:val="Heading2"/>
-        <w:spacing w:after="100" w:before="320"/>
+        <w:spacing w:after="100" w:before="340"/>
       </w:pPr>
       <w:r>
         <w:rPr>
@@ -582,61 +406,58 @@
           <w:sz w:val="21"/>
           <w:szCs w:val="21"/>
         </w:rPr>
-        <w:t xml:space="preserve">Every screen and feature from the PRD, in three honest buckets: </w:t>
-      </w:r>
-      <w:r>
-        <w:rPr>
-          <w:rFonts w:ascii="Consolas" w:cs="Consolas" w:eastAsia="Consolas" w:hAnsi="Consolas"/>
+        <w:t xml:space="preserve">Every screen and feature from the PRD, in three honest buckets:  </w:t>
+      </w:r>
+      <w:r>
+        <w:rPr>
+          <w:rFonts w:ascii="Calibri" w:cs="Calibri" w:eastAsia="Calibri" w:hAnsi="Calibri"/>
           <w:b/>
           <w:bCs/>
           <w:color w:val="1E8A5A"/>
-          <w:sz w:val="17"/>
-          <w:szCs w:val="17"/>
-          <w:shd w:fill="E4F3EA" w:val="clear"/>
-        </w:rPr>
-        <w:t xml:space="preserve"> Live </w:t>
-      </w:r>
-      <w:r>
-        <w:rPr>
-          <w:rFonts w:ascii="Calibri" w:cs="Calibri" w:eastAsia="Calibri" w:hAnsi="Calibri"/>
-          <w:color w:val="2B3A34"/>
-          <w:sz w:val="21"/>
-          <w:szCs w:val="21"/>
-        </w:rPr>
-        <w:t xml:space="preserve"> = wired to the real backend and verified; </w:t>
-      </w:r>
-      <w:r>
-        <w:rPr>
-          <w:rFonts w:ascii="Consolas" w:cs="Consolas" w:eastAsia="Consolas" w:hAnsi="Consolas"/>
+          <w:sz w:val="21"/>
+          <w:szCs w:val="21"/>
+        </w:rPr>
+        <w:t xml:space="preserve">Live</w:t>
+      </w:r>
+      <w:r>
+        <w:rPr>
+          <w:rFonts w:ascii="Calibri" w:cs="Calibri" w:eastAsia="Calibri" w:hAnsi="Calibri"/>
+          <w:color w:val="2B3A34"/>
+          <w:sz w:val="21"/>
+          <w:szCs w:val="21"/>
+        </w:rPr>
+        <w:t xml:space="preserve"> = wired to the real backend and verified;  </w:t>
+      </w:r>
+      <w:r>
+        <w:rPr>
+          <w:rFonts w:ascii="Calibri" w:cs="Calibri" w:eastAsia="Calibri" w:hAnsi="Calibri"/>
           <w:b/>
           <w:bCs/>
           <w:color w:val="B9791A"/>
-          <w:sz w:val="17"/>
-          <w:szCs w:val="17"/>
-          <w:shd w:fill="F8EED9" w:val="clear"/>
-        </w:rPr>
-        <w:t xml:space="preserve"> Front-end </w:t>
-      </w:r>
-      <w:r>
-        <w:rPr>
-          <w:rFonts w:ascii="Calibri" w:cs="Calibri" w:eastAsia="Calibri" w:hAnsi="Calibri"/>
-          <w:color w:val="2B3A34"/>
-          <w:sz w:val="21"/>
-          <w:szCs w:val="21"/>
-        </w:rPr>
-        <w:t xml:space="preserve"> = UI built but data is still seed/simulated; </w:t>
-      </w:r>
-      <w:r>
-        <w:rPr>
-          <w:rFonts w:ascii="Consolas" w:cs="Consolas" w:eastAsia="Consolas" w:hAnsi="Consolas"/>
+          <w:sz w:val="21"/>
+          <w:szCs w:val="21"/>
+        </w:rPr>
+        <w:t xml:space="preserve">Front-end</w:t>
+      </w:r>
+      <w:r>
+        <w:rPr>
+          <w:rFonts w:ascii="Calibri" w:cs="Calibri" w:eastAsia="Calibri" w:hAnsi="Calibri"/>
+          <w:color w:val="2B3A34"/>
+          <w:sz w:val="21"/>
+          <w:szCs w:val="21"/>
+        </w:rPr>
+        <w:t xml:space="preserve"> = UI built but data is still seed/simulated;  </w:t>
+      </w:r>
+      <w:r>
+        <w:rPr>
+          <w:rFonts w:ascii="Calibri" w:cs="Calibri" w:eastAsia="Calibri" w:hAnsi="Calibri"/>
           <w:b/>
           <w:bCs/>
           <w:color w:val="B4442E"/>
-          <w:sz w:val="17"/>
-          <w:szCs w:val="17"/>
-          <w:shd w:fill="F7E6E1" w:val="clear"/>
-        </w:rPr>
-        <w:t xml:space="preserve"> Not built </w:t>
+          <w:sz w:val="21"/>
+          <w:szCs w:val="21"/>
+        </w:rPr>
+        <w:t xml:space="preserve">Not built</w:t>
       </w:r>
       <w:r>
         <w:rPr>
@@ -651,7 +472,7 @@
     <w:p>
       <w:pPr>
         <w:pStyle w:val="Heading3"/>
-        <w:spacing w:after="60" w:before="220"/>
+        <w:spacing w:after="60" w:before="240"/>
       </w:pPr>
       <w:r>
         <w:rPr>
@@ -704,8 +525,8 @@
                 <w:b/>
                 <w:bCs/>
                 <w:color w:val="F0C97A"/>
-                <w:sz w:val="16"/>
-                <w:szCs w:val="16"/>
+                <w:sz w:val="15"/>
+                <w:szCs w:val="15"/>
               </w:rPr>
               <w:t xml:space="preserve">FEATURE</w:t>
             </w:r>
@@ -729,8 +550,8 @@
                 <w:b/>
                 <w:bCs/>
                 <w:color w:val="F0C97A"/>
-                <w:sz w:val="16"/>
-                <w:szCs w:val="16"/>
+                <w:sz w:val="15"/>
+                <w:szCs w:val="15"/>
               </w:rPr>
               <w:t xml:space="preserve">PRD</w:t>
             </w:r>
@@ -754,8 +575,8 @@
                 <w:b/>
                 <w:bCs/>
                 <w:color w:val="F0C97A"/>
-                <w:sz w:val="16"/>
-                <w:szCs w:val="16"/>
+                <w:sz w:val="15"/>
+                <w:szCs w:val="15"/>
               </w:rPr>
               <w:t xml:space="preserve">STATUS</w:t>
             </w:r>
@@ -823,15 +644,14 @@
           <w:p>
             <w:r>
               <w:rPr>
-                <w:rFonts w:ascii="Consolas" w:cs="Consolas" w:eastAsia="Consolas" w:hAnsi="Consolas"/>
+                <w:rFonts w:ascii="Calibri" w:cs="Calibri" w:eastAsia="Calibri" w:hAnsi="Calibri"/>
                 <w:b/>
                 <w:bCs/>
                 <w:color w:val="1E8A5A"/>
-                <w:sz w:val="17"/>
-                <w:szCs w:val="17"/>
-                <w:shd w:fill="E4F3EA" w:val="clear"/>
-              </w:rPr>
-              <w:t xml:space="preserve"> Live </w:t>
+                <w:sz w:val="18"/>
+                <w:szCs w:val="18"/>
+              </w:rPr>
+              <w:t xml:space="preserve">Live</w:t>
             </w:r>
           </w:p>
         </w:tc>
@@ -897,15 +717,14 @@
           <w:p>
             <w:r>
               <w:rPr>
-                <w:rFonts w:ascii="Consolas" w:cs="Consolas" w:eastAsia="Consolas" w:hAnsi="Consolas"/>
+                <w:rFonts w:ascii="Calibri" w:cs="Calibri" w:eastAsia="Calibri" w:hAnsi="Calibri"/>
                 <w:b/>
                 <w:bCs/>
                 <w:color w:val="1E8A5A"/>
-                <w:sz w:val="17"/>
-                <w:szCs w:val="17"/>
-                <w:shd w:fill="E4F3EA" w:val="clear"/>
-              </w:rPr>
-              <w:t xml:space="preserve"> Live </w:t>
+                <w:sz w:val="18"/>
+                <w:szCs w:val="18"/>
+              </w:rPr>
+              <w:t xml:space="preserve">Live</w:t>
             </w:r>
           </w:p>
         </w:tc>
@@ -971,15 +790,14 @@
           <w:p>
             <w:r>
               <w:rPr>
-                <w:rFonts w:ascii="Consolas" w:cs="Consolas" w:eastAsia="Consolas" w:hAnsi="Consolas"/>
+                <w:rFonts w:ascii="Calibri" w:cs="Calibri" w:eastAsia="Calibri" w:hAnsi="Calibri"/>
                 <w:b/>
                 <w:bCs/>
                 <w:color w:val="1E8A5A"/>
-                <w:sz w:val="17"/>
-                <w:szCs w:val="17"/>
-                <w:shd w:fill="E4F3EA" w:val="clear"/>
-              </w:rPr>
-              <w:t xml:space="preserve"> Live </w:t>
+                <w:sz w:val="18"/>
+                <w:szCs w:val="18"/>
+              </w:rPr>
+              <w:t xml:space="preserve">Live</w:t>
             </w:r>
           </w:p>
         </w:tc>
@@ -1045,15 +863,14 @@
           <w:p>
             <w:r>
               <w:rPr>
-                <w:rFonts w:ascii="Consolas" w:cs="Consolas" w:eastAsia="Consolas" w:hAnsi="Consolas"/>
+                <w:rFonts w:ascii="Calibri" w:cs="Calibri" w:eastAsia="Calibri" w:hAnsi="Calibri"/>
                 <w:b/>
                 <w:bCs/>
                 <w:color w:val="1E8A5A"/>
-                <w:sz w:val="17"/>
-                <w:szCs w:val="17"/>
-                <w:shd w:fill="E4F3EA" w:val="clear"/>
-              </w:rPr>
-              <w:t xml:space="preserve"> Live </w:t>
+                <w:sz w:val="18"/>
+                <w:szCs w:val="18"/>
+              </w:rPr>
+              <w:t xml:space="preserve">Live</w:t>
             </w:r>
           </w:p>
         </w:tc>
@@ -1119,15 +936,14 @@
           <w:p>
             <w:r>
               <w:rPr>
-                <w:rFonts w:ascii="Consolas" w:cs="Consolas" w:eastAsia="Consolas" w:hAnsi="Consolas"/>
+                <w:rFonts w:ascii="Calibri" w:cs="Calibri" w:eastAsia="Calibri" w:hAnsi="Calibri"/>
                 <w:b/>
                 <w:bCs/>
                 <w:color w:val="1E8A5A"/>
-                <w:sz w:val="17"/>
-                <w:szCs w:val="17"/>
-                <w:shd w:fill="E4F3EA" w:val="clear"/>
-              </w:rPr>
-              <w:t xml:space="preserve"> Live </w:t>
+                <w:sz w:val="18"/>
+                <w:szCs w:val="18"/>
+              </w:rPr>
+              <w:t xml:space="preserve">Live</w:t>
             </w:r>
           </w:p>
         </w:tc>
@@ -1193,15 +1009,14 @@
           <w:p>
             <w:r>
               <w:rPr>
-                <w:rFonts w:ascii="Consolas" w:cs="Consolas" w:eastAsia="Consolas" w:hAnsi="Consolas"/>
+                <w:rFonts w:ascii="Calibri" w:cs="Calibri" w:eastAsia="Calibri" w:hAnsi="Calibri"/>
                 <w:b/>
                 <w:bCs/>
                 <w:color w:val="1E8A5A"/>
-                <w:sz w:val="17"/>
-                <w:szCs w:val="17"/>
-                <w:shd w:fill="E4F3EA" w:val="clear"/>
-              </w:rPr>
-              <w:t xml:space="preserve"> Live </w:t>
+                <w:sz w:val="18"/>
+                <w:szCs w:val="18"/>
+              </w:rPr>
+              <w:t xml:space="preserve">Live</w:t>
             </w:r>
           </w:p>
         </w:tc>
@@ -1267,15 +1082,14 @@
           <w:p>
             <w:r>
               <w:rPr>
-                <w:rFonts w:ascii="Consolas" w:cs="Consolas" w:eastAsia="Consolas" w:hAnsi="Consolas"/>
+                <w:rFonts w:ascii="Calibri" w:cs="Calibri" w:eastAsia="Calibri" w:hAnsi="Calibri"/>
                 <w:b/>
                 <w:bCs/>
                 <w:color w:val="1E8A5A"/>
-                <w:sz w:val="17"/>
-                <w:szCs w:val="17"/>
-                <w:shd w:fill="E4F3EA" w:val="clear"/>
-              </w:rPr>
-              <w:t xml:space="preserve"> Live </w:t>
+                <w:sz w:val="18"/>
+                <w:szCs w:val="18"/>
+              </w:rPr>
+              <w:t xml:space="preserve">Live</w:t>
             </w:r>
           </w:p>
         </w:tc>
@@ -1341,15 +1155,14 @@
           <w:p>
             <w:r>
               <w:rPr>
-                <w:rFonts w:ascii="Consolas" w:cs="Consolas" w:eastAsia="Consolas" w:hAnsi="Consolas"/>
+                <w:rFonts w:ascii="Calibri" w:cs="Calibri" w:eastAsia="Calibri" w:hAnsi="Calibri"/>
                 <w:b/>
                 <w:bCs/>
                 <w:color w:val="1E8A5A"/>
-                <w:sz w:val="17"/>
-                <w:szCs w:val="17"/>
-                <w:shd w:fill="E4F3EA" w:val="clear"/>
-              </w:rPr>
-              <w:t xml:space="preserve"> Live </w:t>
+                <w:sz w:val="18"/>
+                <w:szCs w:val="18"/>
+              </w:rPr>
+              <w:t xml:space="preserve">Live</w:t>
             </w:r>
           </w:p>
         </w:tc>
@@ -1415,15 +1228,14 @@
           <w:p>
             <w:r>
               <w:rPr>
-                <w:rFonts w:ascii="Consolas" w:cs="Consolas" w:eastAsia="Consolas" w:hAnsi="Consolas"/>
+                <w:rFonts w:ascii="Calibri" w:cs="Calibri" w:eastAsia="Calibri" w:hAnsi="Calibri"/>
                 <w:b/>
                 <w:bCs/>
                 <w:color w:val="1E8A5A"/>
-                <w:sz w:val="17"/>
-                <w:szCs w:val="17"/>
-                <w:shd w:fill="E4F3EA" w:val="clear"/>
-              </w:rPr>
-              <w:t xml:space="preserve"> Live </w:t>
+                <w:sz w:val="18"/>
+                <w:szCs w:val="18"/>
+              </w:rPr>
+              <w:t xml:space="preserve">Live</w:t>
             </w:r>
           </w:p>
         </w:tc>
@@ -1489,15 +1301,14 @@
           <w:p>
             <w:r>
               <w:rPr>
-                <w:rFonts w:ascii="Consolas" w:cs="Consolas" w:eastAsia="Consolas" w:hAnsi="Consolas"/>
+                <w:rFonts w:ascii="Calibri" w:cs="Calibri" w:eastAsia="Calibri" w:hAnsi="Calibri"/>
                 <w:b/>
                 <w:bCs/>
                 <w:color w:val="1E8A5A"/>
-                <w:sz w:val="17"/>
-                <w:szCs w:val="17"/>
-                <w:shd w:fill="E4F3EA" w:val="clear"/>
-              </w:rPr>
-              <w:t xml:space="preserve"> Live </w:t>
+                <w:sz w:val="18"/>
+                <w:szCs w:val="18"/>
+              </w:rPr>
+              <w:t xml:space="preserve">Live</w:t>
             </w:r>
           </w:p>
         </w:tc>
@@ -1563,15 +1374,14 @@
           <w:p>
             <w:r>
               <w:rPr>
-                <w:rFonts w:ascii="Consolas" w:cs="Consolas" w:eastAsia="Consolas" w:hAnsi="Consolas"/>
+                <w:rFonts w:ascii="Calibri" w:cs="Calibri" w:eastAsia="Calibri" w:hAnsi="Calibri"/>
                 <w:b/>
                 <w:bCs/>
                 <w:color w:val="1E8A5A"/>
-                <w:sz w:val="17"/>
-                <w:szCs w:val="17"/>
-                <w:shd w:fill="E4F3EA" w:val="clear"/>
-              </w:rPr>
-              <w:t xml:space="preserve"> Live </w:t>
+                <w:sz w:val="18"/>
+                <w:szCs w:val="18"/>
+              </w:rPr>
+              <w:t xml:space="preserve">Live</w:t>
             </w:r>
           </w:p>
         </w:tc>
@@ -1637,15 +1447,164 @@
           <w:p>
             <w:r>
               <w:rPr>
-                <w:rFonts w:ascii="Consolas" w:cs="Consolas" w:eastAsia="Consolas" w:hAnsi="Consolas"/>
+                <w:rFonts w:ascii="Calibri" w:cs="Calibri" w:eastAsia="Calibri" w:hAnsi="Calibri"/>
                 <w:b/>
                 <w:bCs/>
                 <w:color w:val="1E8A5A"/>
-                <w:sz w:val="17"/>
-                <w:szCs w:val="17"/>
-                <w:shd w:fill="E4F3EA" w:val="clear"/>
-              </w:rPr>
-              <w:t xml:space="preserve"> Live </w:t>
+                <w:sz w:val="18"/>
+                <w:szCs w:val="18"/>
+              </w:rPr>
+              <w:t xml:space="preserve">Live</w:t>
+            </w:r>
+          </w:p>
+        </w:tc>
+      </w:tr>
+      <w:tr>
+        <w:tc>
+          <w:tcPr>
+            <w:tcW w:type="dxa" w:w="5400"/>
+            <w:shd w:fill="FFFFFF" w:val="clear"/>
+            <w:tcMar>
+              <w:top w:type="dxa" w:w="50"/>
+              <w:left w:type="dxa" w:w="110"/>
+              <w:bottom w:type="dxa" w:w="50"/>
+              <w:right w:type="dxa" w:w="110"/>
+            </w:tcMar>
+          </w:tcPr>
+          <w:p>
+            <w:r>
+              <w:rPr>
+                <w:rFonts w:ascii="Calibri" w:cs="Calibri" w:eastAsia="Calibri" w:hAnsi="Calibri"/>
+                <w:b/>
+                <w:bCs/>
+                <w:color w:val="1E8A5A"/>
+                <w:sz w:val="21"/>
+                <w:szCs w:val="21"/>
+              </w:rPr>
+              <w:t xml:space="preserve">AI-02 No-show — score → backup → resolve (heuristic)</w:t>
+            </w:r>
+          </w:p>
+        </w:tc>
+        <w:tc>
+          <w:tcPr>
+            <w:tcW w:type="dxa" w:w="1900"/>
+            <w:shd w:fill="FFFFFF" w:val="clear"/>
+            <w:tcMar>
+              <w:top w:type="dxa" w:w="50"/>
+              <w:left w:type="dxa" w:w="110"/>
+              <w:bottom w:type="dxa" w:w="50"/>
+              <w:right w:type="dxa" w:w="110"/>
+            </w:tcMar>
+          </w:tcPr>
+          <w:p>
+            <w:r>
+              <w:rPr>
+                <w:rFonts w:ascii="Consolas" w:cs="Consolas" w:eastAsia="Consolas" w:hAnsi="Consolas"/>
+                <w:color w:val="5F6F68"/>
+                <w:sz w:val="18"/>
+                <w:szCs w:val="18"/>
+              </w:rPr>
+              <w:t xml:space="preserve">AI-02</w:t>
+            </w:r>
+          </w:p>
+        </w:tc>
+        <w:tc>
+          <w:tcPr>
+            <w:tcW w:type="dxa" w:w="2060"/>
+            <w:shd w:fill="FFFFFF" w:val="clear"/>
+            <w:tcMar>
+              <w:top w:type="dxa" w:w="50"/>
+              <w:left w:type="dxa" w:w="110"/>
+              <w:bottom w:type="dxa" w:w="50"/>
+              <w:right w:type="dxa" w:w="110"/>
+            </w:tcMar>
+          </w:tcPr>
+          <w:p>
+            <w:r>
+              <w:rPr>
+                <w:rFonts w:ascii="Calibri" w:cs="Calibri" w:eastAsia="Calibri" w:hAnsi="Calibri"/>
+                <w:b/>
+                <w:bCs/>
+                <w:color w:val="1E8A5A"/>
+                <w:sz w:val="18"/>
+                <w:szCs w:val="18"/>
+              </w:rPr>
+              <w:t xml:space="preserve">Live</w:t>
+            </w:r>
+          </w:p>
+        </w:tc>
+      </w:tr>
+      <w:tr>
+        <w:tc>
+          <w:tcPr>
+            <w:tcW w:type="dxa" w:w="5400"/>
+            <w:shd w:fill="F4F7F5" w:val="clear"/>
+            <w:tcMar>
+              <w:top w:type="dxa" w:w="50"/>
+              <w:left w:type="dxa" w:w="110"/>
+              <w:bottom w:type="dxa" w:w="50"/>
+              <w:right w:type="dxa" w:w="110"/>
+            </w:tcMar>
+          </w:tcPr>
+          <w:p>
+            <w:r>
+              <w:rPr>
+                <w:rFonts w:ascii="Calibri" w:cs="Calibri" w:eastAsia="Calibri" w:hAnsi="Calibri"/>
+                <w:b/>
+                <w:bCs/>
+                <w:color w:val="1E8A5A"/>
+                <w:sz w:val="21"/>
+                <w:szCs w:val="21"/>
+              </w:rPr>
+              <w:t xml:space="preserve">Pre-book Backup — real standby reservation &amp; promotion</w:t>
+            </w:r>
+          </w:p>
+        </w:tc>
+        <w:tc>
+          <w:tcPr>
+            <w:tcW w:type="dxa" w:w="1900"/>
+            <w:shd w:fill="F4F7F5" w:val="clear"/>
+            <w:tcMar>
+              <w:top w:type="dxa" w:w="50"/>
+              <w:left w:type="dxa" w:w="110"/>
+              <w:bottom w:type="dxa" w:w="50"/>
+              <w:right w:type="dxa" w:w="110"/>
+            </w:tcMar>
+          </w:tcPr>
+          <w:p>
+            <w:r>
+              <w:rPr>
+                <w:rFonts w:ascii="Consolas" w:cs="Consolas" w:eastAsia="Consolas" w:hAnsi="Consolas"/>
+                <w:color w:val="5F6F68"/>
+                <w:sz w:val="18"/>
+                <w:szCs w:val="18"/>
+              </w:rPr>
+              <w:t xml:space="preserve">Continuity</w:t>
+            </w:r>
+          </w:p>
+        </w:tc>
+        <w:tc>
+          <w:tcPr>
+            <w:tcW w:type="dxa" w:w="2060"/>
+            <w:shd w:fill="F4F7F5" w:val="clear"/>
+            <w:tcMar>
+              <w:top w:type="dxa" w:w="50"/>
+              <w:left w:type="dxa" w:w="110"/>
+              <w:bottom w:type="dxa" w:w="50"/>
+              <w:right w:type="dxa" w:w="110"/>
+            </w:tcMar>
+          </w:tcPr>
+          <w:p>
+            <w:r>
+              <w:rPr>
+                <w:rFonts w:ascii="Calibri" w:cs="Calibri" w:eastAsia="Calibri" w:hAnsi="Calibri"/>
+                <w:b/>
+                <w:bCs/>
+                <w:color w:val="1E8A5A"/>
+                <w:sz w:val="18"/>
+                <w:szCs w:val="18"/>
+              </w:rPr>
+              <w:t xml:space="preserve">Live</w:t>
             </w:r>
           </w:p>
         </w:tc>
@@ -1653,13 +1612,8 @@
     </w:tbl>
     <w:p>
       <w:pPr>
-        <w:spacing w:after="40"/>
-      </w:pPr>
-    </w:p>
-    <w:p>
-      <w:pPr>
         <w:pStyle w:val="Heading3"/>
-        <w:spacing w:after="60" w:before="220"/>
+        <w:spacing w:after="60" w:before="240"/>
       </w:pPr>
       <w:r>
         <w:rPr>
@@ -1712,8 +1666,8 @@
                 <w:b/>
                 <w:bCs/>
                 <w:color w:val="F0C97A"/>
-                <w:sz w:val="16"/>
-                <w:szCs w:val="16"/>
+                <w:sz w:val="15"/>
+                <w:szCs w:val="15"/>
               </w:rPr>
               <w:t xml:space="preserve">FEATURE</w:t>
             </w:r>
@@ -1737,8 +1691,8 @@
                 <w:b/>
                 <w:bCs/>
                 <w:color w:val="F0C97A"/>
-                <w:sz w:val="16"/>
-                <w:szCs w:val="16"/>
+                <w:sz w:val="15"/>
+                <w:szCs w:val="15"/>
               </w:rPr>
               <w:t xml:space="preserve">PRD</w:t>
             </w:r>
@@ -1762,8 +1716,8 @@
                 <w:b/>
                 <w:bCs/>
                 <w:color w:val="F0C97A"/>
-                <w:sz w:val="16"/>
-                <w:szCs w:val="16"/>
+                <w:sz w:val="15"/>
+                <w:szCs w:val="15"/>
               </w:rPr>
               <w:t xml:space="preserve">STATUS</w:t>
             </w:r>
@@ -1831,15 +1785,14 @@
           <w:p>
             <w:r>
               <w:rPr>
-                <w:rFonts w:ascii="Consolas" w:cs="Consolas" w:eastAsia="Consolas" w:hAnsi="Consolas"/>
+                <w:rFonts w:ascii="Calibri" w:cs="Calibri" w:eastAsia="Calibri" w:hAnsi="Calibri"/>
                 <w:b/>
                 <w:bCs/>
                 <w:color w:val="B9791A"/>
-                <w:sz w:val="17"/>
-                <w:szCs w:val="17"/>
-                <w:shd w:fill="F8EED9" w:val="clear"/>
-              </w:rPr>
-              <w:t xml:space="preserve"> Static </w:t>
+                <w:sz w:val="18"/>
+                <w:szCs w:val="18"/>
+              </w:rPr>
+              <w:t xml:space="preserve">Static</w:t>
             </w:r>
           </w:p>
         </w:tc>
@@ -1905,15 +1858,14 @@
           <w:p>
             <w:r>
               <w:rPr>
-                <w:rFonts w:ascii="Consolas" w:cs="Consolas" w:eastAsia="Consolas" w:hAnsi="Consolas"/>
+                <w:rFonts w:ascii="Calibri" w:cs="Calibri" w:eastAsia="Calibri" w:hAnsi="Calibri"/>
                 <w:b/>
                 <w:bCs/>
                 <w:color w:val="B9791A"/>
-                <w:sz w:val="17"/>
-                <w:szCs w:val="17"/>
-                <w:shd w:fill="F8EED9" w:val="clear"/>
-              </w:rPr>
-              <w:t xml:space="preserve"> No payment </w:t>
+                <w:sz w:val="18"/>
+                <w:szCs w:val="18"/>
+              </w:rPr>
+              <w:t xml:space="preserve">No payment</w:t>
             </w:r>
           </w:p>
         </w:tc>
@@ -1938,7 +1890,7 @@
                 <w:sz w:val="21"/>
                 <w:szCs w:val="21"/>
               </w:rPr>
-              <w:t xml:space="preserve">AI Insights — voice booking + no-show cards</w:t>
+              <w:t xml:space="preserve">AI Insights — voice booking panel (no-show is now Live, above)</w:t>
             </w:r>
           </w:p>
         </w:tc>
@@ -1979,15 +1931,14 @@
           <w:p>
             <w:r>
               <w:rPr>
-                <w:rFonts w:ascii="Consolas" w:cs="Consolas" w:eastAsia="Consolas" w:hAnsi="Consolas"/>
+                <w:rFonts w:ascii="Calibri" w:cs="Calibri" w:eastAsia="Calibri" w:hAnsi="Calibri"/>
                 <w:b/>
                 <w:bCs/>
                 <w:color w:val="B9791A"/>
-                <w:sz w:val="17"/>
-                <w:szCs w:val="17"/>
-                <w:shd w:fill="F8EED9" w:val="clear"/>
-              </w:rPr>
-              <w:t xml:space="preserve"> Simulated </w:t>
+                <w:sz w:val="18"/>
+                <w:szCs w:val="18"/>
+              </w:rPr>
+              <w:t xml:space="preserve">Static</w:t>
             </w:r>
           </w:p>
         </w:tc>
@@ -2053,15 +2004,14 @@
           <w:p>
             <w:r>
               <w:rPr>
-                <w:rFonts w:ascii="Consolas" w:cs="Consolas" w:eastAsia="Consolas" w:hAnsi="Consolas"/>
+                <w:rFonts w:ascii="Calibri" w:cs="Calibri" w:eastAsia="Calibri" w:hAnsi="Calibri"/>
                 <w:b/>
                 <w:bCs/>
                 <w:color w:val="B9791A"/>
-                <w:sz w:val="17"/>
-                <w:szCs w:val="17"/>
-                <w:shd w:fill="F8EED9" w:val="clear"/>
-              </w:rPr>
-              <w:t xml:space="preserve"> Seed data </w:t>
+                <w:sz w:val="18"/>
+                <w:szCs w:val="18"/>
+              </w:rPr>
+              <w:t xml:space="preserve">Seed data</w:t>
             </w:r>
           </w:p>
         </w:tc>
@@ -2086,7 +2036,7 @@
                 <w:sz w:val="21"/>
                 <w:szCs w:val="21"/>
               </w:rPr>
-              <w:t xml:space="preserve">Pre-book Backup (continuity of care)</w:t>
+              <w:t xml:space="preserve">Post-service review</w:t>
             </w:r>
           </w:p>
         </w:tc>
@@ -2109,7 +2059,7 @@
                 <w:sz w:val="18"/>
                 <w:szCs w:val="18"/>
               </w:rPr>
-              <w:t xml:space="preserve">Continuity</w:t>
+              <w:t xml:space="preserve">Q1</w:t>
             </w:r>
           </w:p>
         </w:tc>
@@ -2127,15 +2077,14 @@
           <w:p>
             <w:r>
               <w:rPr>
-                <w:rFonts w:ascii="Consolas" w:cs="Consolas" w:eastAsia="Consolas" w:hAnsi="Consolas"/>
+                <w:rFonts w:ascii="Calibri" w:cs="Calibri" w:eastAsia="Calibri" w:hAnsi="Calibri"/>
                 <w:b/>
                 <w:bCs/>
                 <w:color w:val="B9791A"/>
-                <w:sz w:val="17"/>
-                <w:szCs w:val="17"/>
-                <w:shd w:fill="F8EED9" w:val="clear"/>
-              </w:rPr>
-              <w:t xml:space="preserve"> Seed data </w:t>
+                <w:sz w:val="18"/>
+                <w:szCs w:val="18"/>
+              </w:rPr>
+              <w:t xml:space="preserve">Seed data</w:t>
             </w:r>
           </w:p>
         </w:tc>
@@ -2160,7 +2109,7 @@
                 <w:sz w:val="21"/>
                 <w:szCs w:val="21"/>
               </w:rPr>
-              <w:t xml:space="preserve">Post-service review</w:t>
+              <w:t xml:space="preserve">Registration wizards (household / worker / NRI, 8-step)</w:t>
             </w:r>
           </w:p>
         </w:tc>
@@ -2183,7 +2132,7 @@
                 <w:sz w:val="18"/>
                 <w:szCs w:val="18"/>
               </w:rPr>
-              <w:t xml:space="preserve">Q1</w:t>
+              <w:t xml:space="preserve">FR-09</w:t>
             </w:r>
           </w:p>
         </w:tc>
@@ -2201,15 +2150,14 @@
           <w:p>
             <w:r>
               <w:rPr>
-                <w:rFonts w:ascii="Consolas" w:cs="Consolas" w:eastAsia="Consolas" w:hAnsi="Consolas"/>
+                <w:rFonts w:ascii="Calibri" w:cs="Calibri" w:eastAsia="Calibri" w:hAnsi="Calibri"/>
                 <w:b/>
                 <w:bCs/>
                 <w:color w:val="B9791A"/>
-                <w:sz w:val="17"/>
-                <w:szCs w:val="17"/>
-                <w:shd w:fill="F8EED9" w:val="clear"/>
-              </w:rPr>
-              <w:t xml:space="preserve"> Seed data </w:t>
+                <w:sz w:val="18"/>
+                <w:szCs w:val="18"/>
+              </w:rPr>
+              <w:t xml:space="preserve">localStorage</w:t>
             </w:r>
           </w:p>
         </w:tc>
@@ -2234,7 +2182,7 @@
                 <w:sz w:val="21"/>
                 <w:szCs w:val="21"/>
               </w:rPr>
-              <w:t xml:space="preserve">Registration wizards (household / worker / NRI, 8-step)</w:t>
+              <w:t xml:space="preserve">Email OTP login</w:t>
             </w:r>
           </w:p>
         </w:tc>
@@ -2275,15 +2223,14 @@
           <w:p>
             <w:r>
               <w:rPr>
-                <w:rFonts w:ascii="Consolas" w:cs="Consolas" w:eastAsia="Consolas" w:hAnsi="Consolas"/>
+                <w:rFonts w:ascii="Calibri" w:cs="Calibri" w:eastAsia="Calibri" w:hAnsi="Calibri"/>
                 <w:b/>
                 <w:bCs/>
                 <w:color w:val="B9791A"/>
-                <w:sz w:val="17"/>
-                <w:szCs w:val="17"/>
-                <w:shd w:fill="F8EED9" w:val="clear"/>
-              </w:rPr>
-              <w:t xml:space="preserve"> localStorage </w:t>
+                <w:sz w:val="18"/>
+                <w:szCs w:val="18"/>
+              </w:rPr>
+              <w:t xml:space="preserve">Built · blocked</w:t>
             </w:r>
           </w:p>
         </w:tc>
@@ -2308,7 +2255,7 @@
                 <w:sz w:val="21"/>
                 <w:szCs w:val="21"/>
               </w:rPr>
-              <w:t xml:space="preserve">Email OTP login</w:t>
+              <w:t xml:space="preserve">NRI booking history</w:t>
             </w:r>
           </w:p>
         </w:tc>
@@ -2331,7 +2278,7 @@
                 <w:sz w:val="18"/>
                 <w:szCs w:val="18"/>
               </w:rPr>
-              <w:t xml:space="preserve">FR-09</w:t>
+              <w:t xml:space="preserve">FR-08</w:t>
             </w:r>
           </w:p>
         </w:tc>
@@ -2349,89 +2296,14 @@
           <w:p>
             <w:r>
               <w:rPr>
-                <w:rFonts w:ascii="Consolas" w:cs="Consolas" w:eastAsia="Consolas" w:hAnsi="Consolas"/>
+                <w:rFonts w:ascii="Calibri" w:cs="Calibri" w:eastAsia="Calibri" w:hAnsi="Calibri"/>
                 <w:b/>
                 <w:bCs/>
                 <w:color w:val="B9791A"/>
-                <w:sz w:val="17"/>
-                <w:szCs w:val="17"/>
-                <w:shd w:fill="F8EED9" w:val="clear"/>
-              </w:rPr>
-              <w:t xml:space="preserve"> Built · blocked </w:t>
-            </w:r>
-          </w:p>
-        </w:tc>
-      </w:tr>
-      <w:tr>
-        <w:tc>
-          <w:tcPr>
-            <w:tcW w:type="dxa" w:w="5400"/>
-            <w:shd w:fill="FFFFFF" w:val="clear"/>
-            <w:tcMar>
-              <w:top w:type="dxa" w:w="50"/>
-              <w:left w:type="dxa" w:w="110"/>
-              <w:bottom w:type="dxa" w:w="50"/>
-              <w:right w:type="dxa" w:w="110"/>
-            </w:tcMar>
-          </w:tcPr>
-          <w:p>
-            <w:r>
-              <w:rPr>
-                <w:rFonts w:ascii="Calibri" w:cs="Calibri" w:eastAsia="Calibri" w:hAnsi="Calibri"/>
-                <w:color w:val="2B3A34"/>
-                <w:sz w:val="21"/>
-                <w:szCs w:val="21"/>
-              </w:rPr>
-              <w:t xml:space="preserve">NRI booking history</w:t>
-            </w:r>
-          </w:p>
-        </w:tc>
-        <w:tc>
-          <w:tcPr>
-            <w:tcW w:type="dxa" w:w="1900"/>
-            <w:shd w:fill="FFFFFF" w:val="clear"/>
-            <w:tcMar>
-              <w:top w:type="dxa" w:w="50"/>
-              <w:left w:type="dxa" w:w="110"/>
-              <w:bottom w:type="dxa" w:w="50"/>
-              <w:right w:type="dxa" w:w="110"/>
-            </w:tcMar>
-          </w:tcPr>
-          <w:p>
-            <w:r>
-              <w:rPr>
-                <w:rFonts w:ascii="Consolas" w:cs="Consolas" w:eastAsia="Consolas" w:hAnsi="Consolas"/>
-                <w:color w:val="5F6F68"/>
-                <w:sz w:val="18"/>
-                <w:szCs w:val="18"/>
-              </w:rPr>
-              <w:t xml:space="preserve">FR-08</w:t>
-            </w:r>
-          </w:p>
-        </w:tc>
-        <w:tc>
-          <w:tcPr>
-            <w:tcW w:type="dxa" w:w="2060"/>
-            <w:shd w:fill="FFFFFF" w:val="clear"/>
-            <w:tcMar>
-              <w:top w:type="dxa" w:w="50"/>
-              <w:left w:type="dxa" w:w="110"/>
-              <w:bottom w:type="dxa" w:w="50"/>
-              <w:right w:type="dxa" w:w="110"/>
-            </w:tcMar>
-          </w:tcPr>
-          <w:p>
-            <w:r>
-              <w:rPr>
-                <w:rFonts w:ascii="Consolas" w:cs="Consolas" w:eastAsia="Consolas" w:hAnsi="Consolas"/>
-                <w:b/>
-                <w:bCs/>
-                <w:color w:val="B9791A"/>
-                <w:sz w:val="17"/>
-                <w:szCs w:val="17"/>
-                <w:shd w:fill="F8EED9" w:val="clear"/>
-              </w:rPr>
-              <w:t xml:space="preserve"> Stub </w:t>
+                <w:sz w:val="18"/>
+                <w:szCs w:val="18"/>
+              </w:rPr>
+              <w:t xml:space="preserve">Stub</w:t>
             </w:r>
           </w:p>
         </w:tc>
@@ -2444,81 +2316,19 @@
       <w:r>
         <w:rPr>
           <w:rFonts w:ascii="Calibri" w:cs="Calibri" w:eastAsia="Calibri" w:hAnsi="Calibri"/>
-          <w:color w:val="5F6F68"/>
-          <w:sz w:val="21"/>
-          <w:szCs w:val="21"/>
-        </w:rPr>
-        <w:t xml:space="preserve">Note: the real onboarding paths </w:t>
-      </w:r>
-      <w:r>
-        <w:rPr>
-          <w:rFonts w:ascii="Calibri" w:cs="Calibri" w:eastAsia="Calibri" w:hAnsi="Calibri"/>
           <w:i/>
           <w:iCs/>
-          <w:color w:val="5F6F68"/>
-          <w:sz w:val="21"/>
-          <w:szCs w:val="21"/>
-        </w:rPr>
-        <w:t xml:space="preserve">are</w:t>
-      </w:r>
-      <w:r>
-        <w:rPr>
-          <w:rFonts w:ascii="Calibri" w:cs="Calibri" w:eastAsia="Calibri" w:hAnsi="Calibri"/>
-          <w:color w:val="5F6F68"/>
-          <w:sz w:val="21"/>
-          <w:szCs w:val="21"/>
-        </w:rPr>
-        <w:t xml:space="preserve"> live — guest sign-in, </w:t>
-      </w:r>
-      <w:r>
-        <w:rPr>
-          <w:rFonts w:ascii="Consolas" w:cs="Consolas" w:eastAsia="Consolas" w:hAnsi="Consolas"/>
-          <w:color w:val="0E3D33"/>
-          <w:sz w:val="19"/>
-          <w:szCs w:val="19"/>
-          <w:shd w:fill="EEF3F1" w:val="clear"/>
-        </w:rPr>
-        <w:t xml:space="preserve">become_worker</w:t>
-      </w:r>
-      <w:r>
-        <w:rPr>
-          <w:rFonts w:ascii="Calibri" w:cs="Calibri" w:eastAsia="Calibri" w:hAnsi="Calibri"/>
-          <w:color w:val="5F6F68"/>
-          <w:sz w:val="21"/>
-          <w:szCs w:val="21"/>
-        </w:rPr>
-        <w:t xml:space="preserve">, and consent-code linking. The multi-step registration </w:t>
-      </w:r>
-      <w:r>
-        <w:rPr>
-          <w:rFonts w:ascii="Calibri" w:cs="Calibri" w:eastAsia="Calibri" w:hAnsi="Calibri"/>
-          <w:i/>
-          <w:iCs/>
-          <w:color w:val="5F6F68"/>
-          <w:sz w:val="21"/>
-          <w:szCs w:val="21"/>
-        </w:rPr>
-        <w:t xml:space="preserve">wizards</w:t>
-      </w:r>
-      <w:r>
-        <w:rPr>
-          <w:rFonts w:ascii="Calibri" w:cs="Calibri" w:eastAsia="Calibri" w:hAnsi="Calibri"/>
-          <w:color w:val="5F6F68"/>
-          <w:sz w:val="21"/>
-          <w:szCs w:val="21"/>
-        </w:rPr>
-        <w:t xml:space="preserve"> are separate front-end demos that still write to localStorage.</w:t>
-      </w:r>
-    </w:p>
-    <w:p>
-      <w:pPr>
-        <w:spacing w:after="40"/>
-      </w:pPr>
+          <w:color w:val="2B3A34"/>
+          <w:sz w:val="21"/>
+          <w:szCs w:val="21"/>
+        </w:rPr>
+        <w:t xml:space="preserve">Note: the real onboarding paths are live — guest sign-in, become_worker, and consent-code linking. The multi-step registration wizards are separate front-end demos that still write to localStorage.</w:t>
+      </w:r>
     </w:p>
     <w:p>
       <w:pPr>
         <w:pStyle w:val="Heading3"/>
-        <w:spacing w:after="60" w:before="220"/>
+        <w:spacing w:after="60" w:before="240"/>
       </w:pPr>
       <w:r>
         <w:rPr>
@@ -2571,8 +2381,8 @@
                 <w:b/>
                 <w:bCs/>
                 <w:color w:val="F0C97A"/>
-                <w:sz w:val="16"/>
-                <w:szCs w:val="16"/>
+                <w:sz w:val="15"/>
+                <w:szCs w:val="15"/>
               </w:rPr>
               <w:t xml:space="preserve">FEATURE</w:t>
             </w:r>
@@ -2596,8 +2406,8 @@
                 <w:b/>
                 <w:bCs/>
                 <w:color w:val="F0C97A"/>
-                <w:sz w:val="16"/>
-                <w:szCs w:val="16"/>
+                <w:sz w:val="15"/>
+                <w:szCs w:val="15"/>
               </w:rPr>
               <w:t xml:space="preserve">PRD</w:t>
             </w:r>
@@ -2621,8 +2431,8 @@
                 <w:b/>
                 <w:bCs/>
                 <w:color w:val="F0C97A"/>
-                <w:sz w:val="16"/>
-                <w:szCs w:val="16"/>
+                <w:sz w:val="15"/>
+                <w:szCs w:val="15"/>
               </w:rPr>
               <w:t xml:space="preserve">STATUS</w:t>
             </w:r>
@@ -2690,15 +2500,14 @@
           <w:p>
             <w:r>
               <w:rPr>
-                <w:rFonts w:ascii="Consolas" w:cs="Consolas" w:eastAsia="Consolas" w:hAnsi="Consolas"/>
+                <w:rFonts w:ascii="Calibri" w:cs="Calibri" w:eastAsia="Calibri" w:hAnsi="Calibri"/>
                 <w:b/>
                 <w:bCs/>
                 <w:color w:val="B4442E"/>
-                <w:sz w:val="17"/>
-                <w:szCs w:val="17"/>
-                <w:shd w:fill="F7E6E1" w:val="clear"/>
-              </w:rPr>
-              <w:t xml:space="preserve"> Deferred </w:t>
+                <w:sz w:val="18"/>
+                <w:szCs w:val="18"/>
+              </w:rPr>
+              <w:t xml:space="preserve">Deferred</w:t>
             </w:r>
           </w:p>
         </w:tc>
@@ -2723,7 +2532,7 @@
                 <w:sz w:val="21"/>
                 <w:szCs w:val="21"/>
               </w:rPr>
-              <w:t xml:space="preserve">AI-02 No-show prediction + auto-escalation</w:t>
+              <w:t xml:space="preserve">AI-03 NLP / voice engine</w:t>
             </w:r>
           </w:p>
         </w:tc>
@@ -2746,7 +2555,7 @@
                 <w:sz w:val="18"/>
                 <w:szCs w:val="18"/>
               </w:rPr>
-              <w:t xml:space="preserve">AI-02</w:t>
+              <w:t xml:space="preserve">AI-03</w:t>
             </w:r>
           </w:p>
         </w:tc>
@@ -2764,15 +2573,14 @@
           <w:p>
             <w:r>
               <w:rPr>
-                <w:rFonts w:ascii="Consolas" w:cs="Consolas" w:eastAsia="Consolas" w:hAnsi="Consolas"/>
+                <w:rFonts w:ascii="Calibri" w:cs="Calibri" w:eastAsia="Calibri" w:hAnsi="Calibri"/>
                 <w:b/>
                 <w:bCs/>
                 <w:color w:val="B4442E"/>
-                <w:sz w:val="17"/>
-                <w:szCs w:val="17"/>
-                <w:shd w:fill="F7E6E1" w:val="clear"/>
-              </w:rPr>
-              <w:t xml:space="preserve"> Deferred </w:t>
+                <w:sz w:val="18"/>
+                <w:szCs w:val="18"/>
+              </w:rPr>
+              <w:t xml:space="preserve">Deferred</w:t>
             </w:r>
           </w:p>
         </w:tc>
@@ -2797,7 +2605,7 @@
                 <w:sz w:val="21"/>
                 <w:szCs w:val="21"/>
               </w:rPr>
-              <w:t xml:space="preserve">AI-03 NLP / voice engine</w:t>
+              <w:t xml:space="preserve">AI-04 Home Health scoring</w:t>
             </w:r>
           </w:p>
         </w:tc>
@@ -2820,7 +2628,7 @@
                 <w:sz w:val="18"/>
                 <w:szCs w:val="18"/>
               </w:rPr>
-              <w:t xml:space="preserve">AI-03</w:t>
+              <w:t xml:space="preserve">AI-04</w:t>
             </w:r>
           </w:p>
         </w:tc>
@@ -2838,15 +2646,87 @@
           <w:p>
             <w:r>
               <w:rPr>
+                <w:rFonts w:ascii="Calibri" w:cs="Calibri" w:eastAsia="Calibri" w:hAnsi="Calibri"/>
+                <w:b/>
+                <w:bCs/>
+                <w:color w:val="5F6F68"/>
+                <w:sz w:val="18"/>
+                <w:szCs w:val="18"/>
+              </w:rPr>
+              <w:t xml:space="preserve">Retired</w:t>
+            </w:r>
+          </w:p>
+        </w:tc>
+      </w:tr>
+      <w:tr>
+        <w:tc>
+          <w:tcPr>
+            <w:tcW w:type="dxa" w:w="5400"/>
+            <w:shd w:fill="F4F7F5" w:val="clear"/>
+            <w:tcMar>
+              <w:top w:type="dxa" w:w="50"/>
+              <w:left w:type="dxa" w:w="110"/>
+              <w:bottom w:type="dxa" w:w="50"/>
+              <w:right w:type="dxa" w:w="110"/>
+            </w:tcMar>
+          </w:tcPr>
+          <w:p>
+            <w:r>
+              <w:rPr>
+                <w:rFonts w:ascii="Calibri" w:cs="Calibri" w:eastAsia="Calibri" w:hAnsi="Calibri"/>
+                <w:color w:val="2B3A34"/>
+                <w:sz w:val="21"/>
+                <w:szCs w:val="21"/>
+              </w:rPr>
+              <w:t xml:space="preserve">AI-05 Churn scoring engine</w:t>
+            </w:r>
+          </w:p>
+        </w:tc>
+        <w:tc>
+          <w:tcPr>
+            <w:tcW w:type="dxa" w:w="1900"/>
+            <w:shd w:fill="F4F7F5" w:val="clear"/>
+            <w:tcMar>
+              <w:top w:type="dxa" w:w="50"/>
+              <w:left w:type="dxa" w:w="110"/>
+              <w:bottom w:type="dxa" w:w="50"/>
+              <w:right w:type="dxa" w:w="110"/>
+            </w:tcMar>
+          </w:tcPr>
+          <w:p>
+            <w:r>
+              <w:rPr>
                 <w:rFonts w:ascii="Consolas" w:cs="Consolas" w:eastAsia="Consolas" w:hAnsi="Consolas"/>
+                <w:color w:val="5F6F68"/>
+                <w:sz w:val="18"/>
+                <w:szCs w:val="18"/>
+              </w:rPr>
+              <w:t xml:space="preserve">AI-05</w:t>
+            </w:r>
+          </w:p>
+        </w:tc>
+        <w:tc>
+          <w:tcPr>
+            <w:tcW w:type="dxa" w:w="2060"/>
+            <w:shd w:fill="F4F7F5" w:val="clear"/>
+            <w:tcMar>
+              <w:top w:type="dxa" w:w="50"/>
+              <w:left w:type="dxa" w:w="110"/>
+              <w:bottom w:type="dxa" w:w="50"/>
+              <w:right w:type="dxa" w:w="110"/>
+            </w:tcMar>
+          </w:tcPr>
+          <w:p>
+            <w:r>
+              <w:rPr>
+                <w:rFonts w:ascii="Calibri" w:cs="Calibri" w:eastAsia="Calibri" w:hAnsi="Calibri"/>
                 <w:b/>
                 <w:bCs/>
                 <w:color w:val="B4442E"/>
-                <w:sz w:val="17"/>
-                <w:szCs w:val="17"/>
-                <w:shd w:fill="F7E6E1" w:val="clear"/>
-              </w:rPr>
-              <w:t xml:space="preserve"> Deferred </w:t>
+                <w:sz w:val="18"/>
+                <w:szCs w:val="18"/>
+              </w:rPr>
+              <w:t xml:space="preserve">Deferred</w:t>
             </w:r>
           </w:p>
         </w:tc>
@@ -2855,7 +2735,7 @@
         <w:tc>
           <w:tcPr>
             <w:tcW w:type="dxa" w:w="5400"/>
-            <w:shd w:fill="F4F7F5" w:val="clear"/>
+            <w:shd w:fill="FFFFFF" w:val="clear"/>
             <w:tcMar>
               <w:top w:type="dxa" w:w="50"/>
               <w:left w:type="dxa" w:w="110"/>
@@ -2871,14 +2751,14 @@
                 <w:sz w:val="21"/>
                 <w:szCs w:val="21"/>
               </w:rPr>
-              <w:t xml:space="preserve">AI-04 Home Health scoring</w:t>
+              <w:t xml:space="preserve">Payments — Razorpay / Stripe, subscriptions, payouts</w:t>
             </w:r>
           </w:p>
         </w:tc>
         <w:tc>
           <w:tcPr>
             <w:tcW w:type="dxa" w:w="1900"/>
-            <w:shd w:fill="F4F7F5" w:val="clear"/>
+            <w:shd w:fill="FFFFFF" w:val="clear"/>
             <w:tcMar>
               <w:top w:type="dxa" w:w="50"/>
               <w:left w:type="dxa" w:w="110"/>
@@ -2894,33 +2774,32 @@
                 <w:sz w:val="18"/>
                 <w:szCs w:val="18"/>
               </w:rPr>
-              <w:t xml:space="preserve">AI-04</w:t>
+              <w:t xml:space="preserve">Data model</w:t>
             </w:r>
           </w:p>
         </w:tc>
         <w:tc>
           <w:tcPr>
             <w:tcW w:type="dxa" w:w="2060"/>
-            <w:shd w:fill="F4F7F5" w:val="clear"/>
-            <w:tcMar>
-              <w:top w:type="dxa" w:w="50"/>
-              <w:left w:type="dxa" w:w="110"/>
-              <w:bottom w:type="dxa" w:w="50"/>
-              <w:right w:type="dxa" w:w="110"/>
-            </w:tcMar>
-          </w:tcPr>
-          <w:p>
-            <w:r>
-              <w:rPr>
-                <w:rFonts w:ascii="Consolas" w:cs="Consolas" w:eastAsia="Consolas" w:hAnsi="Consolas"/>
+            <w:shd w:fill="FFFFFF" w:val="clear"/>
+            <w:tcMar>
+              <w:top w:type="dxa" w:w="50"/>
+              <w:left w:type="dxa" w:w="110"/>
+              <w:bottom w:type="dxa" w:w="50"/>
+              <w:right w:type="dxa" w:w="110"/>
+            </w:tcMar>
+          </w:tcPr>
+          <w:p>
+            <w:r>
+              <w:rPr>
+                <w:rFonts w:ascii="Calibri" w:cs="Calibri" w:eastAsia="Calibri" w:hAnsi="Calibri"/>
                 <w:b/>
                 <w:bCs/>
                 <w:color w:val="B4442E"/>
-                <w:sz w:val="17"/>
-                <w:szCs w:val="17"/>
-                <w:shd w:fill="F7E6E1" w:val="clear"/>
-              </w:rPr>
-              <w:t xml:space="preserve"> Retired </w:t>
+                <w:sz w:val="18"/>
+                <w:szCs w:val="18"/>
+              </w:rPr>
+              <w:t xml:space="preserve">Deferred</w:t>
             </w:r>
           </w:p>
         </w:tc>
@@ -2929,7 +2808,7 @@
         <w:tc>
           <w:tcPr>
             <w:tcW w:type="dxa" w:w="5400"/>
-            <w:shd w:fill="FFFFFF" w:val="clear"/>
+            <w:shd w:fill="F4F7F5" w:val="clear"/>
             <w:tcMar>
               <w:top w:type="dxa" w:w="50"/>
               <w:left w:type="dxa" w:w="110"/>
@@ -2945,14 +2824,14 @@
                 <w:sz w:val="21"/>
                 <w:szCs w:val="21"/>
               </w:rPr>
-              <w:t xml:space="preserve">AI-05 Churn scoring engine</w:t>
+              <w:t xml:space="preserve">GPS check-in + notification pipeline (&lt;60s NRI alert)</w:t>
             </w:r>
           </w:p>
         </w:tc>
         <w:tc>
           <w:tcPr>
             <w:tcW w:type="dxa" w:w="1900"/>
-            <w:shd w:fill="FFFFFF" w:val="clear"/>
+            <w:shd w:fill="F4F7F5" w:val="clear"/>
             <w:tcMar>
               <w:top w:type="dxa" w:w="50"/>
               <w:left w:type="dxa" w:w="110"/>
@@ -2968,33 +2847,32 @@
                 <w:sz w:val="18"/>
                 <w:szCs w:val="18"/>
               </w:rPr>
-              <w:t xml:space="preserve">AI-05</w:t>
+              <w:t xml:space="preserve">FR-08-02</w:t>
             </w:r>
           </w:p>
         </w:tc>
         <w:tc>
           <w:tcPr>
             <w:tcW w:type="dxa" w:w="2060"/>
-            <w:shd w:fill="FFFFFF" w:val="clear"/>
-            <w:tcMar>
-              <w:top w:type="dxa" w:w="50"/>
-              <w:left w:type="dxa" w:w="110"/>
-              <w:bottom w:type="dxa" w:w="50"/>
-              <w:right w:type="dxa" w:w="110"/>
-            </w:tcMar>
-          </w:tcPr>
-          <w:p>
-            <w:r>
-              <w:rPr>
-                <w:rFonts w:ascii="Consolas" w:cs="Consolas" w:eastAsia="Consolas" w:hAnsi="Consolas"/>
+            <w:shd w:fill="F4F7F5" w:val="clear"/>
+            <w:tcMar>
+              <w:top w:type="dxa" w:w="50"/>
+              <w:left w:type="dxa" w:w="110"/>
+              <w:bottom w:type="dxa" w:w="50"/>
+              <w:right w:type="dxa" w:w="110"/>
+            </w:tcMar>
+          </w:tcPr>
+          <w:p>
+            <w:r>
+              <w:rPr>
+                <w:rFonts w:ascii="Calibri" w:cs="Calibri" w:eastAsia="Calibri" w:hAnsi="Calibri"/>
                 <w:b/>
                 <w:bCs/>
                 <w:color w:val="B4442E"/>
-                <w:sz w:val="17"/>
-                <w:szCs w:val="17"/>
-                <w:shd w:fill="F7E6E1" w:val="clear"/>
-              </w:rPr>
-              <w:t xml:space="preserve"> Deferred </w:t>
+                <w:sz w:val="18"/>
+                <w:szCs w:val="18"/>
+              </w:rPr>
+              <w:t xml:space="preserve">Deferred</w:t>
             </w:r>
           </w:p>
         </w:tc>
@@ -3003,7 +2881,7 @@
         <w:tc>
           <w:tcPr>
             <w:tcW w:type="dxa" w:w="5400"/>
-            <w:shd w:fill="F4F7F5" w:val="clear"/>
+            <w:shd w:fill="FFFFFF" w:val="clear"/>
             <w:tcMar>
               <w:top w:type="dxa" w:w="50"/>
               <w:left w:type="dxa" w:w="110"/>
@@ -3019,14 +2897,14 @@
                 <w:sz w:val="21"/>
                 <w:szCs w:val="21"/>
               </w:rPr>
-              <w:t xml:space="preserve">Payments — Razorpay / Stripe, subscriptions, payouts</w:t>
+              <w:t xml:space="preserve">Real eKYC / police (UIDAI) — ops approves manually today</w:t>
             </w:r>
           </w:p>
         </w:tc>
         <w:tc>
           <w:tcPr>
             <w:tcW w:type="dxa" w:w="1900"/>
-            <w:shd w:fill="F4F7F5" w:val="clear"/>
+            <w:shd w:fill="FFFFFF" w:val="clear"/>
             <w:tcMar>
               <w:top w:type="dxa" w:w="50"/>
               <w:left w:type="dxa" w:w="110"/>
@@ -3042,33 +2920,32 @@
                 <w:sz w:val="18"/>
                 <w:szCs w:val="18"/>
               </w:rPr>
-              <w:t xml:space="preserve">Data model</w:t>
+              <w:t xml:space="preserve">FR-09-05</w:t>
             </w:r>
           </w:p>
         </w:tc>
         <w:tc>
           <w:tcPr>
             <w:tcW w:type="dxa" w:w="2060"/>
-            <w:shd w:fill="F4F7F5" w:val="clear"/>
-            <w:tcMar>
-              <w:top w:type="dxa" w:w="50"/>
-              <w:left w:type="dxa" w:w="110"/>
-              <w:bottom w:type="dxa" w:w="50"/>
-              <w:right w:type="dxa" w:w="110"/>
-            </w:tcMar>
-          </w:tcPr>
-          <w:p>
-            <w:r>
-              <w:rPr>
-                <w:rFonts w:ascii="Consolas" w:cs="Consolas" w:eastAsia="Consolas" w:hAnsi="Consolas"/>
+            <w:shd w:fill="FFFFFF" w:val="clear"/>
+            <w:tcMar>
+              <w:top w:type="dxa" w:w="50"/>
+              <w:left w:type="dxa" w:w="110"/>
+              <w:bottom w:type="dxa" w:w="50"/>
+              <w:right w:type="dxa" w:w="110"/>
+            </w:tcMar>
+          </w:tcPr>
+          <w:p>
+            <w:r>
+              <w:rPr>
+                <w:rFonts w:ascii="Calibri" w:cs="Calibri" w:eastAsia="Calibri" w:hAnsi="Calibri"/>
                 <w:b/>
                 <w:bCs/>
                 <w:color w:val="B4442E"/>
-                <w:sz w:val="17"/>
-                <w:szCs w:val="17"/>
-                <w:shd w:fill="F7E6E1" w:val="clear"/>
-              </w:rPr>
-              <w:t xml:space="preserve"> Deferred </w:t>
+                <w:sz w:val="18"/>
+                <w:szCs w:val="18"/>
+              </w:rPr>
+              <w:t xml:space="preserve">Deferred</w:t>
             </w:r>
           </w:p>
         </w:tc>
@@ -3077,7 +2954,7 @@
         <w:tc>
           <w:tcPr>
             <w:tcW w:type="dxa" w:w="5400"/>
-            <w:shd w:fill="FFFFFF" w:val="clear"/>
+            <w:shd w:fill="F4F7F5" w:val="clear"/>
             <w:tcMar>
               <w:top w:type="dxa" w:w="50"/>
               <w:left w:type="dxa" w:w="110"/>
@@ -3093,14 +2970,14 @@
                 <w:sz w:val="21"/>
                 <w:szCs w:val="21"/>
               </w:rPr>
-              <w:t xml:space="preserve">GPS check-in + notification pipeline (&lt;60s NRI alert)</w:t>
+              <w:t xml:space="preserve">Real SMS / email OTP delivery (DLT, SMTP)</w:t>
             </w:r>
           </w:p>
         </w:tc>
         <w:tc>
           <w:tcPr>
             <w:tcW w:type="dxa" w:w="1900"/>
-            <w:shd w:fill="FFFFFF" w:val="clear"/>
+            <w:shd w:fill="F4F7F5" w:val="clear"/>
             <w:tcMar>
               <w:top w:type="dxa" w:w="50"/>
               <w:left w:type="dxa" w:w="110"/>
@@ -3116,33 +2993,32 @@
                 <w:sz w:val="18"/>
                 <w:szCs w:val="18"/>
               </w:rPr>
-              <w:t xml:space="preserve">FR-08-02</w:t>
+              <w:t xml:space="preserve">FR-09-02</w:t>
             </w:r>
           </w:p>
         </w:tc>
         <w:tc>
           <w:tcPr>
             <w:tcW w:type="dxa" w:w="2060"/>
-            <w:shd w:fill="FFFFFF" w:val="clear"/>
-            <w:tcMar>
-              <w:top w:type="dxa" w:w="50"/>
-              <w:left w:type="dxa" w:w="110"/>
-              <w:bottom w:type="dxa" w:w="50"/>
-              <w:right w:type="dxa" w:w="110"/>
-            </w:tcMar>
-          </w:tcPr>
-          <w:p>
-            <w:r>
-              <w:rPr>
-                <w:rFonts w:ascii="Consolas" w:cs="Consolas" w:eastAsia="Consolas" w:hAnsi="Consolas"/>
+            <w:shd w:fill="F4F7F5" w:val="clear"/>
+            <w:tcMar>
+              <w:top w:type="dxa" w:w="50"/>
+              <w:left w:type="dxa" w:w="110"/>
+              <w:bottom w:type="dxa" w:w="50"/>
+              <w:right w:type="dxa" w:w="110"/>
+            </w:tcMar>
+          </w:tcPr>
+          <w:p>
+            <w:r>
+              <w:rPr>
+                <w:rFonts w:ascii="Calibri" w:cs="Calibri" w:eastAsia="Calibri" w:hAnsi="Calibri"/>
                 <w:b/>
                 <w:bCs/>
                 <w:color w:val="B4442E"/>
-                <w:sz w:val="17"/>
-                <w:szCs w:val="17"/>
-                <w:shd w:fill="F7E6E1" w:val="clear"/>
-              </w:rPr>
-              <w:t xml:space="preserve"> Deferred </w:t>
+                <w:sz w:val="18"/>
+                <w:szCs w:val="18"/>
+              </w:rPr>
+              <w:t xml:space="preserve">Deferred</w:t>
             </w:r>
           </w:p>
         </w:tc>
@@ -3151,7 +3027,7 @@
         <w:tc>
           <w:tcPr>
             <w:tcW w:type="dxa" w:w="5400"/>
-            <w:shd w:fill="F4F7F5" w:val="clear"/>
+            <w:shd w:fill="FFFFFF" w:val="clear"/>
             <w:tcMar>
               <w:top w:type="dxa" w:w="50"/>
               <w:left w:type="dxa" w:w="110"/>
@@ -3167,14 +3043,14 @@
                 <w:sz w:val="21"/>
                 <w:szCs w:val="21"/>
               </w:rPr>
-              <w:t xml:space="preserve">Real eKYC / police (UIDAI) — ops approves manually today</w:t>
+              <w:t xml:space="preserve">Skill Academy, certifications, availability, service areas</w:t>
             </w:r>
           </w:p>
         </w:tc>
         <w:tc>
           <w:tcPr>
             <w:tcW w:type="dxa" w:w="1900"/>
-            <w:shd w:fill="F4F7F5" w:val="clear"/>
+            <w:shd w:fill="FFFFFF" w:val="clear"/>
             <w:tcMar>
               <w:top w:type="dxa" w:w="50"/>
               <w:left w:type="dxa" w:w="110"/>
@@ -3190,33 +3066,32 @@
                 <w:sz w:val="18"/>
                 <w:szCs w:val="18"/>
               </w:rPr>
-              <w:t xml:space="preserve">FR-09-05</w:t>
+              <w:t xml:space="preserve">FR-05-07</w:t>
             </w:r>
           </w:p>
         </w:tc>
         <w:tc>
           <w:tcPr>
             <w:tcW w:type="dxa" w:w="2060"/>
-            <w:shd w:fill="F4F7F5" w:val="clear"/>
-            <w:tcMar>
-              <w:top w:type="dxa" w:w="50"/>
-              <w:left w:type="dxa" w:w="110"/>
-              <w:bottom w:type="dxa" w:w="50"/>
-              <w:right w:type="dxa" w:w="110"/>
-            </w:tcMar>
-          </w:tcPr>
-          <w:p>
-            <w:r>
-              <w:rPr>
-                <w:rFonts w:ascii="Consolas" w:cs="Consolas" w:eastAsia="Consolas" w:hAnsi="Consolas"/>
+            <w:shd w:fill="FFFFFF" w:val="clear"/>
+            <w:tcMar>
+              <w:top w:type="dxa" w:w="50"/>
+              <w:left w:type="dxa" w:w="110"/>
+              <w:bottom w:type="dxa" w:w="50"/>
+              <w:right w:type="dxa" w:w="110"/>
+            </w:tcMar>
+          </w:tcPr>
+          <w:p>
+            <w:r>
+              <w:rPr>
+                <w:rFonts w:ascii="Calibri" w:cs="Calibri" w:eastAsia="Calibri" w:hAnsi="Calibri"/>
                 <w:b/>
                 <w:bCs/>
                 <w:color w:val="B4442E"/>
-                <w:sz w:val="17"/>
-                <w:szCs w:val="17"/>
-                <w:shd w:fill="F7E6E1" w:val="clear"/>
-              </w:rPr>
-              <w:t xml:space="preserve"> Deferred </w:t>
+                <w:sz w:val="18"/>
+                <w:szCs w:val="18"/>
+              </w:rPr>
+              <w:t xml:space="preserve">Deferred</w:t>
             </w:r>
           </w:p>
         </w:tc>
@@ -3225,7 +3100,7 @@
         <w:tc>
           <w:tcPr>
             <w:tcW w:type="dxa" w:w="5400"/>
-            <w:shd w:fill="FFFFFF" w:val="clear"/>
+            <w:shd w:fill="F4F7F5" w:val="clear"/>
             <w:tcMar>
               <w:top w:type="dxa" w:w="50"/>
               <w:left w:type="dxa" w:w="110"/>
@@ -3241,14 +3116,14 @@
                 <w:sz w:val="21"/>
                 <w:szCs w:val="21"/>
               </w:rPr>
-              <w:t xml:space="preserve">Real SMS / email OTP delivery (DLT, SMTP)</w:t>
+              <w:t xml:space="preserve">Ops analytics dashboard (NSM, SLA, churn queue, map)</w:t>
             </w:r>
           </w:p>
         </w:tc>
         <w:tc>
           <w:tcPr>
             <w:tcW w:type="dxa" w:w="1900"/>
-            <w:shd w:fill="FFFFFF" w:val="clear"/>
+            <w:shd w:fill="F4F7F5" w:val="clear"/>
             <w:tcMar>
               <w:top w:type="dxa" w:w="50"/>
               <w:left w:type="dxa" w:w="110"/>
@@ -3264,33 +3139,32 @@
                 <w:sz w:val="18"/>
                 <w:szCs w:val="18"/>
               </w:rPr>
-              <w:t xml:space="preserve">FR-09-02</w:t>
+              <w:t xml:space="preserve">Design §08</w:t>
             </w:r>
           </w:p>
         </w:tc>
         <w:tc>
           <w:tcPr>
             <w:tcW w:type="dxa" w:w="2060"/>
-            <w:shd w:fill="FFFFFF" w:val="clear"/>
-            <w:tcMar>
-              <w:top w:type="dxa" w:w="50"/>
-              <w:left w:type="dxa" w:w="110"/>
-              <w:bottom w:type="dxa" w:w="50"/>
-              <w:right w:type="dxa" w:w="110"/>
-            </w:tcMar>
-          </w:tcPr>
-          <w:p>
-            <w:r>
-              <w:rPr>
-                <w:rFonts w:ascii="Consolas" w:cs="Consolas" w:eastAsia="Consolas" w:hAnsi="Consolas"/>
+            <w:shd w:fill="F4F7F5" w:val="clear"/>
+            <w:tcMar>
+              <w:top w:type="dxa" w:w="50"/>
+              <w:left w:type="dxa" w:w="110"/>
+              <w:bottom w:type="dxa" w:w="50"/>
+              <w:right w:type="dxa" w:w="110"/>
+            </w:tcMar>
+          </w:tcPr>
+          <w:p>
+            <w:r>
+              <w:rPr>
+                <w:rFonts w:ascii="Calibri" w:cs="Calibri" w:eastAsia="Calibri" w:hAnsi="Calibri"/>
                 <w:b/>
                 <w:bCs/>
                 <w:color w:val="B4442E"/>
-                <w:sz w:val="17"/>
-                <w:szCs w:val="17"/>
-                <w:shd w:fill="F7E6E1" w:val="clear"/>
-              </w:rPr>
-              <w:t xml:space="preserve"> Deferred </w:t>
+                <w:sz w:val="18"/>
+                <w:szCs w:val="18"/>
+              </w:rPr>
+              <w:t xml:space="preserve">Deferred</w:t>
             </w:r>
           </w:p>
         </w:tc>
@@ -3299,7 +3173,7 @@
         <w:tc>
           <w:tcPr>
             <w:tcW w:type="dxa" w:w="5400"/>
-            <w:shd w:fill="F4F7F5" w:val="clear"/>
+            <w:shd w:fill="FFFFFF" w:val="clear"/>
             <w:tcMar>
               <w:top w:type="dxa" w:w="50"/>
               <w:left w:type="dxa" w:w="110"/>
@@ -3315,14 +3189,14 @@
                 <w:sz w:val="21"/>
                 <w:szCs w:val="21"/>
               </w:rPr>
-              <w:t xml:space="preserve">Skill Academy, certifications, availability, service areas</w:t>
+              <w:t xml:space="preserve">Home Manager chat · weekly digest · WhatsApp</w:t>
             </w:r>
           </w:p>
         </w:tc>
         <w:tc>
           <w:tcPr>
             <w:tcW w:type="dxa" w:w="1900"/>
-            <w:shd w:fill="F4F7F5" w:val="clear"/>
+            <w:shd w:fill="FFFFFF" w:val="clear"/>
             <w:tcMar>
               <w:top w:type="dxa" w:w="50"/>
               <w:left w:type="dxa" w:w="110"/>
@@ -3338,181 +3212,32 @@
                 <w:sz w:val="18"/>
                 <w:szCs w:val="18"/>
               </w:rPr>
-              <w:t xml:space="preserve">FR-05-07</w:t>
+              <w:t xml:space="preserve">FR-08-04/07</w:t>
             </w:r>
           </w:p>
         </w:tc>
         <w:tc>
           <w:tcPr>
             <w:tcW w:type="dxa" w:w="2060"/>
-            <w:shd w:fill="F4F7F5" w:val="clear"/>
-            <w:tcMar>
-              <w:top w:type="dxa" w:w="50"/>
-              <w:left w:type="dxa" w:w="110"/>
-              <w:bottom w:type="dxa" w:w="50"/>
-              <w:right w:type="dxa" w:w="110"/>
-            </w:tcMar>
-          </w:tcPr>
-          <w:p>
-            <w:r>
-              <w:rPr>
-                <w:rFonts w:ascii="Consolas" w:cs="Consolas" w:eastAsia="Consolas" w:hAnsi="Consolas"/>
+            <w:shd w:fill="FFFFFF" w:val="clear"/>
+            <w:tcMar>
+              <w:top w:type="dxa" w:w="50"/>
+              <w:left w:type="dxa" w:w="110"/>
+              <w:bottom w:type="dxa" w:w="50"/>
+              <w:right w:type="dxa" w:w="110"/>
+            </w:tcMar>
+          </w:tcPr>
+          <w:p>
+            <w:r>
+              <w:rPr>
+                <w:rFonts w:ascii="Calibri" w:cs="Calibri" w:eastAsia="Calibri" w:hAnsi="Calibri"/>
                 <w:b/>
                 <w:bCs/>
                 <w:color w:val="B4442E"/>
-                <w:sz w:val="17"/>
-                <w:szCs w:val="17"/>
-                <w:shd w:fill="F7E6E1" w:val="clear"/>
-              </w:rPr>
-              <w:t xml:space="preserve"> Deferred </w:t>
-            </w:r>
-          </w:p>
-        </w:tc>
-      </w:tr>
-      <w:tr>
-        <w:tc>
-          <w:tcPr>
-            <w:tcW w:type="dxa" w:w="5400"/>
-            <w:shd w:fill="FFFFFF" w:val="clear"/>
-            <w:tcMar>
-              <w:top w:type="dxa" w:w="50"/>
-              <w:left w:type="dxa" w:w="110"/>
-              <w:bottom w:type="dxa" w:w="50"/>
-              <w:right w:type="dxa" w:w="110"/>
-            </w:tcMar>
-          </w:tcPr>
-          <w:p>
-            <w:r>
-              <w:rPr>
-                <w:rFonts w:ascii="Calibri" w:cs="Calibri" w:eastAsia="Calibri" w:hAnsi="Calibri"/>
-                <w:color w:val="2B3A34"/>
-                <w:sz w:val="21"/>
-                <w:szCs w:val="21"/>
-              </w:rPr>
-              <w:t xml:space="preserve">Ops analytics dashboard (NSM, SLA, churn queue, map)</w:t>
-            </w:r>
-          </w:p>
-        </w:tc>
-        <w:tc>
-          <w:tcPr>
-            <w:tcW w:type="dxa" w:w="1900"/>
-            <w:shd w:fill="FFFFFF" w:val="clear"/>
-            <w:tcMar>
-              <w:top w:type="dxa" w:w="50"/>
-              <w:left w:type="dxa" w:w="110"/>
-              <w:bottom w:type="dxa" w:w="50"/>
-              <w:right w:type="dxa" w:w="110"/>
-            </w:tcMar>
-          </w:tcPr>
-          <w:p>
-            <w:r>
-              <w:rPr>
-                <w:rFonts w:ascii="Consolas" w:cs="Consolas" w:eastAsia="Consolas" w:hAnsi="Consolas"/>
-                <w:color w:val="5F6F68"/>
-                <w:sz w:val="18"/>
-                <w:szCs w:val="18"/>
-              </w:rPr>
-              <w:t xml:space="preserve">Design §08</w:t>
-            </w:r>
-          </w:p>
-        </w:tc>
-        <w:tc>
-          <w:tcPr>
-            <w:tcW w:type="dxa" w:w="2060"/>
-            <w:shd w:fill="FFFFFF" w:val="clear"/>
-            <w:tcMar>
-              <w:top w:type="dxa" w:w="50"/>
-              <w:left w:type="dxa" w:w="110"/>
-              <w:bottom w:type="dxa" w:w="50"/>
-              <w:right w:type="dxa" w:w="110"/>
-            </w:tcMar>
-          </w:tcPr>
-          <w:p>
-            <w:r>
-              <w:rPr>
-                <w:rFonts w:ascii="Consolas" w:cs="Consolas" w:eastAsia="Consolas" w:hAnsi="Consolas"/>
-                <w:b/>
-                <w:bCs/>
-                <w:color w:val="B4442E"/>
-                <w:sz w:val="17"/>
-                <w:szCs w:val="17"/>
-                <w:shd w:fill="F7E6E1" w:val="clear"/>
-              </w:rPr>
-              <w:t xml:space="preserve"> Deferred </w:t>
-            </w:r>
-          </w:p>
-        </w:tc>
-      </w:tr>
-      <w:tr>
-        <w:tc>
-          <w:tcPr>
-            <w:tcW w:type="dxa" w:w="5400"/>
-            <w:shd w:fill="F4F7F5" w:val="clear"/>
-            <w:tcMar>
-              <w:top w:type="dxa" w:w="50"/>
-              <w:left w:type="dxa" w:w="110"/>
-              <w:bottom w:type="dxa" w:w="50"/>
-              <w:right w:type="dxa" w:w="110"/>
-            </w:tcMar>
-          </w:tcPr>
-          <w:p>
-            <w:r>
-              <w:rPr>
-                <w:rFonts w:ascii="Calibri" w:cs="Calibri" w:eastAsia="Calibri" w:hAnsi="Calibri"/>
-                <w:color w:val="2B3A34"/>
-                <w:sz w:val="21"/>
-                <w:szCs w:val="21"/>
-              </w:rPr>
-              <w:t xml:space="preserve">Home Manager chat · weekly digest · WhatsApp</w:t>
-            </w:r>
-          </w:p>
-        </w:tc>
-        <w:tc>
-          <w:tcPr>
-            <w:tcW w:type="dxa" w:w="1900"/>
-            <w:shd w:fill="F4F7F5" w:val="clear"/>
-            <w:tcMar>
-              <w:top w:type="dxa" w:w="50"/>
-              <w:left w:type="dxa" w:w="110"/>
-              <w:bottom w:type="dxa" w:w="50"/>
-              <w:right w:type="dxa" w:w="110"/>
-            </w:tcMar>
-          </w:tcPr>
-          <w:p>
-            <w:r>
-              <w:rPr>
-                <w:rFonts w:ascii="Consolas" w:cs="Consolas" w:eastAsia="Consolas" w:hAnsi="Consolas"/>
-                <w:color w:val="5F6F68"/>
-                <w:sz w:val="18"/>
-                <w:szCs w:val="18"/>
-              </w:rPr>
-              <w:t xml:space="preserve">FR-08-04/07</w:t>
-            </w:r>
-          </w:p>
-        </w:tc>
-        <w:tc>
-          <w:tcPr>
-            <w:tcW w:type="dxa" w:w="2060"/>
-            <w:shd w:fill="F4F7F5" w:val="clear"/>
-            <w:tcMar>
-              <w:top w:type="dxa" w:w="50"/>
-              <w:left w:type="dxa" w:w="110"/>
-              <w:bottom w:type="dxa" w:w="50"/>
-              <w:right w:type="dxa" w:w="110"/>
-            </w:tcMar>
-          </w:tcPr>
-          <w:p>
-            <w:r>
-              <w:rPr>
-                <w:rFonts w:ascii="Consolas" w:cs="Consolas" w:eastAsia="Consolas" w:hAnsi="Consolas"/>
-                <w:b/>
-                <w:bCs/>
-                <w:color w:val="B4442E"/>
-                <w:sz w:val="17"/>
-                <w:szCs w:val="17"/>
-                <w:shd w:fill="F7E6E1" w:val="clear"/>
-              </w:rPr>
-              <w:t xml:space="preserve"> Deferred </w:t>
+                <w:sz w:val="18"/>
+                <w:szCs w:val="18"/>
+              </w:rPr>
+              <w:t xml:space="preserve">Deferred</w:t>
             </w:r>
           </w:p>
         </w:tc>
@@ -3520,11 +3245,6 @@
     </w:tbl>
     <w:p>
       <w:pPr>
-        <w:spacing w:after="40"/>
-      </w:pPr>
-    </w:p>
-    <w:p>
-      <w:pPr>
         <w:spacing w:after="120" w:line="276"/>
       </w:pPr>
       <w:r>
@@ -3545,7 +3265,98 @@
           <w:sz w:val="21"/>
           <w:szCs w:val="21"/>
         </w:rPr>
-        <w:t xml:space="preserve">The prototype showed every row above as if it were done. The value here is the split: the </w:t>
+        <w:t xml:space="preserve">The prototype showed every row above as if it were done. The value here is the split: the transactional spine of all four contexts is </w:t>
+      </w:r>
+      <w:r>
+        <w:rPr>
+          <w:rFonts w:ascii="Calibri" w:cs="Calibri" w:eastAsia="Calibri" w:hAnsi="Calibri"/>
+          <w:b/>
+          <w:bCs/>
+          <w:color w:val="1E8A5A"/>
+          <w:sz w:val="21"/>
+          <w:szCs w:val="21"/>
+        </w:rPr>
+        <w:t xml:space="preserve">Live</w:t>
+      </w:r>
+      <w:r>
+        <w:rPr>
+          <w:rFonts w:ascii="Calibri" w:cs="Calibri" w:eastAsia="Calibri" w:hAnsi="Calibri"/>
+          <w:color w:val="2B3A34"/>
+          <w:sz w:val="21"/>
+          <w:szCs w:val="21"/>
+        </w:rPr>
+        <w:t xml:space="preserve"> on a real backend; the first AI capability — no-show prediction + escalation — is now </w:t>
+      </w:r>
+      <w:r>
+        <w:rPr>
+          <w:rFonts w:ascii="Calibri" w:cs="Calibri" w:eastAsia="Calibri" w:hAnsi="Calibri"/>
+          <w:b/>
+          <w:bCs/>
+          <w:color w:val="1E8A5A"/>
+          <w:sz w:val="21"/>
+          <w:szCs w:val="21"/>
+        </w:rPr>
+        <w:t xml:space="preserve">Live</w:t>
+      </w:r>
+      <w:r>
+        <w:rPr>
+          <w:rFonts w:ascii="Calibri" w:cs="Calibri" w:eastAsia="Calibri" w:hAnsi="Calibri"/>
+          <w:color w:val="2B3A34"/>
+          <w:sz w:val="21"/>
+          <w:szCs w:val="21"/>
+        </w:rPr>
+        <w:t xml:space="preserve"> as a heuristic; the remaining AI, payments and notification layers are honestly </w:t>
+      </w:r>
+      <w:r>
+        <w:rPr>
+          <w:rFonts w:ascii="Calibri" w:cs="Calibri" w:eastAsia="Calibri" w:hAnsi="Calibri"/>
+          <w:b/>
+          <w:bCs/>
+          <w:color w:val="B4442E"/>
+          <w:sz w:val="21"/>
+          <w:szCs w:val="21"/>
+        </w:rPr>
+        <w:t xml:space="preserve">Not built</w:t>
+      </w:r>
+      <w:r>
+        <w:rPr>
+          <w:rFonts w:ascii="Calibri" w:cs="Calibri" w:eastAsia="Calibri" w:hAnsi="Calibri"/>
+          <w:color w:val="2B3A34"/>
+          <w:sz w:val="21"/>
+          <w:szCs w:val="21"/>
+        </w:rPr>
+        <w:t xml:space="preserve">; and a handful of screens are Front-end shells awaiting their data. Each deferral is a sequenced decision (see the delivery plan), not an oversight.</w:t>
+      </w:r>
+    </w:p>
+    <w:p>
+      <w:pPr>
+        <w:pStyle w:val="Heading3"/>
+        <w:spacing w:after="60" w:before="240"/>
+      </w:pPr>
+      <w:r>
+        <w:rPr>
+          <w:rFonts w:ascii="Calibri" w:cs="Calibri" w:eastAsia="Calibri" w:hAnsi="Calibri"/>
+          <w:b/>
+          <w:bCs/>
+          <w:color w:val="0F6E56"/>
+          <w:sz w:val="21"/>
+          <w:szCs w:val="21"/>
+        </w:rPr>
+        <w:t xml:space="preserve">Spotlight — the no-show loop, now live</w:t>
+      </w:r>
+    </w:p>
+    <w:p>
+      <w:pPr>
+        <w:spacing w:after="120" w:line="276"/>
+      </w:pPr>
+      <w:r>
+        <w:rPr>
+          <w:rFonts w:ascii="Calibri" w:cs="Calibri" w:eastAsia="Calibri" w:hAnsi="Calibri"/>
+          <w:color w:val="2B3A34"/>
+          <w:sz w:val="21"/>
+          <w:szCs w:val="21"/>
+        </w:rPr>
+        <w:t xml:space="preserve">The first AI capability is real. Every booking is scored </w:t>
       </w:r>
       <w:r>
         <w:rPr>
@@ -3556,16 +3367,84 @@
           <w:sz w:val="21"/>
           <w:szCs w:val="21"/>
         </w:rPr>
-        <w:t xml:space="preserve">transactional spine</w:t>
-      </w:r>
-      <w:r>
-        <w:rPr>
-          <w:rFonts w:ascii="Calibri" w:cs="Calibri" w:eastAsia="Calibri" w:hAnsi="Calibri"/>
-          <w:color w:val="2B3A34"/>
-          <w:sz w:val="21"/>
-          <w:szCs w:val="21"/>
-        </w:rPr>
-        <w:t xml:space="preserve"> of all four contexts is Live on a real backend; the </w:t>
+        <w:t xml:space="preserve">in the database at insert</w:t>
+      </w:r>
+      <w:r>
+        <w:rPr>
+          <w:rFonts w:ascii="Calibri" w:cs="Calibri" w:eastAsia="Calibri" w:hAnsi="Calibri"/>
+          <w:color w:val="2B3A34"/>
+          <w:sz w:val="21"/>
+          <w:szCs w:val="21"/>
+        </w:rPr>
+        <w:t xml:space="preserve"> from the worker's actual reliability and track record, the slot's imminence and weekday/weekend — a transparent heuristic, not a trained model (there is no booking history to learn from yet). When risk is high, </w:t>
+      </w:r>
+      <w:r>
+        <w:rPr>
+          <w:rFonts w:ascii="Consolas" w:cs="Consolas" w:eastAsia="Consolas" w:hAnsi="Consolas"/>
+          <w:color w:val="0E3D33"/>
+          <w:sz w:val="18"/>
+          <w:szCs w:val="18"/>
+        </w:rPr>
+        <w:t xml:space="preserve">arrange_backup()</w:t>
+      </w:r>
+      <w:r>
+        <w:rPr>
+          <w:rFonts w:ascii="Calibri" w:cs="Calibri" w:eastAsia="Calibri" w:hAnsi="Calibri"/>
+          <w:color w:val="2B3A34"/>
+          <w:sz w:val="21"/>
+          <w:szCs w:val="21"/>
+        </w:rPr>
+        <w:t xml:space="preserve"> reserves a genuinely free second worker; at the slot, </w:t>
+      </w:r>
+      <w:r>
+        <w:rPr>
+          <w:rFonts w:ascii="Consolas" w:cs="Consolas" w:eastAsia="Consolas" w:hAnsi="Consolas"/>
+          <w:color w:val="0E3D33"/>
+          <w:sz w:val="18"/>
+          <w:szCs w:val="18"/>
+        </w:rPr>
+        <w:t xml:space="preserve">resolve_no_show()</w:t>
+      </w:r>
+      <w:r>
+        <w:rPr>
+          <w:rFonts w:ascii="Calibri" w:cs="Calibri" w:eastAsia="Calibri" w:hAnsi="Calibri"/>
+          <w:color w:val="2B3A34"/>
+          <w:sz w:val="21"/>
+          <w:szCs w:val="21"/>
+        </w:rPr>
+        <w:t xml:space="preserve"> releases that standby on a check-in or promotes it on a no-show (the booking flips to </w:t>
+      </w:r>
+      <w:r>
+        <w:rPr>
+          <w:rFonts w:ascii="Consolas" w:cs="Consolas" w:eastAsia="Consolas" w:hAnsi="Consolas"/>
+          <w:color w:val="0E3D33"/>
+          <w:sz w:val="18"/>
+          <w:szCs w:val="18"/>
+        </w:rPr>
+        <w:t xml:space="preserve">replaced</w:t>
+      </w:r>
+      <w:r>
+        <w:rPr>
+          <w:rFonts w:ascii="Calibri" w:cs="Calibri" w:eastAsia="Calibri" w:hAnsi="Calibri"/>
+          <w:color w:val="2B3A34"/>
+          <w:sz w:val="21"/>
+          <w:szCs w:val="21"/>
+        </w:rPr>
+        <w:t xml:space="preserve">).</w:t>
+      </w:r>
+    </w:p>
+    <w:p>
+      <w:pPr>
+        <w:spacing w:after="120" w:line="276"/>
+      </w:pPr>
+      <w:r>
+        <w:rPr>
+          <w:rFonts w:ascii="Calibri" w:cs="Calibri" w:eastAsia="Calibri" w:hAnsi="Calibri"/>
+          <w:color w:val="2B3A34"/>
+          <w:sz w:val="21"/>
+          <w:szCs w:val="21"/>
+        </w:rPr>
+        <w:t xml:space="preserve">Two things make it more than a demo. The live-worker trigger re-validates any promoted backup, so a no-show can never hand the home to an unverified worker. And every resolution writes a </w:t>
       </w:r>
       <w:r>
         <w:rPr>
@@ -3576,61 +3455,36 @@
           <w:sz w:val="21"/>
           <w:szCs w:val="21"/>
         </w:rPr>
-        <w:t xml:space="preserve">AI, payments and notification</w:t>
-      </w:r>
-      <w:r>
-        <w:rPr>
-          <w:rFonts w:ascii="Calibri" w:cs="Calibri" w:eastAsia="Calibri" w:hAnsi="Calibri"/>
-          <w:color w:val="2B3A34"/>
-          <w:sz w:val="21"/>
-          <w:szCs w:val="21"/>
-        </w:rPr>
-        <w:t xml:space="preserve"> layers are honestly Not built; and a handful of screens are Front-end shells awaiting their data. Each deferral is a sequenced decision (see the delivery plan), not an oversight.</w:t>
-      </w:r>
-    </w:p>
-    <w:p>
-      <w:pPr>
-        <w:pStyle w:val="Heading2"/>
-        <w:spacing w:after="100" w:before="320"/>
-      </w:pPr>
-      <w:r>
-        <w:rPr>
-          <w:rFonts w:ascii="Calibri" w:cs="Calibri" w:eastAsia="Calibri" w:hAnsi="Calibri"/>
-          <w:b/>
-          <w:bCs/>
-          <w:color w:val="B8860B"/>
-          <w:sz w:val="24"/>
-          <w:szCs w:val="24"/>
-        </w:rPr>
-        <w:t xml:space="preserve">04  </w:t>
-      </w:r>
-      <w:r>
-        <w:rPr>
-          <w:rFonts w:ascii="Calibri" w:cs="Calibri" w:eastAsia="Calibri" w:hAnsi="Calibri"/>
-          <w:b/>
-          <w:bCs/>
-          <w:color w:val="0E3D33"/>
-          <w:sz w:val="24"/>
-          <w:szCs w:val="24"/>
-        </w:rPr>
-        <w:t xml:space="preserve">Architecture at a glance</w:t>
-      </w:r>
-    </w:p>
-    <w:p>
-      <w:pPr>
-        <w:pStyle w:val="Heading3"/>
-        <w:spacing w:after="60" w:before="220"/>
-      </w:pPr>
-      <w:r>
-        <w:rPr>
-          <w:rFonts w:ascii="Calibri" w:cs="Calibri" w:eastAsia="Calibri" w:hAnsi="Calibri"/>
-          <w:b/>
-          <w:bCs/>
-          <w:color w:val="0F6E56"/>
-          <w:sz w:val="21"/>
-          <w:szCs w:val="21"/>
-        </w:rPr>
-        <w:t xml:space="preserve">Stack</w:t>
+        <w:t xml:space="preserve">ground-truth label</w:t>
+      </w:r>
+      <w:r>
+        <w:rPr>
+          <w:rFonts w:ascii="Calibri" w:cs="Calibri" w:eastAsia="Calibri" w:hAnsi="Calibri"/>
+          <w:color w:val="2B3A34"/>
+          <w:sz w:val="21"/>
+          <w:szCs w:val="21"/>
+        </w:rPr>
+        <w:t xml:space="preserve"> — so the loop quietly collects the dataset a trained model will later learn from. The full heuristic→model path — flow, contract and tech stack — is the companion document </w:t>
+      </w:r>
+      <w:r>
+        <w:rPr>
+          <w:rFonts w:ascii="Calibri" w:cs="Calibri" w:eastAsia="Calibri" w:hAnsi="Calibri"/>
+          <w:i/>
+          <w:iCs/>
+          <w:color w:val="2B3A34"/>
+          <w:sz w:val="21"/>
+          <w:szCs w:val="21"/>
+        </w:rPr>
+        <w:t xml:space="preserve">From heuristic to model</w:t>
+      </w:r>
+      <w:r>
+        <w:rPr>
+          <w:rFonts w:ascii="Calibri" w:cs="Calibri" w:eastAsia="Calibri" w:hAnsi="Calibri"/>
+          <w:color w:val="2B3A34"/>
+          <w:sz w:val="21"/>
+          <w:szCs w:val="21"/>
+        </w:rPr>
+        <w:t xml:space="preserve">.</w:t>
       </w:r>
     </w:p>
     <w:p>
@@ -3645,11 +3499,67 @@
       <w:r>
         <w:rPr>
           <w:rFonts w:ascii="Calibri" w:cs="Calibri" w:eastAsia="Calibri" w:hAnsi="Calibri"/>
-          <w:color w:val="2B3A34"/>
-          <w:sz w:val="21"/>
-          <w:szCs w:val="21"/>
-        </w:rPr>
-        <w:t xml:space="preserve">TanStack Start (React 19, SSR + server functions)</w:t>
+          <w:b/>
+          <w:bCs/>
+          <w:color w:val="12201C"/>
+          <w:sz w:val="21"/>
+          <w:szCs w:val="21"/>
+        </w:rPr>
+        <w:t xml:space="preserve">Proven live: </w:t>
+      </w:r>
+      <w:r>
+        <w:rPr>
+          <w:rFonts w:ascii="Calibri" w:cs="Calibri" w:eastAsia="Calibri" w:hAnsi="Calibri"/>
+          <w:color w:val="2B3A34"/>
+          <w:sz w:val="21"/>
+          <w:szCs w:val="21"/>
+        </w:rPr>
+        <w:t xml:space="preserve">Meena scored 5% (97% reliable), Anjali reserved as backup and promoted into the slot on a no-show — plus 8 dedicated tests for score, reservation and promotion.</w:t>
+      </w:r>
+    </w:p>
+    <w:p>
+      <w:pPr>
+        <w:pStyle w:val="Heading2"/>
+        <w:spacing w:after="100" w:before="340"/>
+      </w:pPr>
+      <w:r>
+        <w:rPr>
+          <w:rFonts w:ascii="Calibri" w:cs="Calibri" w:eastAsia="Calibri" w:hAnsi="Calibri"/>
+          <w:b/>
+          <w:bCs/>
+          <w:color w:val="B8860B"/>
+          <w:sz w:val="24"/>
+          <w:szCs w:val="24"/>
+        </w:rPr>
+        <w:t xml:space="preserve">04  </w:t>
+      </w:r>
+      <w:r>
+        <w:rPr>
+          <w:rFonts w:ascii="Calibri" w:cs="Calibri" w:eastAsia="Calibri" w:hAnsi="Calibri"/>
+          <w:b/>
+          <w:bCs/>
+          <w:color w:val="0E3D33"/>
+          <w:sz w:val="24"/>
+          <w:szCs w:val="24"/>
+        </w:rPr>
+        <w:t xml:space="preserve">Architecture at a glance</w:t>
+      </w:r>
+    </w:p>
+    <w:p>
+      <w:pPr>
+        <w:pStyle w:val="Heading3"/>
+        <w:spacing w:after="60" w:before="240"/>
+      </w:pPr>
+      <w:r>
+        <w:rPr>
+          <w:rFonts w:ascii="Calibri" w:cs="Calibri" w:eastAsia="Calibri" w:hAnsi="Calibri"/>
+          <w:b/>
+          <w:bCs/>
+          <w:color w:val="0F6E56"/>
+          <w:sz w:val="21"/>
+          <w:szCs w:val="21"/>
+        </w:rPr>
+        <w:t xml:space="preserve">Stack</w:t>
       </w:r>
     </w:p>
     <w:p>
@@ -3668,7 +3578,7 @@
           <w:sz w:val="21"/>
           <w:szCs w:val="21"/>
         </w:rPr>
-        <w:t xml:space="preserve">Supabase — Postgres + Auth, Mumbai region</w:t>
+        <w:t xml:space="preserve">TanStack Start (React 19, SSR + server functions)</w:t>
       </w:r>
     </w:p>
     <w:p>
@@ -3687,7 +3597,7 @@
           <w:sz w:val="21"/>
           <w:szCs w:val="21"/>
         </w:rPr>
-        <w:t xml:space="preserve">Tailwind + shadcn/ui, deployed on Cloudflare Workers</w:t>
+        <w:t xml:space="preserve">Supabase — Postgres + Auth, Mumbai region</w:t>
       </w:r>
     </w:p>
     <w:p>
@@ -3706,24 +3616,7 @@
           <w:sz w:val="21"/>
           <w:szCs w:val="21"/>
         </w:rPr>
-        <w:t xml:space="preserve">TypeScript end to end</w:t>
-      </w:r>
-    </w:p>
-    <w:p>
-      <w:pPr>
-        <w:pStyle w:val="Heading3"/>
-        <w:spacing w:after="60" w:before="220"/>
-      </w:pPr>
-      <w:r>
-        <w:rPr>
-          <w:rFonts w:ascii="Calibri" w:cs="Calibri" w:eastAsia="Calibri" w:hAnsi="Calibri"/>
-          <w:b/>
-          <w:bCs/>
-          <w:color w:val="0F6E56"/>
-          <w:sz w:val="21"/>
-          <w:szCs w:val="21"/>
-        </w:rPr>
-        <w:t xml:space="preserve">Security model — enforced in the database</w:t>
+        <w:t xml:space="preserve">Tailwind + shadcn/ui, deployed on Cloudflare Workers</w:t>
       </w:r>
     </w:p>
     <w:p>
@@ -3742,7 +3635,24 @@
           <w:sz w:val="21"/>
           <w:szCs w:val="21"/>
         </w:rPr>
-        <w:t xml:space="preserve">Row Level Security per bounded context</w:t>
+        <w:t xml:space="preserve">TypeScript end to end</w:t>
+      </w:r>
+    </w:p>
+    <w:p>
+      <w:pPr>
+        <w:pStyle w:val="Heading3"/>
+        <w:spacing w:after="60" w:before="240"/>
+      </w:pPr>
+      <w:r>
+        <w:rPr>
+          <w:rFonts w:ascii="Calibri" w:cs="Calibri" w:eastAsia="Calibri" w:hAnsi="Calibri"/>
+          <w:b/>
+          <w:bCs/>
+          <w:color w:val="0F6E56"/>
+          <w:sz w:val="21"/>
+          <w:szCs w:val="21"/>
+        </w:rPr>
+        <w:t xml:space="preserve">Security model — enforced in the database</w:t>
       </w:r>
     </w:p>
     <w:p>
@@ -3761,7 +3671,7 @@
           <w:sz w:val="21"/>
           <w:szCs w:val="21"/>
         </w:rPr>
-        <w:t xml:space="preserve">Roles assigned server-side, never client-writable</w:t>
+        <w:t xml:space="preserve">Row Level Security per bounded context</w:t>
       </w:r>
     </w:p>
     <w:p>
@@ -3780,7 +3690,7 @@
           <w:sz w:val="21"/>
           <w:szCs w:val="21"/>
         </w:rPr>
-        <w:t xml:space="preserve">Worker financials hidden from households by construction</w:t>
+        <w:t xml:space="preserve">Roles assigned server-side, never client-writable</w:t>
       </w:r>
     </w:p>
     <w:p>
@@ -3799,113 +3709,7 @@
           <w:sz w:val="21"/>
           <w:szCs w:val="21"/>
         </w:rPr>
-        <w:t xml:space="preserve">Ops / churn data unreachable from consumers</w:t>
-      </w:r>
-    </w:p>
-    <w:p>
-      <w:pPr>
-        <w:spacing w:after="120" w:line="276"/>
-      </w:pPr>
-      <w:r>
-        <w:rPr>
-          <w:rFonts w:ascii="Calibri" w:cs="Calibri" w:eastAsia="Calibri" w:hAnsi="Calibri"/>
-          <w:b/>
-          <w:bCs/>
-          <w:color w:val="12201C"/>
-          <w:sz w:val="21"/>
-          <w:szCs w:val="21"/>
-        </w:rPr>
-        <w:t xml:space="preserve">The core idea.  </w:t>
-      </w:r>
-      <w:r>
-        <w:rPr>
-          <w:rFonts w:ascii="Calibri" w:cs="Calibri" w:eastAsia="Calibri" w:hAnsi="Calibri"/>
-          <w:color w:val="2B3A34"/>
-          <w:sz w:val="21"/>
-          <w:szCs w:val="21"/>
-        </w:rPr>
-        <w:t xml:space="preserve">The prototype kept contexts apart in the UI (a </w:t>
-      </w:r>
-      <w:r>
-        <w:rPr>
-          <w:rFonts w:ascii="Consolas" w:cs="Consolas" w:eastAsia="Consolas" w:hAnsi="Consolas"/>
-          <w:color w:val="0E3D33"/>
-          <w:sz w:val="19"/>
-          <w:szCs w:val="19"/>
-          <w:shd w:fill="EEF3F1" w:val="clear"/>
-        </w:rPr>
-        <w:t xml:space="preserve">localStorage</w:t>
-      </w:r>
-      <w:r>
-        <w:rPr>
-          <w:rFonts w:ascii="Calibri" w:cs="Calibri" w:eastAsia="Calibri" w:hAnsi="Calibri"/>
-          <w:color w:val="2B3A34"/>
-          <w:sz w:val="21"/>
-          <w:szCs w:val="21"/>
-        </w:rPr>
-        <w:t xml:space="preserve"> role). Casai now keeps them apart </w:t>
-      </w:r>
-      <w:r>
-        <w:rPr>
-          <w:rFonts w:ascii="Calibri" w:cs="Calibri" w:eastAsia="Calibri" w:hAnsi="Calibri"/>
-          <w:b/>
-          <w:bCs/>
-          <w:color w:val="12201C"/>
-          <w:sz w:val="21"/>
-          <w:szCs w:val="21"/>
-        </w:rPr>
-        <w:t xml:space="preserve">in Postgres</w:t>
-      </w:r>
-      <w:r>
-        <w:rPr>
-          <w:rFonts w:ascii="Calibri" w:cs="Calibri" w:eastAsia="Calibri" w:hAnsi="Calibri"/>
-          <w:color w:val="2B3A34"/>
-          <w:sz w:val="21"/>
-          <w:szCs w:val="21"/>
-        </w:rPr>
-        <w:t xml:space="preserve"> — a tampered client changes nothing, because every read is filtered by RLS using a server-verified role. The UI is never what protects the data.</w:t>
-      </w:r>
-    </w:p>
-    <w:p>
-      <w:pPr>
-        <w:pStyle w:val="Heading2"/>
-        <w:spacing w:after="100" w:before="320"/>
-      </w:pPr>
-      <w:r>
-        <w:rPr>
-          <w:rFonts w:ascii="Calibri" w:cs="Calibri" w:eastAsia="Calibri" w:hAnsi="Calibri"/>
-          <w:b/>
-          <w:bCs/>
-          <w:color w:val="B8860B"/>
-          <w:sz w:val="24"/>
-          <w:szCs w:val="24"/>
-        </w:rPr>
-        <w:t xml:space="preserve">05  </w:t>
-      </w:r>
-      <w:r>
-        <w:rPr>
-          <w:rFonts w:ascii="Calibri" w:cs="Calibri" w:eastAsia="Calibri" w:hAnsi="Calibri"/>
-          <w:b/>
-          <w:bCs/>
-          <w:color w:val="0E3D33"/>
-          <w:sz w:val="24"/>
-          <w:szCs w:val="24"/>
-        </w:rPr>
-        <w:t xml:space="preserve">Evidence, not assertion</w:t>
-      </w:r>
-    </w:p>
-    <w:p>
-      <w:pPr>
-        <w:spacing w:after="120" w:line="276"/>
-      </w:pPr>
-      <w:r>
-        <w:rPr>
-          <w:rFonts w:ascii="Calibri" w:cs="Calibri" w:eastAsia="Calibri" w:hAnsi="Calibri"/>
-          <w:color w:val="2B3A34"/>
-          <w:sz w:val="21"/>
-          <w:szCs w:val="21"/>
-        </w:rPr>
-        <w:t xml:space="preserve">Every claim was checked against the live database. The same guarantees are pinned by an automated suite that runs in CI on real Postgres (compiled to WASM), where each test maps to a specific defect the prototype had:</w:t>
+        <w:t xml:space="preserve">Worker financials hidden from households by construction</w:t>
       </w:r>
     </w:p>
     <w:p>
@@ -3924,8 +3728,13 @@
           <w:sz w:val="21"/>
           <w:szCs w:val="21"/>
         </w:rPr>
-        <w:t xml:space="preserve">An anonymous visitor sees </w:t>
-      </w:r>
+        <w:t xml:space="preserve">Ops / churn data unreachable from consumers</w:t>
+      </w:r>
+    </w:p>
+    <w:p>
+      <w:pPr>
+        <w:spacing w:after="120" w:line="276"/>
+      </w:pPr>
       <w:r>
         <w:rPr>
           <w:rFonts w:ascii="Calibri" w:cs="Calibri" w:eastAsia="Calibri" w:hAnsi="Calibri"/>
@@ -3935,16 +3744,58 @@
           <w:sz w:val="21"/>
           <w:szCs w:val="21"/>
         </w:rPr>
-        <w:t xml:space="preserve">nothing</w:t>
-      </w:r>
-      <w:r>
-        <w:rPr>
-          <w:rFonts w:ascii="Calibri" w:cs="Calibri" w:eastAsia="Calibri" w:hAnsi="Calibri"/>
-          <w:color w:val="2B3A34"/>
-          <w:sz w:val="21"/>
-          <w:szCs w:val="21"/>
-        </w:rPr>
-        <w:t xml:space="preserve">; each context sees only its own data.</w:t>
+        <w:t xml:space="preserve">The core idea.  </w:t>
+      </w:r>
+      <w:r>
+        <w:rPr>
+          <w:rFonts w:ascii="Calibri" w:cs="Calibri" w:eastAsia="Calibri" w:hAnsi="Calibri"/>
+          <w:color w:val="2B3A34"/>
+          <w:sz w:val="21"/>
+          <w:szCs w:val="21"/>
+        </w:rPr>
+        <w:t xml:space="preserve">The prototype kept contexts apart in the UI (a localStorage role). Casai now keeps them apart in Postgres — a tampered client changes nothing, because every read is filtered by RLS using a server-verified role. The UI is never what protects the data.</w:t>
+      </w:r>
+    </w:p>
+    <w:p>
+      <w:pPr>
+        <w:pStyle w:val="Heading2"/>
+        <w:spacing w:after="100" w:before="340"/>
+      </w:pPr>
+      <w:r>
+        <w:rPr>
+          <w:rFonts w:ascii="Calibri" w:cs="Calibri" w:eastAsia="Calibri" w:hAnsi="Calibri"/>
+          <w:b/>
+          <w:bCs/>
+          <w:color w:val="B8860B"/>
+          <w:sz w:val="24"/>
+          <w:szCs w:val="24"/>
+        </w:rPr>
+        <w:t xml:space="preserve">05  </w:t>
+      </w:r>
+      <w:r>
+        <w:rPr>
+          <w:rFonts w:ascii="Calibri" w:cs="Calibri" w:eastAsia="Calibri" w:hAnsi="Calibri"/>
+          <w:b/>
+          <w:bCs/>
+          <w:color w:val="0E3D33"/>
+          <w:sz w:val="24"/>
+          <w:szCs w:val="24"/>
+        </w:rPr>
+        <w:t xml:space="preserve">Evidence, not assertion</w:t>
+      </w:r>
+    </w:p>
+    <w:p>
+      <w:pPr>
+        <w:spacing w:after="120" w:line="276"/>
+      </w:pPr>
+      <w:r>
+        <w:rPr>
+          <w:rFonts w:ascii="Calibri" w:cs="Calibri" w:eastAsia="Calibri" w:hAnsi="Calibri"/>
+          <w:color w:val="2B3A34"/>
+          <w:sz w:val="21"/>
+          <w:szCs w:val="21"/>
+        </w:rPr>
+        <w:t xml:space="preserve">Every claim was checked against the live database. The same guarantees are pinned by an automated suite that runs in CI on real Postgres (compiled to WASM), where each test maps to a specific defect the prototype had:</w:t>
       </w:r>
     </w:p>
     <w:p>
@@ -3963,27 +3814,7 @@
           <w:sz w:val="21"/>
           <w:szCs w:val="21"/>
         </w:rPr>
-        <w:t xml:space="preserve">A household </w:t>
-      </w:r>
-      <w:r>
-        <w:rPr>
-          <w:rFonts w:ascii="Calibri" w:cs="Calibri" w:eastAsia="Calibri" w:hAnsi="Calibri"/>
-          <w:b/>
-          <w:bCs/>
-          <w:color w:val="12201C"/>
-          <w:sz w:val="21"/>
-          <w:szCs w:val="21"/>
-        </w:rPr>
-        <w:t xml:space="preserve">cannot</w:t>
-      </w:r>
-      <w:r>
-        <w:rPr>
-          <w:rFonts w:ascii="Calibri" w:cs="Calibri" w:eastAsia="Calibri" w:hAnsi="Calibri"/>
-          <w:color w:val="2B3A34"/>
-          <w:sz w:val="21"/>
-          <w:szCs w:val="21"/>
-        </w:rPr>
-        <w:t xml:space="preserve"> reach a worker's credit score or the churn score kept about them.</w:t>
+        <w:t xml:space="preserve">An anonymous visitor sees nothing; each context sees only its own data.</w:t>
       </w:r>
     </w:p>
     <w:p>
@@ -4002,27 +3833,7 @@
           <w:sz w:val="21"/>
           <w:szCs w:val="21"/>
         </w:rPr>
-        <w:t xml:space="preserve">Role elevation to ops / nri / worker is </w:t>
-      </w:r>
-      <w:r>
-        <w:rPr>
-          <w:rFonts w:ascii="Calibri" w:cs="Calibri" w:eastAsia="Calibri" w:hAnsi="Calibri"/>
-          <w:b/>
-          <w:bCs/>
-          <w:color w:val="12201C"/>
-          <w:sz w:val="21"/>
-          <w:szCs w:val="21"/>
-        </w:rPr>
-        <w:t xml:space="preserve">impossible</w:t>
-      </w:r>
-      <w:r>
-        <w:rPr>
-          <w:rFonts w:ascii="Calibri" w:cs="Calibri" w:eastAsia="Calibri" w:hAnsi="Calibri"/>
-          <w:color w:val="2B3A34"/>
-          <w:sz w:val="21"/>
-          <w:szCs w:val="21"/>
-        </w:rPr>
-        <w:t xml:space="preserve"> without the proper server-side path.</w:t>
+        <w:t xml:space="preserve">A household cannot reach a worker's credit score or the churn score kept about them.</w:t>
       </w:r>
     </w:p>
     <w:p>
@@ -4041,27 +3852,7 @@
           <w:sz w:val="21"/>
           <w:szCs w:val="21"/>
         </w:rPr>
-        <w:t xml:space="preserve">A self-onboarded worker is </w:t>
-      </w:r>
-      <w:r>
-        <w:rPr>
-          <w:rFonts w:ascii="Calibri" w:cs="Calibri" w:eastAsia="Calibri" w:hAnsi="Calibri"/>
-          <w:b/>
-          <w:bCs/>
-          <w:color w:val="12201C"/>
-          <w:sz w:val="21"/>
-          <w:szCs w:val="21"/>
-        </w:rPr>
-        <w:t xml:space="preserve">not bookable</w:t>
-      </w:r>
-      <w:r>
-        <w:rPr>
-          <w:rFonts w:ascii="Calibri" w:cs="Calibri" w:eastAsia="Calibri" w:hAnsi="Calibri"/>
-          <w:color w:val="2B3A34"/>
-          <w:sz w:val="21"/>
-          <w:szCs w:val="21"/>
-        </w:rPr>
-        <w:t xml:space="preserve"> until ops verifies them.</w:t>
+        <w:t xml:space="preserve">Role elevation to ops / nri / worker is impossible without the proper server-side path.</w:t>
       </w:r>
     </w:p>
     <w:p>
@@ -4080,47 +3871,87 @@
           <w:sz w:val="21"/>
           <w:szCs w:val="21"/>
         </w:rPr>
+        <w:t xml:space="preserve">A self-onboarded worker is not bookable until ops verifies them.</w:t>
+      </w:r>
+    </w:p>
+    <w:p>
+      <w:pPr>
+        <w:pStyle w:val="ListParagraph"/>
+        <w:numPr>
+          <w:ilvl w:val="0"/>
+          <w:numId w:val="1"/>
+        </w:numPr>
+        <w:spacing w:after="60"/>
+      </w:pPr>
+      <w:r>
+        <w:rPr>
+          <w:rFonts w:ascii="Calibri" w:cs="Calibri" w:eastAsia="Calibri" w:hAnsi="Calibri"/>
+          <w:color w:val="2B3A34"/>
+          <w:sz w:val="21"/>
+          <w:szCs w:val="21"/>
+        </w:rPr>
         <w:t xml:space="preserve">One pricing source — the ₹199-vs-₹220 split that attacked trust at checkout is gone.</w:t>
       </w:r>
     </w:p>
     <w:p>
       <w:pPr>
+        <w:pStyle w:val="ListParagraph"/>
+        <w:numPr>
+          <w:ilvl w:val="0"/>
+          <w:numId w:val="1"/>
+        </w:numPr>
+        <w:spacing w:after="60"/>
+      </w:pPr>
+      <w:r>
+        <w:rPr>
+          <w:rFonts w:ascii="Calibri" w:cs="Calibri" w:eastAsia="Calibri" w:hAnsi="Calibri"/>
+          <w:b/>
+          <w:bCs/>
+          <w:color w:val="12201C"/>
+          <w:sz w:val="21"/>
+          <w:szCs w:val="21"/>
+        </w:rPr>
+        <w:t xml:space="preserve">The no-show loop</w:t>
+      </w:r>
+      <w:r>
+        <w:rPr>
+          <w:rFonts w:ascii="Calibri" w:cs="Calibri" w:eastAsia="Calibri" w:hAnsi="Calibri"/>
+          <w:color w:val="2B3A34"/>
+          <w:sz w:val="21"/>
+          <w:szCs w:val="21"/>
+        </w:rPr>
+        <w:t xml:space="preserve"> scores from real signals, reserves a genuinely free backup, and promotes it on a no-show — and cannot promote to an unverified worker. Eight dedicated tests.</w:t>
+      </w:r>
+    </w:p>
+    <w:p>
+      <w:pPr>
         <w:spacing w:after="120" w:line="276"/>
       </w:pPr>
       <w:r>
         <w:rPr>
           <w:rFonts w:ascii="Calibri" w:cs="Calibri" w:eastAsia="Calibri" w:hAnsi="Calibri"/>
-          <w:color w:val="2B3A34"/>
-          <w:sz w:val="21"/>
-          <w:szCs w:val="21"/>
-        </w:rPr>
-        <w:t xml:space="preserve">A genuine bug the tests caught mid-build: a booking trigger, subject to the caller's own permissions, would have rejected </w:t>
-      </w:r>
-      <w:r>
-        <w:rPr>
-          <w:rFonts w:ascii="Calibri" w:cs="Calibri" w:eastAsia="Calibri" w:hAnsi="Calibri"/>
-          <w:i/>
-          <w:iCs/>
-          <w:color w:val="2B3A34"/>
-          <w:sz w:val="21"/>
-          <w:szCs w:val="21"/>
-        </w:rPr>
-        <w:t xml:space="preserve">every</w:t>
-      </w:r>
-      <w:r>
-        <w:rPr>
-          <w:rFonts w:ascii="Calibri" w:cs="Calibri" w:eastAsia="Calibri" w:hAnsi="Calibri"/>
-          <w:color w:val="2B3A34"/>
-          <w:sz w:val="21"/>
-          <w:szCs w:val="21"/>
-        </w:rPr>
-        <w:t xml:space="preserve"> household booking. Fixed and re-verified. That's the value of testing against a real database rather than a mock.</w:t>
+          <w:b/>
+          <w:bCs/>
+          <w:color w:val="12201C"/>
+          <w:sz w:val="21"/>
+          <w:szCs w:val="21"/>
+        </w:rPr>
+        <w:t xml:space="preserve">A genuine bug the tests caught mid-build: </w:t>
+      </w:r>
+      <w:r>
+        <w:rPr>
+          <w:rFonts w:ascii="Calibri" w:cs="Calibri" w:eastAsia="Calibri" w:hAnsi="Calibri"/>
+          <w:color w:val="2B3A34"/>
+          <w:sz w:val="21"/>
+          <w:szCs w:val="21"/>
+        </w:rPr>
+        <w:t xml:space="preserve">a booking trigger, subject to the caller's own permissions, would have rejected every household booking. Fixed and re-verified. That's the value of testing against a real database rather than a mock.</w:t>
       </w:r>
     </w:p>
     <w:p>
       <w:pPr>
         <w:pStyle w:val="Heading2"/>
-        <w:spacing w:after="100" w:before="320"/>
+        <w:spacing w:after="100" w:before="340"/>
       </w:pPr>
       <w:r>
         <w:rPr>
@@ -4198,8 +4029,8 @@
                 <w:b/>
                 <w:bCs/>
                 <w:color w:val="F0C97A"/>
-                <w:sz w:val="16"/>
-                <w:szCs w:val="16"/>
+                <w:sz w:val="15"/>
+                <w:szCs w:val="15"/>
               </w:rPr>
               <w:t xml:space="preserve">AREA</w:t>
             </w:r>
@@ -4223,8 +4054,8 @@
                 <w:b/>
                 <w:bCs/>
                 <w:color w:val="F0C97A"/>
-                <w:sz w:val="16"/>
-                <w:szCs w:val="16"/>
+                <w:sz w:val="15"/>
+                <w:szCs w:val="15"/>
               </w:rPr>
               <w:t xml:space="preserve">STATUS</w:t>
             </w:r>
@@ -4248,8 +4079,8 @@
                 <w:b/>
                 <w:bCs/>
                 <w:color w:val="F0C97A"/>
-                <w:sz w:val="16"/>
-                <w:szCs w:val="16"/>
+                <w:sz w:val="15"/>
+                <w:szCs w:val="15"/>
               </w:rPr>
               <w:t xml:space="preserve">WHY</w:t>
             </w:r>
@@ -4272,46 +4103,262 @@
             <w:r>
               <w:rPr>
                 <w:rFonts w:ascii="Calibri" w:cs="Calibri" w:eastAsia="Calibri" w:hAnsi="Calibri"/>
+                <w:color w:val="2B3A34"/>
+                <w:sz w:val="21"/>
+                <w:szCs w:val="21"/>
+              </w:rPr>
+              <w:t xml:space="preserve">Real email login</w:t>
+            </w:r>
+          </w:p>
+        </w:tc>
+        <w:tc>
+          <w:tcPr>
+            <w:tcW w:type="dxa" w:w="1600"/>
+            <w:shd w:fill="FFFFFF" w:val="clear"/>
+            <w:tcMar>
+              <w:top w:type="dxa" w:w="50"/>
+              <w:left w:type="dxa" w:w="110"/>
+              <w:bottom w:type="dxa" w:w="50"/>
+              <w:right w:type="dxa" w:w="110"/>
+            </w:tcMar>
+          </w:tcPr>
+          <w:p>
+            <w:r>
+              <w:rPr>
+                <w:rFonts w:ascii="Calibri" w:cs="Calibri" w:eastAsia="Calibri" w:hAnsi="Calibri"/>
                 <w:b/>
                 <w:bCs/>
-                <w:color w:val="12201C"/>
+                <w:color w:val="1E8A5A"/>
+                <w:sz w:val="18"/>
+                <w:szCs w:val="18"/>
+              </w:rPr>
+              <w:t xml:space="preserve">Guest works</w:t>
+            </w:r>
+          </w:p>
+        </w:tc>
+        <w:tc>
+          <w:tcPr>
+            <w:tcW w:type="dxa" w:w="5160"/>
+            <w:shd w:fill="FFFFFF" w:val="clear"/>
+            <w:tcMar>
+              <w:top w:type="dxa" w:w="50"/>
+              <w:left w:type="dxa" w:w="110"/>
+              <w:bottom w:type="dxa" w:w="50"/>
+              <w:right w:type="dxa" w:w="110"/>
+            </w:tcMar>
+          </w:tcPr>
+          <w:p>
+            <w:r>
+              <w:rPr>
+                <w:rFonts w:ascii="Calibri" w:cs="Calibri" w:eastAsia="Calibri" w:hAnsi="Calibri"/>
+                <w:color w:val="2B3A34"/>
                 <w:sz w:val="21"/>
                 <w:szCs w:val="21"/>
               </w:rPr>
-              <w:t xml:space="preserve">Real email login</w:t>
+              <w:t xml:space="preserve">Supabase free-tier locks email templates; “Continue as guest” is the working path. Custom SMTP (Resend) is the fix.</w:t>
+            </w:r>
+          </w:p>
+        </w:tc>
+      </w:tr>
+      <w:tr>
+        <w:tc>
+          <w:tcPr>
+            <w:tcW w:type="dxa" w:w="2600"/>
+            <w:shd w:fill="F4F7F5" w:val="clear"/>
+            <w:tcMar>
+              <w:top w:type="dxa" w:w="50"/>
+              <w:left w:type="dxa" w:w="110"/>
+              <w:bottom w:type="dxa" w:w="50"/>
+              <w:right w:type="dxa" w:w="110"/>
+            </w:tcMar>
+          </w:tcPr>
+          <w:p>
+            <w:r>
+              <w:rPr>
+                <w:rFonts w:ascii="Calibri" w:cs="Calibri" w:eastAsia="Calibri" w:hAnsi="Calibri"/>
+                <w:color w:val="2B3A34"/>
+                <w:sz w:val="21"/>
+                <w:szCs w:val="21"/>
+              </w:rPr>
+              <w:t xml:space="preserve">Payments (Razorpay / Stripe)</w:t>
             </w:r>
           </w:p>
         </w:tc>
         <w:tc>
           <w:tcPr>
             <w:tcW w:type="dxa" w:w="1600"/>
-            <w:shd w:fill="FFFFFF" w:val="clear"/>
-            <w:tcMar>
-              <w:top w:type="dxa" w:w="50"/>
-              <w:left w:type="dxa" w:w="110"/>
-              <w:bottom w:type="dxa" w:w="50"/>
-              <w:right w:type="dxa" w:w="110"/>
-            </w:tcMar>
-          </w:tcPr>
-          <w:p>
-            <w:r>
-              <w:rPr>
-                <w:rFonts w:ascii="Consolas" w:cs="Consolas" w:eastAsia="Consolas" w:hAnsi="Consolas"/>
+            <w:shd w:fill="F4F7F5" w:val="clear"/>
+            <w:tcMar>
+              <w:top w:type="dxa" w:w="50"/>
+              <w:left w:type="dxa" w:w="110"/>
+              <w:bottom w:type="dxa" w:w="50"/>
+              <w:right w:type="dxa" w:w="110"/>
+            </w:tcMar>
+          </w:tcPr>
+          <w:p>
+            <w:r>
+              <w:rPr>
+                <w:rFonts w:ascii="Calibri" w:cs="Calibri" w:eastAsia="Calibri" w:hAnsi="Calibri"/>
+                <w:b/>
+                <w:bCs/>
+                <w:color w:val="B4442E"/>
+                <w:sz w:val="18"/>
+                <w:szCs w:val="18"/>
+              </w:rPr>
+              <w:t xml:space="preserve">Deferred</w:t>
+            </w:r>
+          </w:p>
+        </w:tc>
+        <w:tc>
+          <w:tcPr>
+            <w:tcW w:type="dxa" w:w="5160"/>
+            <w:shd w:fill="F4F7F5" w:val="clear"/>
+            <w:tcMar>
+              <w:top w:type="dxa" w:w="50"/>
+              <w:left w:type="dxa" w:w="110"/>
+              <w:bottom w:type="dxa" w:w="50"/>
+              <w:right w:type="dxa" w:w="110"/>
+            </w:tcMar>
+          </w:tcPr>
+          <w:p>
+            <w:r>
+              <w:rPr>
+                <w:rFonts w:ascii="Calibri" w:cs="Calibri" w:eastAsia="Calibri" w:hAnsi="Calibri"/>
+                <w:color w:val="2B3A34"/>
+                <w:sz w:val="21"/>
+                <w:szCs w:val="21"/>
+              </w:rPr>
+              <w:t xml:space="preserve">Bookings settle on service for now; dual-currency needs two gateways behind one ledger.</w:t>
+            </w:r>
+          </w:p>
+        </w:tc>
+      </w:tr>
+      <w:tr>
+        <w:tc>
+          <w:tcPr>
+            <w:tcW w:type="dxa" w:w="2600"/>
+            <w:shd w:fill="FFFFFF" w:val="clear"/>
+            <w:tcMar>
+              <w:top w:type="dxa" w:w="50"/>
+              <w:left w:type="dxa" w:w="110"/>
+              <w:bottom w:type="dxa" w:w="50"/>
+              <w:right w:type="dxa" w:w="110"/>
+            </w:tcMar>
+          </w:tcPr>
+          <w:p>
+            <w:r>
+              <w:rPr>
+                <w:rFonts w:ascii="Calibri" w:cs="Calibri" w:eastAsia="Calibri" w:hAnsi="Calibri"/>
+                <w:color w:val="2B3A34"/>
+                <w:sz w:val="21"/>
+                <w:szCs w:val="21"/>
+              </w:rPr>
+              <w:t xml:space="preserve">The AI models</w:t>
+            </w:r>
+          </w:p>
+        </w:tc>
+        <w:tc>
+          <w:tcPr>
+            <w:tcW w:type="dxa" w:w="1600"/>
+            <w:shd w:fill="FFFFFF" w:val="clear"/>
+            <w:tcMar>
+              <w:top w:type="dxa" w:w="50"/>
+              <w:left w:type="dxa" w:w="110"/>
+              <w:bottom w:type="dxa" w:w="50"/>
+              <w:right w:type="dxa" w:w="110"/>
+            </w:tcMar>
+          </w:tcPr>
+          <w:p>
+            <w:r>
+              <w:rPr>
+                <w:rFonts w:ascii="Calibri" w:cs="Calibri" w:eastAsia="Calibri" w:hAnsi="Calibri"/>
+                <w:b/>
+                <w:bCs/>
+                <w:color w:val="1E8A5A"/>
+                <w:sz w:val="18"/>
+                <w:szCs w:val="18"/>
+              </w:rPr>
+              <w:t xml:space="preserve">Partly live</w:t>
+            </w:r>
+          </w:p>
+        </w:tc>
+        <w:tc>
+          <w:tcPr>
+            <w:tcW w:type="dxa" w:w="5160"/>
+            <w:shd w:fill="FFFFFF" w:val="clear"/>
+            <w:tcMar>
+              <w:top w:type="dxa" w:w="50"/>
+              <w:left w:type="dxa" w:w="110"/>
+              <w:bottom w:type="dxa" w:w="50"/>
+              <w:right w:type="dxa" w:w="110"/>
+            </w:tcMar>
+          </w:tcPr>
+          <w:p>
+            <w:r>
+              <w:rPr>
+                <w:rFonts w:ascii="Calibri" w:cs="Calibri" w:eastAsia="Calibri" w:hAnsi="Calibri"/>
+                <w:color w:val="2B3A34"/>
+                <w:sz w:val="21"/>
+                <w:szCs w:val="21"/>
+              </w:rPr>
+              <w:t xml:space="preserve">No-show now runs as a live heuristic that also gathers the labels a trained model will need; the trained no-show model and the churn model stay deferred until history exists. AI follows the data.</w:t>
+            </w:r>
+          </w:p>
+        </w:tc>
+      </w:tr>
+      <w:tr>
+        <w:tc>
+          <w:tcPr>
+            <w:tcW w:type="dxa" w:w="2600"/>
+            <w:shd w:fill="F4F7F5" w:val="clear"/>
+            <w:tcMar>
+              <w:top w:type="dxa" w:w="50"/>
+              <w:left w:type="dxa" w:w="110"/>
+              <w:bottom w:type="dxa" w:w="50"/>
+              <w:right w:type="dxa" w:w="110"/>
+            </w:tcMar>
+          </w:tcPr>
+          <w:p>
+            <w:r>
+              <w:rPr>
+                <w:rFonts w:ascii="Calibri" w:cs="Calibri" w:eastAsia="Calibri" w:hAnsi="Calibri"/>
+                <w:color w:val="2B3A34"/>
+                <w:sz w:val="21"/>
+                <w:szCs w:val="21"/>
+              </w:rPr>
+              <w:t xml:space="preserve">Real eKYC / police (UIDAI)</w:t>
+            </w:r>
+          </w:p>
+        </w:tc>
+        <w:tc>
+          <w:tcPr>
+            <w:tcW w:type="dxa" w:w="1600"/>
+            <w:shd w:fill="F4F7F5" w:val="clear"/>
+            <w:tcMar>
+              <w:top w:type="dxa" w:w="50"/>
+              <w:left w:type="dxa" w:w="110"/>
+              <w:bottom w:type="dxa" w:w="50"/>
+              <w:right w:type="dxa" w:w="110"/>
+            </w:tcMar>
+          </w:tcPr>
+          <w:p>
+            <w:r>
+              <w:rPr>
+                <w:rFonts w:ascii="Calibri" w:cs="Calibri" w:eastAsia="Calibri" w:hAnsi="Calibri"/>
                 <w:b/>
                 <w:bCs/>
                 <w:color w:val="B9791A"/>
-                <w:sz w:val="17"/>
-                <w:szCs w:val="17"/>
-                <w:shd w:fill="F8EED9" w:val="clear"/>
-              </w:rPr>
-              <w:t xml:space="preserve"> Guest works </w:t>
+                <w:sz w:val="18"/>
+                <w:szCs w:val="18"/>
+              </w:rPr>
+              <w:t xml:space="preserve">Manual</w:t>
             </w:r>
           </w:p>
         </w:tc>
         <w:tc>
           <w:tcPr>
             <w:tcW w:type="dxa" w:w="5160"/>
-            <w:shd w:fill="FFFFFF" w:val="clear"/>
+            <w:shd w:fill="F4F7F5" w:val="clear"/>
             <w:tcMar>
               <w:top w:type="dxa" w:w="50"/>
               <w:left w:type="dxa" w:w="110"/>
@@ -4327,7 +4374,7 @@
                 <w:sz w:val="21"/>
                 <w:szCs w:val="21"/>
               </w:rPr>
-              <w:t xml:space="preserve">Supabase free-tier locks email templates; “Continue as guest” is the working path. Custom SMTP (Resend) is the fix.</w:t>
+              <w:t xml:space="preserve">The ops console to approve workers is built and live; what's deferred is the automated UIDAI/police integration behind it.</w:t>
             </w:r>
           </w:p>
         </w:tc>
@@ -4336,58 +4383,55 @@
         <w:tc>
           <w:tcPr>
             <w:tcW w:type="dxa" w:w="2600"/>
-            <w:shd w:fill="F4F7F5" w:val="clear"/>
-            <w:tcMar>
-              <w:top w:type="dxa" w:w="50"/>
-              <w:left w:type="dxa" w:w="110"/>
-              <w:bottom w:type="dxa" w:w="50"/>
-              <w:right w:type="dxa" w:w="110"/>
-            </w:tcMar>
-          </w:tcPr>
-          <w:p>
-            <w:r>
-              <w:rPr>
-                <w:rFonts w:ascii="Calibri" w:cs="Calibri" w:eastAsia="Calibri" w:hAnsi="Calibri"/>
-                <w:b/>
-                <w:bCs/>
-                <w:color w:val="12201C"/>
+            <w:shd w:fill="FFFFFF" w:val="clear"/>
+            <w:tcMar>
+              <w:top w:type="dxa" w:w="50"/>
+              <w:left w:type="dxa" w:w="110"/>
+              <w:bottom w:type="dxa" w:w="50"/>
+              <w:right w:type="dxa" w:w="110"/>
+            </w:tcMar>
+          </w:tcPr>
+          <w:p>
+            <w:r>
+              <w:rPr>
+                <w:rFonts w:ascii="Calibri" w:cs="Calibri" w:eastAsia="Calibri" w:hAnsi="Calibri"/>
+                <w:color w:val="2B3A34"/>
                 <w:sz w:val="21"/>
                 <w:szCs w:val="21"/>
               </w:rPr>
-              <w:t xml:space="preserve">Payments (Razorpay / Stripe)</w:t>
+              <w:t xml:space="preserve">GPS check-in · notifications · ops analytics</w:t>
             </w:r>
           </w:p>
         </w:tc>
         <w:tc>
           <w:tcPr>
             <w:tcW w:type="dxa" w:w="1600"/>
-            <w:shd w:fill="F4F7F5" w:val="clear"/>
-            <w:tcMar>
-              <w:top w:type="dxa" w:w="50"/>
-              <w:left w:type="dxa" w:w="110"/>
-              <w:bottom w:type="dxa" w:w="50"/>
-              <w:right w:type="dxa" w:w="110"/>
-            </w:tcMar>
-          </w:tcPr>
-          <w:p>
-            <w:r>
-              <w:rPr>
-                <w:rFonts w:ascii="Consolas" w:cs="Consolas" w:eastAsia="Consolas" w:hAnsi="Consolas"/>
+            <w:shd w:fill="FFFFFF" w:val="clear"/>
+            <w:tcMar>
+              <w:top w:type="dxa" w:w="50"/>
+              <w:left w:type="dxa" w:w="110"/>
+              <w:bottom w:type="dxa" w:w="50"/>
+              <w:right w:type="dxa" w:w="110"/>
+            </w:tcMar>
+          </w:tcPr>
+          <w:p>
+            <w:r>
+              <w:rPr>
+                <w:rFonts w:ascii="Calibri" w:cs="Calibri" w:eastAsia="Calibri" w:hAnsi="Calibri"/>
                 <w:b/>
                 <w:bCs/>
                 <w:color w:val="B4442E"/>
-                <w:sz w:val="17"/>
-                <w:szCs w:val="17"/>
-                <w:shd w:fill="F7E6E1" w:val="clear"/>
-              </w:rPr>
-              <w:t xml:space="preserve"> Deferred </w:t>
+                <w:sz w:val="18"/>
+                <w:szCs w:val="18"/>
+              </w:rPr>
+              <w:t xml:space="preserve">Deferred</w:t>
             </w:r>
           </w:p>
         </w:tc>
         <w:tc>
           <w:tcPr>
             <w:tcW w:type="dxa" w:w="5160"/>
-            <w:shd w:fill="F4F7F5" w:val="clear"/>
+            <w:shd w:fill="FFFFFF" w:val="clear"/>
             <w:tcMar>
               <w:top w:type="dxa" w:w="50"/>
               <w:left w:type="dxa" w:w="110"/>
@@ -4403,234 +4447,6 @@
                 <w:sz w:val="21"/>
                 <w:szCs w:val="21"/>
               </w:rPr>
-              <w:t xml:space="preserve">Bookings settle on service for now; dual-currency needs two gateways behind one ledger.</w:t>
-            </w:r>
-          </w:p>
-        </w:tc>
-      </w:tr>
-      <w:tr>
-        <w:tc>
-          <w:tcPr>
-            <w:tcW w:type="dxa" w:w="2600"/>
-            <w:shd w:fill="FFFFFF" w:val="clear"/>
-            <w:tcMar>
-              <w:top w:type="dxa" w:w="50"/>
-              <w:left w:type="dxa" w:w="110"/>
-              <w:bottom w:type="dxa" w:w="50"/>
-              <w:right w:type="dxa" w:w="110"/>
-            </w:tcMar>
-          </w:tcPr>
-          <w:p>
-            <w:r>
-              <w:rPr>
-                <w:rFonts w:ascii="Calibri" w:cs="Calibri" w:eastAsia="Calibri" w:hAnsi="Calibri"/>
-                <w:b/>
-                <w:bCs/>
-                <w:color w:val="12201C"/>
-                <w:sz w:val="21"/>
-                <w:szCs w:val="21"/>
-              </w:rPr>
-              <w:t xml:space="preserve">The AI engines</w:t>
-            </w:r>
-          </w:p>
-        </w:tc>
-        <w:tc>
-          <w:tcPr>
-            <w:tcW w:type="dxa" w:w="1600"/>
-            <w:shd w:fill="FFFFFF" w:val="clear"/>
-            <w:tcMar>
-              <w:top w:type="dxa" w:w="50"/>
-              <w:left w:type="dxa" w:w="110"/>
-              <w:bottom w:type="dxa" w:w="50"/>
-              <w:right w:type="dxa" w:w="110"/>
-            </w:tcMar>
-          </w:tcPr>
-          <w:p>
-            <w:r>
-              <w:rPr>
-                <w:rFonts w:ascii="Consolas" w:cs="Consolas" w:eastAsia="Consolas" w:hAnsi="Consolas"/>
-                <w:b/>
-                <w:bCs/>
-                <w:color w:val="B4442E"/>
-                <w:sz w:val="17"/>
-                <w:szCs w:val="17"/>
-                <w:shd w:fill="F7E6E1" w:val="clear"/>
-              </w:rPr>
-              <w:t xml:space="preserve"> Deferred </w:t>
-            </w:r>
-          </w:p>
-        </w:tc>
-        <w:tc>
-          <w:tcPr>
-            <w:tcW w:type="dxa" w:w="5160"/>
-            <w:shd w:fill="FFFFFF" w:val="clear"/>
-            <w:tcMar>
-              <w:top w:type="dxa" w:w="50"/>
-              <w:left w:type="dxa" w:w="110"/>
-              <w:bottom w:type="dxa" w:w="50"/>
-              <w:right w:type="dxa" w:w="110"/>
-            </w:tcMar>
-          </w:tcPr>
-          <w:p>
-            <w:r>
-              <w:rPr>
-                <w:rFonts w:ascii="Calibri" w:cs="Calibri" w:eastAsia="Calibri" w:hAnsi="Calibri"/>
-                <w:color w:val="2B3A34"/>
-                <w:sz w:val="21"/>
-                <w:szCs w:val="21"/>
-              </w:rPr>
-              <w:t xml:space="preserve">No-show / churn models need booking history to train on — impossible at zero bookings. AI follows the data, by design.</w:t>
-            </w:r>
-          </w:p>
-        </w:tc>
-      </w:tr>
-      <w:tr>
-        <w:tc>
-          <w:tcPr>
-            <w:tcW w:type="dxa" w:w="2600"/>
-            <w:shd w:fill="F4F7F5" w:val="clear"/>
-            <w:tcMar>
-              <w:top w:type="dxa" w:w="50"/>
-              <w:left w:type="dxa" w:w="110"/>
-              <w:bottom w:type="dxa" w:w="50"/>
-              <w:right w:type="dxa" w:w="110"/>
-            </w:tcMar>
-          </w:tcPr>
-          <w:p>
-            <w:r>
-              <w:rPr>
-                <w:rFonts w:ascii="Calibri" w:cs="Calibri" w:eastAsia="Calibri" w:hAnsi="Calibri"/>
-                <w:b/>
-                <w:bCs/>
-                <w:color w:val="12201C"/>
-                <w:sz w:val="21"/>
-                <w:szCs w:val="21"/>
-              </w:rPr>
-              <w:t xml:space="preserve">Real eKYC / police (UIDAI)</w:t>
-            </w:r>
-          </w:p>
-        </w:tc>
-        <w:tc>
-          <w:tcPr>
-            <w:tcW w:type="dxa" w:w="1600"/>
-            <w:shd w:fill="F4F7F5" w:val="clear"/>
-            <w:tcMar>
-              <w:top w:type="dxa" w:w="50"/>
-              <w:left w:type="dxa" w:w="110"/>
-              <w:bottom w:type="dxa" w:w="50"/>
-              <w:right w:type="dxa" w:w="110"/>
-            </w:tcMar>
-          </w:tcPr>
-          <w:p>
-            <w:r>
-              <w:rPr>
-                <w:rFonts w:ascii="Consolas" w:cs="Consolas" w:eastAsia="Consolas" w:hAnsi="Consolas"/>
-                <w:b/>
-                <w:bCs/>
-                <w:color w:val="B9791A"/>
-                <w:sz w:val="17"/>
-                <w:szCs w:val="17"/>
-                <w:shd w:fill="F8EED9" w:val="clear"/>
-              </w:rPr>
-              <w:t xml:space="preserve"> Manual </w:t>
-            </w:r>
-          </w:p>
-        </w:tc>
-        <w:tc>
-          <w:tcPr>
-            <w:tcW w:type="dxa" w:w="5160"/>
-            <w:shd w:fill="F4F7F5" w:val="clear"/>
-            <w:tcMar>
-              <w:top w:type="dxa" w:w="50"/>
-              <w:left w:type="dxa" w:w="110"/>
-              <w:bottom w:type="dxa" w:w="50"/>
-              <w:right w:type="dxa" w:w="110"/>
-            </w:tcMar>
-          </w:tcPr>
-          <w:p>
-            <w:r>
-              <w:rPr>
-                <w:rFonts w:ascii="Calibri" w:cs="Calibri" w:eastAsia="Calibri" w:hAnsi="Calibri"/>
-                <w:color w:val="2B3A34"/>
-                <w:sz w:val="21"/>
-                <w:szCs w:val="21"/>
-              </w:rPr>
-              <w:t xml:space="preserve">The ops console to approve workers is built and live; what's deferred is the automated UIDAI/police integration behind it.</w:t>
-            </w:r>
-          </w:p>
-        </w:tc>
-      </w:tr>
-      <w:tr>
-        <w:tc>
-          <w:tcPr>
-            <w:tcW w:type="dxa" w:w="2600"/>
-            <w:shd w:fill="FFFFFF" w:val="clear"/>
-            <w:tcMar>
-              <w:top w:type="dxa" w:w="50"/>
-              <w:left w:type="dxa" w:w="110"/>
-              <w:bottom w:type="dxa" w:w="50"/>
-              <w:right w:type="dxa" w:w="110"/>
-            </w:tcMar>
-          </w:tcPr>
-          <w:p>
-            <w:r>
-              <w:rPr>
-                <w:rFonts w:ascii="Calibri" w:cs="Calibri" w:eastAsia="Calibri" w:hAnsi="Calibri"/>
-                <w:b/>
-                <w:bCs/>
-                <w:color w:val="12201C"/>
-                <w:sz w:val="21"/>
-                <w:szCs w:val="21"/>
-              </w:rPr>
-              <w:t xml:space="preserve">GPS check-in · notifications · ops analytics</w:t>
-            </w:r>
-          </w:p>
-        </w:tc>
-        <w:tc>
-          <w:tcPr>
-            <w:tcW w:type="dxa" w:w="1600"/>
-            <w:shd w:fill="FFFFFF" w:val="clear"/>
-            <w:tcMar>
-              <w:top w:type="dxa" w:w="50"/>
-              <w:left w:type="dxa" w:w="110"/>
-              <w:bottom w:type="dxa" w:w="50"/>
-              <w:right w:type="dxa" w:w="110"/>
-            </w:tcMar>
-          </w:tcPr>
-          <w:p>
-            <w:r>
-              <w:rPr>
-                <w:rFonts w:ascii="Consolas" w:cs="Consolas" w:eastAsia="Consolas" w:hAnsi="Consolas"/>
-                <w:b/>
-                <w:bCs/>
-                <w:color w:val="B4442E"/>
-                <w:sz w:val="17"/>
-                <w:szCs w:val="17"/>
-                <w:shd w:fill="F7E6E1" w:val="clear"/>
-              </w:rPr>
-              <w:t xml:space="preserve"> Deferred </w:t>
-            </w:r>
-          </w:p>
-        </w:tc>
-        <w:tc>
-          <w:tcPr>
-            <w:tcW w:type="dxa" w:w="5160"/>
-            <w:shd w:fill="FFFFFF" w:val="clear"/>
-            <w:tcMar>
-              <w:top w:type="dxa" w:w="50"/>
-              <w:left w:type="dxa" w:w="110"/>
-              <w:bottom w:type="dxa" w:w="50"/>
-              <w:right w:type="dxa" w:w="110"/>
-            </w:tcMar>
-          </w:tcPr>
-          <w:p>
-            <w:r>
-              <w:rPr>
-                <w:rFonts w:ascii="Calibri" w:cs="Calibri" w:eastAsia="Calibri" w:hAnsi="Calibri"/>
-                <w:color w:val="2B3A34"/>
-                <w:sz w:val="21"/>
-                <w:szCs w:val="21"/>
-              </w:rPr>
               <w:t xml:space="preserve">P4–P5 of the delivery plan. (Ops verification is done; the NSM/SLA/churn dashboard is not.)</w:t>
             </w:r>
           </w:p>
@@ -4640,7 +4456,7 @@
     <w:p>
       <w:pPr>
         <w:pStyle w:val="Heading2"/>
-        <w:spacing w:after="100" w:before="320"/>
+        <w:spacing w:after="100" w:before="340"/>
       </w:pPr>
       <w:r>
         <w:rPr>
@@ -4676,33 +4492,13 @@
           <w:sz w:val="21"/>
           <w:szCs w:val="21"/>
         </w:rPr>
-        <w:t xml:space="preserve">The backend — Supabase (Postgres + Auth) — runs in the cloud, always on. Its dashboard was only ever opened once, to apply the migrations; that setup is done. </w:t>
-      </w:r>
-      <w:r>
-        <w:rPr>
-          <w:rFonts w:ascii="Calibri" w:cs="Calibri" w:eastAsia="Calibri" w:hAnsi="Calibri"/>
-          <w:b/>
-          <w:bCs/>
-          <w:color w:val="12201C"/>
-          <w:sz w:val="21"/>
-          <w:szCs w:val="21"/>
-        </w:rPr>
-        <w:t xml:space="preserve">You do not open Supabase to run the app.</w:t>
-      </w:r>
-      <w:r>
-        <w:rPr>
-          <w:rFonts w:ascii="Calibri" w:cs="Calibri" w:eastAsia="Calibri" w:hAnsi="Calibri"/>
-          <w:color w:val="2B3A34"/>
-          <w:sz w:val="21"/>
-          <w:szCs w:val="21"/>
-        </w:rPr>
-        <w:t xml:space="preserve"> You start the front-end and it reaches Supabase over the internet.</w:t>
+        <w:t xml:space="preserve">The backend — Supabase (Postgres + Auth) — runs in the cloud, always on. Its dashboard was only ever opened to apply the migrations; that setup is done. You do not open Supabase to run the app. You start the front-end and it reaches Supabase over the internet.</w:t>
       </w:r>
     </w:p>
     <w:p>
       <w:pPr>
         <w:pStyle w:val="Heading3"/>
-        <w:spacing w:after="60" w:before="220"/>
+        <w:spacing w:after="60" w:before="240"/>
       </w:pPr>
       <w:r>
         <w:rPr>
@@ -4728,10 +4524,9 @@
       <w:r>
         <w:rPr>
           <w:rFonts w:ascii="Consolas" w:cs="Consolas" w:eastAsia="Consolas" w:hAnsi="Consolas"/>
-          <w:color w:val="0E3D33"/>
-          <w:sz w:val="19"/>
-          <w:szCs w:val="19"/>
-          <w:shd w:fill="EEF3F1" w:val="clear"/>
+          <w:color w:val="5F6F68"/>
+          <w:sz w:val="18"/>
+          <w:szCs w:val="18"/>
         </w:rPr>
         <w:t xml:space="preserve">npm install</w:t>
       </w:r>
@@ -4757,10 +4552,9 @@
       <w:r>
         <w:rPr>
           <w:rFonts w:ascii="Consolas" w:cs="Consolas" w:eastAsia="Consolas" w:hAnsi="Consolas"/>
-          <w:color w:val="0E3D33"/>
-          <w:sz w:val="19"/>
-          <w:szCs w:val="19"/>
-          <w:shd w:fill="EEF3F1" w:val="clear"/>
+          <w:color w:val="5F6F68"/>
+          <w:sz w:val="18"/>
+          <w:szCs w:val="18"/>
         </w:rPr>
         <w:t xml:space="preserve">npm run dev</w:t>
       </w:r>
@@ -4771,154 +4565,7 @@
           <w:sz w:val="21"/>
           <w:szCs w:val="21"/>
         </w:rPr>
-        <w:t xml:space="preserve">  — starts the app on localhost; open it, then use </w:t>
-      </w:r>
-      <w:r>
-        <w:rPr>
-          <w:rFonts w:ascii="Calibri" w:cs="Calibri" w:eastAsia="Calibri" w:hAnsi="Calibri"/>
-          <w:b/>
-          <w:bCs/>
-          <w:color w:val="12201C"/>
-          <w:sz w:val="21"/>
-          <w:szCs w:val="21"/>
-        </w:rPr>
-        <w:t xml:space="preserve">Guest user</w:t>
-      </w:r>
-      <w:r>
-        <w:rPr>
-          <w:rFonts w:ascii="Calibri" w:cs="Calibri" w:eastAsia="Calibri" w:hAnsi="Calibri"/>
-          <w:color w:val="2B3A34"/>
-          <w:sz w:val="21"/>
-          <w:szCs w:val="21"/>
-        </w:rPr>
-        <w:t xml:space="preserve"> or </w:t>
-      </w:r>
-      <w:r>
-        <w:rPr>
-          <w:rFonts w:ascii="Calibri" w:cs="Calibri" w:eastAsia="Calibri" w:hAnsi="Calibri"/>
-          <w:b/>
-          <w:bCs/>
-          <w:color w:val="12201C"/>
-          <w:sz w:val="21"/>
-          <w:szCs w:val="21"/>
-        </w:rPr>
-        <w:t xml:space="preserve">Admin</w:t>
-      </w:r>
-      <w:r>
-        <w:rPr>
-          <w:rFonts w:ascii="Calibri" w:cs="Calibri" w:eastAsia="Calibri" w:hAnsi="Calibri"/>
-          <w:color w:val="2B3A34"/>
-          <w:sz w:val="21"/>
-          <w:szCs w:val="21"/>
-        </w:rPr>
-        <w:t xml:space="preserve"> on the landing page.</w:t>
-      </w:r>
-    </w:p>
-    <w:p>
-      <w:pPr>
-        <w:spacing w:after="120" w:line="276"/>
-      </w:pPr>
-      <w:r>
-        <w:rPr>
-          <w:rFonts w:ascii="Calibri" w:cs="Calibri" w:eastAsia="Calibri" w:hAnsi="Calibri"/>
-          <w:color w:val="2B3A34"/>
-          <w:sz w:val="21"/>
-          <w:szCs w:val="21"/>
-        </w:rPr>
-        <w:t xml:space="preserve">It needs a </w:t>
-      </w:r>
-      <w:r>
-        <w:rPr>
-          <w:rFonts w:ascii="Consolas" w:cs="Consolas" w:eastAsia="Consolas" w:hAnsi="Consolas"/>
-          <w:color w:val="0E3D33"/>
-          <w:sz w:val="19"/>
-          <w:szCs w:val="19"/>
-          <w:shd w:fill="EEF3F1" w:val="clear"/>
-        </w:rPr>
-        <w:t xml:space="preserve">.env</w:t>
-      </w:r>
-      <w:r>
-        <w:rPr>
-          <w:rFonts w:ascii="Calibri" w:cs="Calibri" w:eastAsia="Calibri" w:hAnsi="Calibri"/>
-          <w:color w:val="2B3A34"/>
-          <w:sz w:val="21"/>
-          <w:szCs w:val="21"/>
-        </w:rPr>
-        <w:t xml:space="preserve"> file with </w:t>
-      </w:r>
-      <w:r>
-        <w:rPr>
-          <w:rFonts w:ascii="Consolas" w:cs="Consolas" w:eastAsia="Consolas" w:hAnsi="Consolas"/>
-          <w:color w:val="0E3D33"/>
-          <w:sz w:val="19"/>
-          <w:szCs w:val="19"/>
-          <w:shd w:fill="EEF3F1" w:val="clear"/>
-        </w:rPr>
-        <w:t xml:space="preserve">VITE_SUPABASE_URL</w:t>
-      </w:r>
-      <w:r>
-        <w:rPr>
-          <w:rFonts w:ascii="Calibri" w:cs="Calibri" w:eastAsia="Calibri" w:hAnsi="Calibri"/>
-          <w:color w:val="2B3A34"/>
-          <w:sz w:val="21"/>
-          <w:szCs w:val="21"/>
-        </w:rPr>
-        <w:t xml:space="preserve"> and </w:t>
-      </w:r>
-      <w:r>
-        <w:rPr>
-          <w:rFonts w:ascii="Consolas" w:cs="Consolas" w:eastAsia="Consolas" w:hAnsi="Consolas"/>
-          <w:color w:val="0E3D33"/>
-          <w:sz w:val="19"/>
-          <w:szCs w:val="19"/>
-          <w:shd w:fill="EEF3F1" w:val="clear"/>
-        </w:rPr>
-        <w:t xml:space="preserve">VITE_SUPABASE_ANON_KEY</w:t>
-      </w:r>
-      <w:r>
-        <w:rPr>
-          <w:rFonts w:ascii="Calibri" w:cs="Calibri" w:eastAsia="Calibri" w:hAnsi="Calibri"/>
-          <w:color w:val="2B3A34"/>
-          <w:sz w:val="21"/>
-          <w:szCs w:val="21"/>
-        </w:rPr>
-        <w:t xml:space="preserve">. Both are public by design (the anon key ships in the browser; RLS protects the data), so they are safe to share. </w:t>
-      </w:r>
-      <w:r>
-        <w:rPr>
-          <w:rFonts w:ascii="Consolas" w:cs="Consolas" w:eastAsia="Consolas" w:hAnsi="Consolas"/>
-          <w:color w:val="0E3D33"/>
-          <w:sz w:val="19"/>
-          <w:szCs w:val="19"/>
-          <w:shd w:fill="EEF3F1" w:val="clear"/>
-        </w:rPr>
-        <w:t xml:space="preserve">.env</w:t>
-      </w:r>
-      <w:r>
-        <w:rPr>
-          <w:rFonts w:ascii="Calibri" w:cs="Calibri" w:eastAsia="Calibri" w:hAnsi="Calibri"/>
-          <w:color w:val="2B3A34"/>
-          <w:sz w:val="21"/>
-          <w:szCs w:val="21"/>
-        </w:rPr>
-        <w:t xml:space="preserve"> is git-ignored, so a fresh clone won't include it.</w:t>
-      </w:r>
-    </w:p>
-    <w:p>
-      <w:pPr>
-        <w:pStyle w:val="Heading3"/>
-        <w:spacing w:after="60" w:before="220"/>
-      </w:pPr>
-      <w:r>
-        <w:rPr>
-          <w:rFonts w:ascii="Calibri" w:cs="Calibri" w:eastAsia="Calibri" w:hAnsi="Calibri"/>
-          <w:b/>
-          <w:bCs/>
-          <w:color w:val="0F6E56"/>
-          <w:sz w:val="21"/>
-          <w:szCs w:val="21"/>
-        </w:rPr>
-        <w:t xml:space="preserve">Share it with someone</w:t>
+        <w:t xml:space="preserve">  — starts the app on localhost; open it, then use Guest user or Admin on the landing page.</w:t>
       </w:r>
     </w:p>
     <w:p>
@@ -4933,30 +4580,18 @@
       <w:r>
         <w:rPr>
           <w:rFonts w:ascii="Calibri" w:cs="Calibri" w:eastAsia="Calibri" w:hAnsi="Calibri"/>
-          <w:b/>
-          <w:bCs/>
-          <w:color w:val="12201C"/>
-          <w:sz w:val="21"/>
-          <w:szCs w:val="21"/>
-        </w:rPr>
-        <w:t xml:space="preserve">They run the code: </w:t>
-      </w:r>
-      <w:r>
-        <w:rPr>
-          <w:rFonts w:ascii="Calibri" w:cs="Calibri" w:eastAsia="Calibri" w:hAnsi="Calibri"/>
-          <w:color w:val="2B3A34"/>
-          <w:sz w:val="21"/>
-          <w:szCs w:val="21"/>
-        </w:rPr>
-        <w:t xml:space="preserve">give them the repo plus your two </w:t>
+          <w:color w:val="2B3A34"/>
+          <w:sz w:val="21"/>
+          <w:szCs w:val="21"/>
+        </w:rPr>
+        <w:t xml:space="preserve">It needs a </w:t>
       </w:r>
       <w:r>
         <w:rPr>
           <w:rFonts w:ascii="Consolas" w:cs="Consolas" w:eastAsia="Consolas" w:hAnsi="Consolas"/>
-          <w:color w:val="0E3D33"/>
-          <w:sz w:val="19"/>
-          <w:szCs w:val="19"/>
-          <w:shd w:fill="EEF3F1" w:val="clear"/>
+          <w:color w:val="5F6F68"/>
+          <w:sz w:val="18"/>
+          <w:szCs w:val="18"/>
         </w:rPr>
         <w:t xml:space="preserve">.env</w:t>
       </w:r>
@@ -4967,26 +4602,78 @@
           <w:sz w:val="21"/>
           <w:szCs w:val="21"/>
         </w:rPr>
-        <w:t xml:space="preserve"> values; </w:t>
+        <w:t xml:space="preserve"> file with </w:t>
       </w:r>
       <w:r>
         <w:rPr>
           <w:rFonts w:ascii="Consolas" w:cs="Consolas" w:eastAsia="Consolas" w:hAnsi="Consolas"/>
-          <w:color w:val="0E3D33"/>
-          <w:sz w:val="19"/>
-          <w:szCs w:val="19"/>
-          <w:shd w:fill="EEF3F1" w:val="clear"/>
-        </w:rPr>
-        <w:t xml:space="preserve">npm install &amp;&amp; npm run dev</w:t>
-      </w:r>
-      <w:r>
-        <w:rPr>
-          <w:rFonts w:ascii="Calibri" w:cs="Calibri" w:eastAsia="Calibri" w:hAnsi="Calibri"/>
-          <w:color w:val="2B3A34"/>
-          <w:sz w:val="21"/>
-          <w:szCs w:val="21"/>
-        </w:rPr>
-        <w:t xml:space="preserve"> and they're on the same Supabase (migrations already applied).</w:t>
+          <w:color w:val="5F6F68"/>
+          <w:sz w:val="18"/>
+          <w:szCs w:val="18"/>
+        </w:rPr>
+        <w:t xml:space="preserve">VITE_SUPABASE_URL</w:t>
+      </w:r>
+      <w:r>
+        <w:rPr>
+          <w:rFonts w:ascii="Calibri" w:cs="Calibri" w:eastAsia="Calibri" w:hAnsi="Calibri"/>
+          <w:color w:val="2B3A34"/>
+          <w:sz w:val="21"/>
+          <w:szCs w:val="21"/>
+        </w:rPr>
+        <w:t xml:space="preserve"> and </w:t>
+      </w:r>
+      <w:r>
+        <w:rPr>
+          <w:rFonts w:ascii="Consolas" w:cs="Consolas" w:eastAsia="Consolas" w:hAnsi="Consolas"/>
+          <w:color w:val="5F6F68"/>
+          <w:sz w:val="18"/>
+          <w:szCs w:val="18"/>
+        </w:rPr>
+        <w:t xml:space="preserve">VITE_SUPABASE_ANON_KEY</w:t>
+      </w:r>
+      <w:r>
+        <w:rPr>
+          <w:rFonts w:ascii="Calibri" w:cs="Calibri" w:eastAsia="Calibri" w:hAnsi="Calibri"/>
+          <w:color w:val="2B3A34"/>
+          <w:sz w:val="21"/>
+          <w:szCs w:val="21"/>
+        </w:rPr>
+        <w:t xml:space="preserve">. Both are public by design (the anon key ships in the browser; RLS protects the data), so they are safe to share. </w:t>
+      </w:r>
+      <w:r>
+        <w:rPr>
+          <w:rFonts w:ascii="Consolas" w:cs="Consolas" w:eastAsia="Consolas" w:hAnsi="Consolas"/>
+          <w:color w:val="5F6F68"/>
+          <w:sz w:val="18"/>
+          <w:szCs w:val="18"/>
+        </w:rPr>
+        <w:t xml:space="preserve">.env</w:t>
+      </w:r>
+      <w:r>
+        <w:rPr>
+          <w:rFonts w:ascii="Calibri" w:cs="Calibri" w:eastAsia="Calibri" w:hAnsi="Calibri"/>
+          <w:color w:val="2B3A34"/>
+          <w:sz w:val="21"/>
+          <w:szCs w:val="21"/>
+        </w:rPr>
+        <w:t xml:space="preserve"> is git-ignored, so a fresh clone won't include it.</w:t>
+      </w:r>
+    </w:p>
+    <w:p>
+      <w:pPr>
+        <w:pStyle w:val="Heading3"/>
+        <w:spacing w:after="60" w:before="240"/>
+      </w:pPr>
+      <w:r>
+        <w:rPr>
+          <w:rFonts w:ascii="Calibri" w:cs="Calibri" w:eastAsia="Calibri" w:hAnsi="Calibri"/>
+          <w:b/>
+          <w:bCs/>
+          <w:color w:val="0F6E56"/>
+          <w:sz w:val="21"/>
+          <w:szCs w:val="21"/>
+        </w:rPr>
+        <w:t xml:space="preserve">Share it with someone</w:t>
       </w:r>
     </w:p>
     <w:p>
@@ -5007,74 +4694,16 @@
           <w:sz w:val="21"/>
           <w:szCs w:val="21"/>
         </w:rPr>
-        <w:t xml:space="preserve">A live link: </w:t>
-      </w:r>
-      <w:r>
-        <w:rPr>
-          <w:rFonts w:ascii="Consolas" w:cs="Consolas" w:eastAsia="Consolas" w:hAnsi="Consolas"/>
-          <w:color w:val="0E3D33"/>
-          <w:sz w:val="19"/>
-          <w:szCs w:val="19"/>
-          <w:shd w:fill="EEF3F1" w:val="clear"/>
-        </w:rPr>
-        <w:t xml:space="preserve">localhost</w:t>
-      </w:r>
-      <w:r>
-        <w:rPr>
-          <w:rFonts w:ascii="Calibri" w:cs="Calibri" w:eastAsia="Calibri" w:hAnsi="Calibri"/>
-          <w:color w:val="2B3A34"/>
-          <w:sz w:val="21"/>
-          <w:szCs w:val="21"/>
-        </w:rPr>
-        <w:t xml:space="preserve"> only exists on your machine — no one else can reach it. To hand out a URL, </w:t>
-      </w:r>
-      <w:r>
-        <w:rPr>
-          <w:rFonts w:ascii="Calibri" w:cs="Calibri" w:eastAsia="Calibri" w:hAnsi="Calibri"/>
-          <w:b/>
-          <w:bCs/>
-          <w:color w:val="12201C"/>
-          <w:sz w:val="21"/>
-          <w:szCs w:val="21"/>
-        </w:rPr>
-        <w:t xml:space="preserve">deploy</w:t>
-      </w:r>
-      <w:r>
-        <w:rPr>
-          <w:rFonts w:ascii="Calibri" w:cs="Calibri" w:eastAsia="Calibri" w:hAnsi="Calibri"/>
-          <w:color w:val="2B3A34"/>
-          <w:sz w:val="21"/>
-          <w:szCs w:val="21"/>
-        </w:rPr>
-        <w:t xml:space="preserve"> the app (it targets Cloudflare Workers) for a public link that needs no setup from the visitor.</w:t>
-      </w:r>
-    </w:p>
-    <w:p>
-      <w:pPr>
-        <w:pStyle w:val="Heading2"/>
-        <w:spacing w:after="100" w:before="320"/>
-      </w:pPr>
-      <w:r>
-        <w:rPr>
-          <w:rFonts w:ascii="Calibri" w:cs="Calibri" w:eastAsia="Calibri" w:hAnsi="Calibri"/>
-          <w:b/>
-          <w:bCs/>
-          <w:color w:val="B8860B"/>
-          <w:sz w:val="24"/>
-          <w:szCs w:val="24"/>
-        </w:rPr>
-        <w:t xml:space="preserve">08  </w:t>
-      </w:r>
-      <w:r>
-        <w:rPr>
-          <w:rFonts w:ascii="Calibri" w:cs="Calibri" w:eastAsia="Calibri" w:hAnsi="Calibri"/>
-          <w:b/>
-          <w:bCs/>
-          <w:color w:val="0E3D33"/>
-          <w:sz w:val="24"/>
-          <w:szCs w:val="24"/>
-        </w:rPr>
-        <w:t xml:space="preserve">Companion documents</w:t>
+        <w:t xml:space="preserve">They run the code: </w:t>
+      </w:r>
+      <w:r>
+        <w:rPr>
+          <w:rFonts w:ascii="Calibri" w:cs="Calibri" w:eastAsia="Calibri" w:hAnsi="Calibri"/>
+          <w:color w:val="2B3A34"/>
+          <w:sz w:val="21"/>
+          <w:szCs w:val="21"/>
+        </w:rPr>
+        <w:t xml:space="preserve">give them the repo plus your two .env values; npm install &amp;&amp; npm run dev and they're on the same Supabase (migrations already applied).</w:t>
       </w:r>
     </w:p>
     <w:p>
@@ -5095,26 +4724,44 @@
           <w:sz w:val="21"/>
           <w:szCs w:val="21"/>
         </w:rPr>
-        <w:t xml:space="preserve">Solution Architecture — </w:t>
-      </w:r>
-      <w:r>
-        <w:rPr>
-          <w:rFonts w:ascii="Consolas" w:cs="Consolas" w:eastAsia="Consolas" w:hAnsi="Consolas"/>
+        <w:t xml:space="preserve">A live link: </w:t>
+      </w:r>
+      <w:r>
+        <w:rPr>
+          <w:rFonts w:ascii="Calibri" w:cs="Calibri" w:eastAsia="Calibri" w:hAnsi="Calibri"/>
+          <w:color w:val="2B3A34"/>
+          <w:sz w:val="21"/>
+          <w:szCs w:val="21"/>
+        </w:rPr>
+        <w:t xml:space="preserve">localhost only exists on your machine. To hand out a URL, deploy the app (it targets Cloudflare Workers) for a public link that needs no setup from the visitor.</w:t>
+      </w:r>
+    </w:p>
+    <w:p>
+      <w:pPr>
+        <w:pStyle w:val="Heading2"/>
+        <w:spacing w:after="100" w:before="340"/>
+      </w:pPr>
+      <w:r>
+        <w:rPr>
+          <w:rFonts w:ascii="Calibri" w:cs="Calibri" w:eastAsia="Calibri" w:hAnsi="Calibri"/>
+          <w:b/>
+          <w:bCs/>
+          <w:color w:val="B8860B"/>
+          <w:sz w:val="24"/>
+          <w:szCs w:val="24"/>
+        </w:rPr>
+        <w:t xml:space="preserve">08  </w:t>
+      </w:r>
+      <w:r>
+        <w:rPr>
+          <w:rFonts w:ascii="Calibri" w:cs="Calibri" w:eastAsia="Calibri" w:hAnsi="Calibri"/>
+          <w:b/>
+          <w:bCs/>
           <w:color w:val="0E3D33"/>
-          <w:sz w:val="19"/>
-          <w:szCs w:val="19"/>
-          <w:shd w:fill="EEF3F1" w:val="clear"/>
-        </w:rPr>
-        <w:t xml:space="preserve">docs/casai-solution-architecture.html</w:t>
-      </w:r>
-      <w:r>
-        <w:rPr>
-          <w:rFonts w:ascii="Calibri" w:cs="Calibri" w:eastAsia="Calibri" w:hAnsi="Calibri"/>
-          <w:color w:val="2B3A34"/>
-          <w:sz w:val="21"/>
-          <w:szCs w:val="21"/>
-        </w:rPr>
-        <w:t xml:space="preserve"> — bounded contexts, backend stack, C4 diagrams, data model, key flows, ADRs.</w:t>
+          <w:sz w:val="24"/>
+          <w:szCs w:val="24"/>
+        </w:rPr>
+        <w:t xml:space="preserve">Companion documents</w:t>
       </w:r>
     </w:p>
     <w:p>
@@ -5135,39 +4782,114 @@
           <w:sz w:val="21"/>
           <w:szCs w:val="21"/>
         </w:rPr>
-        <w:t xml:space="preserve">Phased Delivery Plan — </w:t>
-      </w:r>
-      <w:r>
-        <w:rPr>
-          <w:rFonts w:ascii="Consolas" w:cs="Consolas" w:eastAsia="Consolas" w:hAnsi="Consolas"/>
-          <w:color w:val="0E3D33"/>
-          <w:sz w:val="19"/>
-          <w:szCs w:val="19"/>
-          <w:shd w:fill="EEF3F1" w:val="clear"/>
-        </w:rPr>
-        <w:t xml:space="preserve">docs/casai-mvp-delivery-plan.html</w:t>
-      </w:r>
-      <w:r>
-        <w:rPr>
-          <w:rFonts w:ascii="Calibri" w:cs="Calibri" w:eastAsia="Calibri" w:hAnsi="Calibri"/>
-          <w:color w:val="2B3A34"/>
-          <w:sz w:val="21"/>
-          <w:szCs w:val="21"/>
-        </w:rPr>
-        <w:t xml:space="preserve"> — six phases sequenced by dependency and risk, with scope in/out and long-lead items.</w:t>
-      </w:r>
-    </w:p>
-    <w:p>
-      <w:pPr>
-        <w:spacing w:after="40"/>
-      </w:pPr>
+        <w:t xml:space="preserve">Solution Architecture</w:t>
+      </w:r>
+      <w:r>
+        <w:rPr>
+          <w:rFonts w:ascii="Calibri" w:cs="Calibri" w:eastAsia="Calibri" w:hAnsi="Calibri"/>
+          <w:color w:val="2B3A34"/>
+          <w:sz w:val="21"/>
+          <w:szCs w:val="21"/>
+        </w:rPr>
+        <w:t xml:space="preserve"> — docs/casai-solution-architecture.html — bounded contexts, backend stack, C4 diagrams, data model, key flows, ADRs.</w:t>
+      </w:r>
+    </w:p>
+    <w:p>
+      <w:pPr>
+        <w:pStyle w:val="ListParagraph"/>
+        <w:numPr>
+          <w:ilvl w:val="0"/>
+          <w:numId w:val="1"/>
+        </w:numPr>
+        <w:spacing w:after="60"/>
+      </w:pPr>
+      <w:r>
+        <w:rPr>
+          <w:rFonts w:ascii="Calibri" w:cs="Calibri" w:eastAsia="Calibri" w:hAnsi="Calibri"/>
+          <w:b/>
+          <w:bCs/>
+          <w:color w:val="12201C"/>
+          <w:sz w:val="21"/>
+          <w:szCs w:val="21"/>
+        </w:rPr>
+        <w:t xml:space="preserve">Phased Delivery Plan</w:t>
+      </w:r>
+      <w:r>
+        <w:rPr>
+          <w:rFonts w:ascii="Calibri" w:cs="Calibri" w:eastAsia="Calibri" w:hAnsi="Calibri"/>
+          <w:color w:val="2B3A34"/>
+          <w:sz w:val="21"/>
+          <w:szCs w:val="21"/>
+        </w:rPr>
+        <w:t xml:space="preserve"> — docs/casai-mvp-delivery-plan.html — six phases sequenced by dependency and risk, with scope in/out and long-lead items.</w:t>
+      </w:r>
+    </w:p>
+    <w:p>
+      <w:pPr>
+        <w:pStyle w:val="ListParagraph"/>
+        <w:numPr>
+          <w:ilvl w:val="0"/>
+          <w:numId w:val="1"/>
+        </w:numPr>
+        <w:spacing w:after="60"/>
+      </w:pPr>
+      <w:r>
+        <w:rPr>
+          <w:rFonts w:ascii="Calibri" w:cs="Calibri" w:eastAsia="Calibri" w:hAnsi="Calibri"/>
+          <w:b/>
+          <w:bCs/>
+          <w:color w:val="12201C"/>
+          <w:sz w:val="21"/>
+          <w:szCs w:val="21"/>
+        </w:rPr>
+        <w:t xml:space="preserve">From Heuristic to Model</w:t>
+      </w:r>
+      <w:r>
+        <w:rPr>
+          <w:rFonts w:ascii="Calibri" w:cs="Calibri" w:eastAsia="Calibri" w:hAnsi="Calibri"/>
+          <w:color w:val="2B3A34"/>
+          <w:sz w:val="21"/>
+          <w:szCs w:val="21"/>
+        </w:rPr>
+        <w:t xml:space="preserve"> — docs/Casai-No-Show-Heuristic-to-Model.docx — how the live no-show heuristic is engineered to be replaced by a trained model: flow, contract and tech stack.</w:t>
+      </w:r>
+    </w:p>
+    <w:p>
+      <w:pPr>
+        <w:pStyle w:val="ListParagraph"/>
+        <w:numPr>
+          <w:ilvl w:val="0"/>
+          <w:numId w:val="1"/>
+        </w:numPr>
+        <w:spacing w:after="60"/>
+      </w:pPr>
+      <w:r>
+        <w:rPr>
+          <w:rFonts w:ascii="Calibri" w:cs="Calibri" w:eastAsia="Calibri" w:hAnsi="Calibri"/>
+          <w:b/>
+          <w:bCs/>
+          <w:color w:val="12201C"/>
+          <w:sz w:val="21"/>
+          <w:szCs w:val="21"/>
+        </w:rPr>
+        <w:t xml:space="preserve">AI Capability Strategy</w:t>
+      </w:r>
+      <w:r>
+        <w:rPr>
+          <w:rFonts w:ascii="Calibri" w:cs="Calibri" w:eastAsia="Calibri" w:hAnsi="Calibri"/>
+          <w:color w:val="2B3A34"/>
+          <w:sz w:val="21"/>
+          <w:szCs w:val="21"/>
+        </w:rPr>
+        <w:t xml:space="preserve"> — docs/Casai-AI-Capability-Strategy.docx — market gaps (Urban Company, Snabbit, Pronto) and the ranked AI capabilities Casai can own.</w:t>
+      </w:r>
     </w:p>
     <w:p>
       <w:pPr>
         <w:pBdr>
           <w:top w:val="single" w:color="D9DEDB" w:sz="4"/>
         </w:pBdr>
-        <w:spacing w:before="200"/>
+        <w:spacing w:before="220"/>
       </w:pPr>
       <w:r>
         <w:rPr>

</xml_diff>

<commit_message>
docs(no-show): fold in the pre-slot confirmation checkpoint
- Current-State: counts refreshed to 13 migrations / 75 tests; a Live row
  for the "are you coming?" checkpoint; an "Acting before the slot"
  paragraph in the spotlight; evidence bullet now 15 dedicated tests.
- Heuristic→model: the timing edge case is marked built — the in-app
  confirmation card, decline-arms-now, and silence-counts behaviour — with
  push/SMS, live travel-time and a background timer still to come.
</commit_message>
<xml_diff>
--- a/docs/Casai-Current-State.docx
+++ b/docs/Casai-Current-State.docx
@@ -130,7 +130,7 @@
           <w:sz w:val="21"/>
           <w:szCs w:val="21"/>
         </w:rPr>
-        <w:t xml:space="preserve">68</w:t>
+        <w:t xml:space="preserve">75</w:t>
       </w:r>
     </w:p>
     <w:p>
@@ -230,7 +230,7 @@
           <w:sz w:val="21"/>
           <w:szCs w:val="21"/>
         </w:rPr>
-        <w:t xml:space="preserve">4 live contexts   ·   12 DB migrations   ·   68 passing tests   ·   CI green</w:t>
+        <w:t xml:space="preserve">4 live contexts   ·   13 DB migrations   ·   75 passing tests   ·   CI green</w:t>
       </w:r>
     </w:p>
     <w:p>
@@ -1609,6 +1609,81 @@
           </w:p>
         </w:tc>
       </w:tr>
+      <w:tr>
+        <w:tc>
+          <w:tcPr>
+            <w:tcW w:type="dxa" w:w="5400"/>
+            <w:shd w:fill="FFFFFF" w:val="clear"/>
+            <w:tcMar>
+              <w:top w:type="dxa" w:w="50"/>
+              <w:left w:type="dxa" w:w="110"/>
+              <w:bottom w:type="dxa" w:w="50"/>
+              <w:right w:type="dxa" w:w="110"/>
+            </w:tcMar>
+          </w:tcPr>
+          <w:p>
+            <w:r>
+              <w:rPr>
+                <w:rFonts w:ascii="Calibri" w:cs="Calibri" w:eastAsia="Calibri" w:hAnsi="Calibri"/>
+                <w:b/>
+                <w:bCs/>
+                <w:color w:val="1E8A5A"/>
+                <w:sz w:val="21"/>
+                <w:szCs w:val="21"/>
+              </w:rPr>
+              <w:t xml:space="preserve">Pre-slot “are you coming?” checkpoint (worker confirm + T-45 auto-arm)</w:t>
+            </w:r>
+          </w:p>
+        </w:tc>
+        <w:tc>
+          <w:tcPr>
+            <w:tcW w:type="dxa" w:w="1900"/>
+            <w:shd w:fill="FFFFFF" w:val="clear"/>
+            <w:tcMar>
+              <w:top w:type="dxa" w:w="50"/>
+              <w:left w:type="dxa" w:w="110"/>
+              <w:bottom w:type="dxa" w:w="50"/>
+              <w:right w:type="dxa" w:w="110"/>
+            </w:tcMar>
+          </w:tcPr>
+          <w:p>
+            <w:r>
+              <w:rPr>
+                <w:rFonts w:ascii="Consolas" w:cs="Consolas" w:eastAsia="Consolas" w:hAnsi="Consolas"/>
+                <w:color w:val="5F6F68"/>
+                <w:sz w:val="18"/>
+                <w:szCs w:val="18"/>
+              </w:rPr>
+              <w:t xml:space="preserve">AI-02</w:t>
+            </w:r>
+          </w:p>
+        </w:tc>
+        <w:tc>
+          <w:tcPr>
+            <w:tcW w:type="dxa" w:w="2060"/>
+            <w:shd w:fill="FFFFFF" w:val="clear"/>
+            <w:tcMar>
+              <w:top w:type="dxa" w:w="50"/>
+              <w:left w:type="dxa" w:w="110"/>
+              <w:bottom w:type="dxa" w:w="50"/>
+              <w:right w:type="dxa" w:w="110"/>
+            </w:tcMar>
+          </w:tcPr>
+          <w:p>
+            <w:r>
+              <w:rPr>
+                <w:rFonts w:ascii="Calibri" w:cs="Calibri" w:eastAsia="Calibri" w:hAnsi="Calibri"/>
+                <w:b/>
+                <w:bCs/>
+                <w:color w:val="1E8A5A"/>
+                <w:sz w:val="18"/>
+                <w:szCs w:val="18"/>
+              </w:rPr>
+              <w:t xml:space="preserve">Live</w:t>
+            </w:r>
+          </w:p>
+        </w:tc>
+      </w:tr>
     </w:tbl>
     <w:p>
       <w:pPr>
@@ -3489,6 +3564,71 @@
     </w:p>
     <w:p>
       <w:pPr>
+        <w:spacing w:after="120" w:line="276"/>
+      </w:pPr>
+      <w:r>
+        <w:rPr>
+          <w:rFonts w:ascii="Calibri" w:cs="Calibri" w:eastAsia="Calibri" w:hAnsi="Calibri"/>
+          <w:b/>
+          <w:bCs/>
+          <w:color w:val="12201C"/>
+          <w:sz w:val="21"/>
+          <w:szCs w:val="21"/>
+        </w:rPr>
+        <w:t xml:space="preserve">Acting before the slot.  </w:t>
+      </w:r>
+      <w:r>
+        <w:rPr>
+          <w:rFonts w:ascii="Calibri" w:cs="Calibri" w:eastAsia="Calibri" w:hAnsi="Calibri"/>
+          <w:color w:val="2B3A34"/>
+          <w:sz w:val="21"/>
+          <w:szCs w:val="21"/>
+        </w:rPr>
+        <w:t xml:space="preserve">Reacting at the slot is too late — a backup can't travel in time. So the loop now starts earlier: the assigned worker gets a </w:t>
+      </w:r>
+      <w:r>
+        <w:rPr>
+          <w:rFonts w:ascii="Calibri" w:cs="Calibri" w:eastAsia="Calibri" w:hAnsi="Calibri"/>
+          <w:b/>
+          <w:bCs/>
+          <w:color w:val="12201C"/>
+          <w:sz w:val="21"/>
+          <w:szCs w:val="21"/>
+        </w:rPr>
+        <w:t xml:space="preserve">“are you coming?” checkpoint</w:t>
+      </w:r>
+      <w:r>
+        <w:rPr>
+          <w:rFonts w:ascii="Calibri" w:cs="Calibri" w:eastAsia="Calibri" w:hAnsi="Calibri"/>
+          <w:color w:val="2B3A34"/>
+          <w:sz w:val="21"/>
+          <w:szCs w:val="21"/>
+        </w:rPr>
+        <w:t xml:space="preserve"> ahead of the slot. A decline arms a backup immediately (full lead time), and if the worker doesn't answer by the cutoff the checkpoint treats silence as risk and arms one anyway — so the standby is on its way </w:t>
+      </w:r>
+      <w:r>
+        <w:rPr>
+          <w:rFonts w:ascii="Calibri" w:cs="Calibri" w:eastAsia="Calibri" w:hAnsi="Calibri"/>
+          <w:i/>
+          <w:iCs/>
+          <w:color w:val="2B3A34"/>
+          <w:sz w:val="21"/>
+          <w:szCs w:val="21"/>
+        </w:rPr>
+        <w:t xml:space="preserve">before</w:t>
+      </w:r>
+      <w:r>
+        <w:rPr>
+          <w:rFonts w:ascii="Calibri" w:cs="Calibri" w:eastAsia="Calibri" w:hAnsi="Calibri"/>
+          <w:color w:val="2B3A34"/>
+          <w:sz w:val="21"/>
+          <w:szCs w:val="21"/>
+        </w:rPr>
+        <w:t xml:space="preserve"> the household is ever left stuck.</w:t>
+      </w:r>
+    </w:p>
+    <w:p>
+      <w:pPr>
         <w:pStyle w:val="ListParagraph"/>
         <w:numPr>
           <w:ilvl w:val="0"/>
@@ -3514,7 +3654,7 @@
           <w:sz w:val="21"/>
           <w:szCs w:val="21"/>
         </w:rPr>
-        <w:t xml:space="preserve">Meena scored 5% (97% reliable), Anjali reserved as backup and promoted into the slot on a no-show — plus 8 dedicated tests for score, reservation and promotion.</w:t>
+        <w:t xml:space="preserve">Meena scored 5% (97% reliable), Anjali reserved as backup and promoted on a no-show, and the confirmation checkpoint expired a silent booking and armed a backup — across 15 dedicated tests (score, reservation, promotion, confirmation).</w:t>
       </w:r>
     </w:p>
     <w:p>
@@ -3920,7 +4060,7 @@
           <w:sz w:val="21"/>
           <w:szCs w:val="21"/>
         </w:rPr>
-        <w:t xml:space="preserve"> scores from real signals, reserves a genuinely free backup, and promotes it on a no-show — and cannot promote to an unverified worker. Eight dedicated tests.</w:t>
+        <w:t xml:space="preserve"> scores from real signals, reserves a genuinely free backup, promotes it on a no-show, and — via the pre-slot confirmation checkpoint — arms one early on a worker's decline or silence. Cannot promote to an unverified worker. Fifteen dedicated tests.</w:t>
       </w:r>
     </w:p>
     <w:p>

</xml_diff>

<commit_message>
docs: fold Continuity Memory into current-state
Counts refreshed to 14 migrations / 82 tests; a Live row for Continuity
Memory; a "know before you go" spotlight; an evidence bullet noting the
private-to-the-home guarantee and the null-safe guard fix.
</commit_message>
<xml_diff>
--- a/docs/Casai-Current-State.docx
+++ b/docs/Casai-Current-State.docx
@@ -130,7 +130,7 @@
           <w:sz w:val="21"/>
           <w:szCs w:val="21"/>
         </w:rPr>
-        <w:t xml:space="preserve">75</w:t>
+        <w:t xml:space="preserve">82</w:t>
       </w:r>
     </w:p>
     <w:p>
@@ -230,7 +230,7 @@
           <w:sz w:val="21"/>
           <w:szCs w:val="21"/>
         </w:rPr>
-        <w:t xml:space="preserve">4 live contexts   ·   13 DB migrations   ·   75 passing tests   ·   CI green</w:t>
+        <w:t xml:space="preserve">4 live contexts   ·   14 DB migrations   ·   82 passing tests   ·   CI green</w:t>
       </w:r>
     </w:p>
     <w:p>
@@ -1684,6 +1684,81 @@
           </w:p>
         </w:tc>
       </w:tr>
+      <w:tr>
+        <w:tc>
+          <w:tcPr>
+            <w:tcW w:type="dxa" w:w="5400"/>
+            <w:shd w:fill="F4F7F5" w:val="clear"/>
+            <w:tcMar>
+              <w:top w:type="dxa" w:w="50"/>
+              <w:left w:type="dxa" w:w="110"/>
+              <w:bottom w:type="dxa" w:w="50"/>
+              <w:right w:type="dxa" w:w="110"/>
+            </w:tcMar>
+          </w:tcPr>
+          <w:p>
+            <w:r>
+              <w:rPr>
+                <w:rFonts w:ascii="Calibri" w:cs="Calibri" w:eastAsia="Calibri" w:hAnsi="Calibri"/>
+                <w:b/>
+                <w:bCs/>
+                <w:color w:val="1E8A5A"/>
+                <w:sz w:val="21"/>
+                <w:szCs w:val="21"/>
+              </w:rPr>
+              <w:t xml:space="preserve">Continuity Memory — home profile + worker “before you arrive” brief</w:t>
+            </w:r>
+          </w:p>
+        </w:tc>
+        <w:tc>
+          <w:tcPr>
+            <w:tcW w:type="dxa" w:w="1900"/>
+            <w:shd w:fill="F4F7F5" w:val="clear"/>
+            <w:tcMar>
+              <w:top w:type="dxa" w:w="50"/>
+              <w:left w:type="dxa" w:w="110"/>
+              <w:bottom w:type="dxa" w:w="50"/>
+              <w:right w:type="dxa" w:w="110"/>
+            </w:tcMar>
+          </w:tcPr>
+          <w:p>
+            <w:r>
+              <w:rPr>
+                <w:rFonts w:ascii="Consolas" w:cs="Consolas" w:eastAsia="Consolas" w:hAnsi="Consolas"/>
+                <w:color w:val="5F6F68"/>
+                <w:sz w:val="18"/>
+                <w:szCs w:val="18"/>
+              </w:rPr>
+              <w:t xml:space="preserve">Continuity</w:t>
+            </w:r>
+          </w:p>
+        </w:tc>
+        <w:tc>
+          <w:tcPr>
+            <w:tcW w:type="dxa" w:w="2060"/>
+            <w:shd w:fill="F4F7F5" w:val="clear"/>
+            <w:tcMar>
+              <w:top w:type="dxa" w:w="50"/>
+              <w:left w:type="dxa" w:w="110"/>
+              <w:bottom w:type="dxa" w:w="50"/>
+              <w:right w:type="dxa" w:w="110"/>
+            </w:tcMar>
+          </w:tcPr>
+          <w:p>
+            <w:r>
+              <w:rPr>
+                <w:rFonts w:ascii="Calibri" w:cs="Calibri" w:eastAsia="Calibri" w:hAnsi="Calibri"/>
+                <w:b/>
+                <w:bCs/>
+                <w:color w:val="1E8A5A"/>
+                <w:sz w:val="18"/>
+                <w:szCs w:val="18"/>
+              </w:rPr>
+              <w:t xml:space="preserve">Live</w:t>
+            </w:r>
+          </w:p>
+        </w:tc>
+      </w:tr>
     </w:tbl>
     <w:p>
       <w:pPr>
@@ -3659,6 +3734,131 @@
     </w:p>
     <w:p>
       <w:pPr>
+        <w:pStyle w:val="Heading3"/>
+        <w:spacing w:after="60" w:before="240"/>
+      </w:pPr>
+      <w:r>
+        <w:rPr>
+          <w:rFonts w:ascii="Calibri" w:cs="Calibri" w:eastAsia="Calibri" w:hAnsi="Calibri"/>
+          <w:b/>
+          <w:bCs/>
+          <w:color w:val="0F6E56"/>
+          <w:sz w:val="21"/>
+          <w:szCs w:val="21"/>
+        </w:rPr>
+        <w:t xml:space="preserve">Spotlight — Continuity Memory (know before you go)</w:t>
+      </w:r>
+    </w:p>
+    <w:p>
+      <w:pPr>
+        <w:spacing w:after="120" w:line="276"/>
+      </w:pPr>
+      <w:r>
+        <w:rPr>
+          <w:rFonts w:ascii="Calibri" w:cs="Calibri" w:eastAsia="Calibri" w:hAnsi="Calibri"/>
+          <w:color w:val="2B3A34"/>
+          <w:sz w:val="21"/>
+          <w:szCs w:val="21"/>
+        </w:rPr>
+        <w:t xml:space="preserve">The second AI capability makes the backup useful, not just available. A household records its home once on the </w:t>
+      </w:r>
+      <w:r>
+        <w:rPr>
+          <w:rFonts w:ascii="Calibri" w:cs="Calibri" w:eastAsia="Calibri" w:hAnsi="Calibri"/>
+          <w:b/>
+          <w:bCs/>
+          <w:color w:val="12201C"/>
+          <w:sz w:val="21"/>
+          <w:szCs w:val="21"/>
+        </w:rPr>
+        <w:t xml:space="preserve">My home</w:t>
+      </w:r>
+      <w:r>
+        <w:rPr>
+          <w:rFonts w:ascii="Calibri" w:cs="Calibri" w:eastAsia="Calibri" w:hAnsi="Calibri"/>
+          <w:color w:val="2B3A34"/>
+          <w:sz w:val="21"/>
+          <w:szCs w:val="21"/>
+        </w:rPr>
+        <w:t xml:space="preserve"> screen — dietary rules, how to get in, routines, do's and don'ts. Whoever is then assigned to a booking — the regular worker </w:t>
+      </w:r>
+      <w:r>
+        <w:rPr>
+          <w:rFonts w:ascii="Calibri" w:cs="Calibri" w:eastAsia="Calibri" w:hAnsi="Calibri"/>
+          <w:i/>
+          <w:iCs/>
+          <w:color w:val="2B3A34"/>
+          <w:sz w:val="21"/>
+          <w:szCs w:val="21"/>
+        </w:rPr>
+        <w:t xml:space="preserve">or</w:t>
+      </w:r>
+      <w:r>
+        <w:rPr>
+          <w:rFonts w:ascii="Calibri" w:cs="Calibri" w:eastAsia="Calibri" w:hAnsi="Calibri"/>
+          <w:color w:val="2B3A34"/>
+          <w:sz w:val="21"/>
+          <w:szCs w:val="21"/>
+        </w:rPr>
+        <w:t xml:space="preserve"> a promoted backup — sees a </w:t>
+      </w:r>
+      <w:r>
+        <w:rPr>
+          <w:rFonts w:ascii="Calibri" w:cs="Calibri" w:eastAsia="Calibri" w:hAnsi="Calibri"/>
+          <w:b/>
+          <w:bCs/>
+          <w:color w:val="12201C"/>
+          <w:sz w:val="21"/>
+          <w:szCs w:val="21"/>
+        </w:rPr>
+        <w:t xml:space="preserve">“before you arrive” brief</w:t>
+      </w:r>
+      <w:r>
+        <w:rPr>
+          <w:rFonts w:ascii="Calibri" w:cs="Calibri" w:eastAsia="Calibri" w:hAnsi="Calibri"/>
+          <w:color w:val="2B3A34"/>
+          <w:sz w:val="21"/>
+          <w:szCs w:val="21"/>
+        </w:rPr>
+        <w:t xml:space="preserve"> for that home. So a swap-in isn't a stranger: they already know it's a Jain kitchen, that the gate code is 4321, and that father's medicine is at 8am.</w:t>
+      </w:r>
+    </w:p>
+    <w:p>
+      <w:pPr>
+        <w:spacing w:after="120" w:line="276"/>
+      </w:pPr>
+      <w:r>
+        <w:rPr>
+          <w:rFonts w:ascii="Calibri" w:cs="Calibri" w:eastAsia="Calibri" w:hAnsi="Calibri"/>
+          <w:color w:val="2B3A34"/>
+          <w:sz w:val="21"/>
+          <w:szCs w:val="21"/>
+        </w:rPr>
+        <w:t xml:space="preserve">The privacy is enforced in the database, not the UI: a worker can never read the preferences table, and the brief reaches only the worker actually assigned to a booking (primary or backup), the household, or ops. </w:t>
+      </w:r>
+      <w:r>
+        <w:rPr>
+          <w:rFonts w:ascii="Calibri" w:cs="Calibri" w:eastAsia="Calibri" w:hAnsi="Calibri"/>
+          <w:b/>
+          <w:bCs/>
+          <w:color w:val="12201C"/>
+          <w:sz w:val="21"/>
+          <w:szCs w:val="21"/>
+        </w:rPr>
+        <w:t xml:space="preserve">v0 is rule-based</w:t>
+      </w:r>
+      <w:r>
+        <w:rPr>
+          <w:rFonts w:ascii="Calibri" w:cs="Calibri" w:eastAsia="Calibri" w:hAnsi="Calibri"/>
+          <w:color w:val="2B3A34"/>
+          <w:sz w:val="21"/>
+          <w:szCs w:val="21"/>
+        </w:rPr>
+        <w:t xml:space="preserve"> (the structured fields, surfaced cleanly); v1 will use an LLM to turn messy notes into natural prose behind the same function.</w:t>
+      </w:r>
+    </w:p>
+    <w:p>
+      <w:pPr>
         <w:pStyle w:val="Heading2"/>
         <w:spacing w:after="100" w:before="340"/>
       </w:pPr>
@@ -4061,6 +4261,36 @@
           <w:szCs w:val="21"/>
         </w:rPr>
         <w:t xml:space="preserve"> scores from real signals, reserves a genuinely free backup, promotes it on a no-show, and — via the pre-slot confirmation checkpoint — arms one early on a worker's decline or silence. Cannot promote to an unverified worker. Fifteen dedicated tests.</w:t>
+      </w:r>
+    </w:p>
+    <w:p>
+      <w:pPr>
+        <w:pStyle w:val="ListParagraph"/>
+        <w:numPr>
+          <w:ilvl w:val="0"/>
+          <w:numId w:val="1"/>
+        </w:numPr>
+        <w:spacing w:after="60"/>
+      </w:pPr>
+      <w:r>
+        <w:rPr>
+          <w:rFonts w:ascii="Calibri" w:cs="Calibri" w:eastAsia="Calibri" w:hAnsi="Calibri"/>
+          <w:b/>
+          <w:bCs/>
+          <w:color w:val="12201C"/>
+          <w:sz w:val="21"/>
+          <w:szCs w:val="21"/>
+        </w:rPr>
+        <w:t xml:space="preserve">Continuity Memory</w:t>
+      </w:r>
+      <w:r>
+        <w:rPr>
+          <w:rFonts w:ascii="Calibri" w:cs="Calibri" w:eastAsia="Calibri" w:hAnsi="Calibri"/>
+          <w:color w:val="2B3A34"/>
+          <w:sz w:val="21"/>
+          <w:szCs w:val="21"/>
+        </w:rPr>
+        <w:t xml:space="preserve"> keeps a home's context private to that home — no worker can read the table — yet surfaces a brief to the worker actually assigned, primary or backup. A null-safe guard fix (caught by a test) closed a leak that would have handed the gate code to any worker.</w:t>
       </w:r>
     </w:p>
     <w:p>

</xml_diff>

<commit_message>
docs: fold guest passcode access into current-state
Counts refreshed to 16 migrations / 88 tests, and a "for reviewers — every
context is one passcode away" note in section 07: the Guest user passcode
gate (household / worker / NRI) plus admin, with the reminder that the role
is still assigned server-side.
</commit_message>
<xml_diff>
--- a/docs/Casai-Current-State.docx
+++ b/docs/Casai-Current-State.docx
@@ -130,7 +130,7 @@
           <w:sz w:val="21"/>
           <w:szCs w:val="21"/>
         </w:rPr>
-        <w:t xml:space="preserve">82</w:t>
+        <w:t xml:space="preserve">88</w:t>
       </w:r>
     </w:p>
     <w:p>
@@ -230,7 +230,7 @@
           <w:sz w:val="21"/>
           <w:szCs w:val="21"/>
         </w:rPr>
-        <w:t xml:space="preserve">4 live contexts   ·   14 DB migrations   ·   82 passing tests   ·   CI green</w:t>
+        <w:t xml:space="preserve">4 live contexts   ·   16 DB migrations   ·   88 passing tests   ·   CI green</w:t>
       </w:r>
     </w:p>
     <w:p>
@@ -5027,6 +5027,249 @@
           <w:szCs w:val="21"/>
         </w:rPr>
         <w:t xml:space="preserve"> is git-ignored, so a fresh clone won't include it.</w:t>
+      </w:r>
+    </w:p>
+    <w:p>
+      <w:pPr>
+        <w:pStyle w:val="Heading3"/>
+        <w:spacing w:after="60" w:before="240"/>
+      </w:pPr>
+      <w:r>
+        <w:rPr>
+          <w:rFonts w:ascii="Calibri" w:cs="Calibri" w:eastAsia="Calibri" w:hAnsi="Calibri"/>
+          <w:b/>
+          <w:bCs/>
+          <w:color w:val="0F6E56"/>
+          <w:sz w:val="21"/>
+          <w:szCs w:val="21"/>
+        </w:rPr>
+        <w:t xml:space="preserve">For reviewers — every context is one passcode away</w:t>
+      </w:r>
+    </w:p>
+    <w:p>
+      <w:pPr>
+        <w:spacing w:after="120" w:line="276"/>
+      </w:pPr>
+      <w:r>
+        <w:rPr>
+          <w:rFonts w:ascii="Calibri" w:cs="Calibri" w:eastAsia="Calibri" w:hAnsi="Calibri"/>
+          <w:color w:val="2B3A34"/>
+          <w:sz w:val="21"/>
+          <w:szCs w:val="21"/>
+        </w:rPr>
+        <w:t xml:space="preserve">No signup, onboarding or ops-verification is needed to explore any context. On the landing page, </w:t>
+      </w:r>
+      <w:r>
+        <w:rPr>
+          <w:rFonts w:ascii="Calibri" w:cs="Calibri" w:eastAsia="Calibri" w:hAnsi="Calibri"/>
+          <w:b/>
+          <w:bCs/>
+          <w:color w:val="12201C"/>
+          <w:sz w:val="21"/>
+          <w:szCs w:val="21"/>
+        </w:rPr>
+        <w:t xml:space="preserve">Guest user</w:t>
+      </w:r>
+      <w:r>
+        <w:rPr>
+          <w:rFonts w:ascii="Calibri" w:cs="Calibri" w:eastAsia="Calibri" w:hAnsi="Calibri"/>
+          <w:color w:val="2B3A34"/>
+          <w:sz w:val="21"/>
+          <w:szCs w:val="21"/>
+        </w:rPr>
+        <w:t xml:space="preserve"> opens a passcode gate (mirroring </w:t>
+      </w:r>
+      <w:r>
+        <w:rPr>
+          <w:rFonts w:ascii="Calibri" w:cs="Calibri" w:eastAsia="Calibri" w:hAnsi="Calibri"/>
+          <w:b/>
+          <w:bCs/>
+          <w:color w:val="12201C"/>
+          <w:sz w:val="21"/>
+          <w:szCs w:val="21"/>
+        </w:rPr>
+        <w:t xml:space="preserve">Admin</w:t>
+      </w:r>
+      <w:r>
+        <w:rPr>
+          <w:rFonts w:ascii="Calibri" w:cs="Calibri" w:eastAsia="Calibri" w:hAnsi="Calibri"/>
+          <w:color w:val="2B3A34"/>
+          <w:sz w:val="21"/>
+          <w:szCs w:val="21"/>
+        </w:rPr>
+        <w:t xml:space="preserve">); one demo passcode drops you straight into each experience:</w:t>
+      </w:r>
+    </w:p>
+    <w:p>
+      <w:pPr>
+        <w:pStyle w:val="ListParagraph"/>
+        <w:numPr>
+          <w:ilvl w:val="0"/>
+          <w:numId w:val="1"/>
+        </w:numPr>
+        <w:spacing w:after="60"/>
+      </w:pPr>
+      <w:r>
+        <w:rPr>
+          <w:rFonts w:ascii="Calibri" w:cs="Calibri" w:eastAsia="Calibri" w:hAnsi="Calibri"/>
+          <w:b/>
+          <w:bCs/>
+          <w:color w:val="12201C"/>
+          <w:sz w:val="21"/>
+          <w:szCs w:val="21"/>
+        </w:rPr>
+        <w:t xml:space="preserve">Household </w:t>
+      </w:r>
+      <w:r>
+        <w:rPr>
+          <w:rFonts w:ascii="Consolas" w:cs="Consolas" w:eastAsia="Consolas" w:hAnsi="Consolas"/>
+          <w:color w:val="5F6F68"/>
+          <w:sz w:val="18"/>
+          <w:szCs w:val="18"/>
+        </w:rPr>
+        <w:t xml:space="preserve">casai-home-2026</w:t>
+      </w:r>
+      <w:r>
+        <w:rPr>
+          <w:rFonts w:ascii="Calibri" w:cs="Calibri" w:eastAsia="Calibri" w:hAnsi="Calibri"/>
+          <w:color w:val="2B3A34"/>
+          <w:sz w:val="21"/>
+          <w:szCs w:val="21"/>
+        </w:rPr>
+        <w:t xml:space="preserve">  — the booking loop, insights, and the My-home profile.</w:t>
+      </w:r>
+    </w:p>
+    <w:p>
+      <w:pPr>
+        <w:pStyle w:val="ListParagraph"/>
+        <w:numPr>
+          <w:ilvl w:val="0"/>
+          <w:numId w:val="1"/>
+        </w:numPr>
+        <w:spacing w:after="60"/>
+      </w:pPr>
+      <w:r>
+        <w:rPr>
+          <w:rFonts w:ascii="Calibri" w:cs="Calibri" w:eastAsia="Calibri" w:hAnsi="Calibri"/>
+          <w:b/>
+          <w:bCs/>
+          <w:color w:val="12201C"/>
+          <w:sz w:val="21"/>
+          <w:szCs w:val="21"/>
+        </w:rPr>
+        <w:t xml:space="preserve">Worker </w:t>
+      </w:r>
+      <w:r>
+        <w:rPr>
+          <w:rFonts w:ascii="Consolas" w:cs="Consolas" w:eastAsia="Consolas" w:hAnsi="Consolas"/>
+          <w:color w:val="5F6F68"/>
+          <w:sz w:val="18"/>
+          <w:szCs w:val="18"/>
+        </w:rPr>
+        <w:t xml:space="preserve">casai-worker-2026</w:t>
+      </w:r>
+      <w:r>
+        <w:rPr>
+          <w:rFonts w:ascii="Calibri" w:cs="Calibri" w:eastAsia="Calibri" w:hAnsi="Calibri"/>
+          <w:color w:val="2B3A34"/>
+          <w:sz w:val="21"/>
+          <w:szCs w:val="21"/>
+        </w:rPr>
+        <w:t xml:space="preserve">  — lands as a Verified Pro with a filled passport and a sample booking that already shows its “before you arrive” brief.</w:t>
+      </w:r>
+    </w:p>
+    <w:p>
+      <w:pPr>
+        <w:pStyle w:val="ListParagraph"/>
+        <w:numPr>
+          <w:ilvl w:val="0"/>
+          <w:numId w:val="1"/>
+        </w:numPr>
+        <w:spacing w:after="60"/>
+      </w:pPr>
+      <w:r>
+        <w:rPr>
+          <w:rFonts w:ascii="Calibri" w:cs="Calibri" w:eastAsia="Calibri" w:hAnsi="Calibri"/>
+          <w:b/>
+          <w:bCs/>
+          <w:color w:val="12201C"/>
+          <w:sz w:val="21"/>
+          <w:szCs w:val="21"/>
+        </w:rPr>
+        <w:t xml:space="preserve">NRI </w:t>
+      </w:r>
+      <w:r>
+        <w:rPr>
+          <w:rFonts w:ascii="Consolas" w:cs="Consolas" w:eastAsia="Consolas" w:hAnsi="Consolas"/>
+          <w:color w:val="5F6F68"/>
+          <w:sz w:val="18"/>
+          <w:szCs w:val="18"/>
+        </w:rPr>
+        <w:t xml:space="preserve">casai-nri-2026</w:t>
+      </w:r>
+      <w:r>
+        <w:rPr>
+          <w:rFonts w:ascii="Calibri" w:cs="Calibri" w:eastAsia="Calibri" w:hAnsi="Calibri"/>
+          <w:color w:val="2B3A34"/>
+          <w:sz w:val="21"/>
+          <w:szCs w:val="21"/>
+        </w:rPr>
+        <w:t xml:space="preserve">  — a linked home with bookings to monitor in dual timezone.</w:t>
+      </w:r>
+    </w:p>
+    <w:p>
+      <w:pPr>
+        <w:pStyle w:val="ListParagraph"/>
+        <w:numPr>
+          <w:ilvl w:val="0"/>
+          <w:numId w:val="1"/>
+        </w:numPr>
+        <w:spacing w:after="60"/>
+      </w:pPr>
+      <w:r>
+        <w:rPr>
+          <w:rFonts w:ascii="Calibri" w:cs="Calibri" w:eastAsia="Calibri" w:hAnsi="Calibri"/>
+          <w:b/>
+          <w:bCs/>
+          <w:color w:val="12201C"/>
+          <w:sz w:val="21"/>
+          <w:szCs w:val="21"/>
+        </w:rPr>
+        <w:t xml:space="preserve">Admin </w:t>
+      </w:r>
+      <w:r>
+        <w:rPr>
+          <w:rFonts w:ascii="Consolas" w:cs="Consolas" w:eastAsia="Consolas" w:hAnsi="Consolas"/>
+          <w:color w:val="5F6F68"/>
+          <w:sz w:val="18"/>
+          <w:szCs w:val="18"/>
+        </w:rPr>
+        <w:t xml:space="preserve">casai-admin-2026</w:t>
+      </w:r>
+      <w:r>
+        <w:rPr>
+          <w:rFonts w:ascii="Calibri" w:cs="Calibri" w:eastAsia="Calibri" w:hAnsi="Calibri"/>
+          <w:color w:val="2B3A34"/>
+          <w:sz w:val="21"/>
+          <w:szCs w:val="21"/>
+        </w:rPr>
+        <w:t xml:space="preserve">  — the ops worker-verification queue.</w:t>
+      </w:r>
+    </w:p>
+    <w:p>
+      <w:pPr>
+        <w:spacing w:after="120" w:line="276"/>
+      </w:pPr>
+      <w:r>
+        <w:rPr>
+          <w:rFonts w:ascii="Calibri" w:cs="Calibri" w:eastAsia="Calibri" w:hAnsi="Calibri"/>
+          <w:i/>
+          <w:iCs/>
+          <w:color w:val="2B3A34"/>
+          <w:sz w:val="21"/>
+          <w:szCs w:val="21"/>
+        </w:rPr>
+        <w:t xml:space="preserve">The passcode only picks the experience; the role is still assigned server-side inside a SECURITY DEFINER function, so a client cannot grant itself a context.</w:t>
       </w:r>
     </w:p>
     <w:p>

</xml_diff>